<commit_message>
Se agrega los cambios de descontar stock
</commit_message>
<xml_diff>
--- a/docs/Instructivo 01.docx
+++ b/docs/Instructivo 01.docx
@@ -2215,6 +2215,330 @@
           <w:iCs/>
         </w:rPr>
         <w:t>.</w:t>
+      </w:r>
+    </w:p>
+    <w:p>
+      <w:r>
+        <w:t>Probar que este funcional</w:t>
+      </w:r>
+    </w:p>
+    <w:p>
+      <w:r>
+        <w:drawing>
+          <wp:inline distT="0" distB="0" distL="0" distR="0" wp14:anchorId="2ED2071E" wp14:editId="04A4286B">
+            <wp:extent cx="5400040" cy="2999105"/>
+            <wp:effectExtent l="19050" t="19050" r="10160" b="10795"/>
+            <wp:docPr id="28" name="Imagen 28"/>
+            <wp:cNvGraphicFramePr>
+              <a:graphicFrameLocks xmlns:a="http://schemas.openxmlformats.org/drawingml/2006/main" noChangeAspect="1"/>
+            </wp:cNvGraphicFramePr>
+            <a:graphic xmlns:a="http://schemas.openxmlformats.org/drawingml/2006/main">
+              <a:graphicData uri="http://schemas.openxmlformats.org/drawingml/2006/picture">
+                <pic:pic xmlns:pic="http://schemas.openxmlformats.org/drawingml/2006/picture">
+                  <pic:nvPicPr>
+                    <pic:cNvPr id="1" name=""/>
+                    <pic:cNvPicPr/>
+                  </pic:nvPicPr>
+                  <pic:blipFill>
+                    <a:blip r:embed="rId28"/>
+                    <a:stretch>
+                      <a:fillRect/>
+                    </a:stretch>
+                  </pic:blipFill>
+                  <pic:spPr>
+                    <a:xfrm>
+                      <a:off x="0" y="0"/>
+                      <a:ext cx="5400040" cy="2999105"/>
+                    </a:xfrm>
+                    <a:prstGeom prst="rect">
+                      <a:avLst/>
+                    </a:prstGeom>
+                    <a:ln>
+                      <a:solidFill>
+                        <a:schemeClr val="tx1"/>
+                      </a:solidFill>
+                    </a:ln>
+                  </pic:spPr>
+                </pic:pic>
+              </a:graphicData>
+            </a:graphic>
+          </wp:inline>
+        </w:drawing>
+      </w:r>
+    </w:p>
+    <w:p>
+      <w:pPr>
+        <w:jc w:val="left"/>
+      </w:pPr>
+      <w:r>
+        <w:br w:type="page"/>
+      </w:r>
+    </w:p>
+    <w:p>
+      <w:r>
+        <w:lastRenderedPageBreak/>
+        <w:t>Agregar el método descontar stock en Producto-</w:t>
+      </w:r>
+      <w:proofErr w:type="spellStart"/>
+      <w:r>
+        <w:t>Service</w:t>
+      </w:r>
+      <w:proofErr w:type="spellEnd"/>
+    </w:p>
+    <w:p>
+      <w:pPr>
+        <w:rPr>
+          <w:b/>
+          <w:bCs/>
+        </w:rPr>
+      </w:pPr>
+      <w:r>
+        <w:t xml:space="preserve">Crear el </w:t>
+      </w:r>
+      <w:proofErr w:type="spellStart"/>
+      <w:r>
+        <w:t>record</w:t>
+      </w:r>
+      <w:proofErr w:type="spellEnd"/>
+      <w:r>
+        <w:t xml:space="preserve"> </w:t>
+      </w:r>
+      <w:proofErr w:type="spellStart"/>
+      <w:r>
+        <w:t>dto</w:t>
+      </w:r>
+      <w:proofErr w:type="spellEnd"/>
+      <w:r>
+        <w:t xml:space="preserve"> </w:t>
+      </w:r>
+      <w:proofErr w:type="spellStart"/>
+      <w:r>
+        <w:rPr>
+          <w:b/>
+          <w:bCs/>
+        </w:rPr>
+        <w:t>StockRequestDto</w:t>
+      </w:r>
+      <w:proofErr w:type="spellEnd"/>
+    </w:p>
+    <w:p>
+      <w:r>
+        <w:drawing>
+          <wp:inline distT="0" distB="0" distL="0" distR="0" wp14:anchorId="74EF6C33" wp14:editId="2016E48E">
+            <wp:extent cx="4544059" cy="2362530"/>
+            <wp:effectExtent l="0" t="0" r="0" b="0"/>
+            <wp:docPr id="29" name="Imagen 29"/>
+            <wp:cNvGraphicFramePr>
+              <a:graphicFrameLocks xmlns:a="http://schemas.openxmlformats.org/drawingml/2006/main" noChangeAspect="1"/>
+            </wp:cNvGraphicFramePr>
+            <a:graphic xmlns:a="http://schemas.openxmlformats.org/drawingml/2006/main">
+              <a:graphicData uri="http://schemas.openxmlformats.org/drawingml/2006/picture">
+                <pic:pic xmlns:pic="http://schemas.openxmlformats.org/drawingml/2006/picture">
+                  <pic:nvPicPr>
+                    <pic:cNvPr id="1" name=""/>
+                    <pic:cNvPicPr/>
+                  </pic:nvPicPr>
+                  <pic:blipFill>
+                    <a:blip r:embed="rId29"/>
+                    <a:stretch>
+                      <a:fillRect/>
+                    </a:stretch>
+                  </pic:blipFill>
+                  <pic:spPr>
+                    <a:xfrm>
+                      <a:off x="0" y="0"/>
+                      <a:ext cx="4544059" cy="2362530"/>
+                    </a:xfrm>
+                    <a:prstGeom prst="rect">
+                      <a:avLst/>
+                    </a:prstGeom>
+                  </pic:spPr>
+                </pic:pic>
+              </a:graphicData>
+            </a:graphic>
+          </wp:inline>
+        </w:drawing>
+      </w:r>
+    </w:p>
+    <w:p>
+      <w:r>
+        <w:t>ProductoService.java</w:t>
+      </w:r>
+    </w:p>
+    <w:p>
+      <w:r>
+        <w:drawing>
+          <wp:inline distT="0" distB="0" distL="0" distR="0" wp14:anchorId="0EAA1AE0" wp14:editId="2ED5C191">
+            <wp:extent cx="3429479" cy="228632"/>
+            <wp:effectExtent l="0" t="0" r="0" b="0"/>
+            <wp:docPr id="30" name="Imagen 30"/>
+            <wp:cNvGraphicFramePr>
+              <a:graphicFrameLocks xmlns:a="http://schemas.openxmlformats.org/drawingml/2006/main" noChangeAspect="1"/>
+            </wp:cNvGraphicFramePr>
+            <a:graphic xmlns:a="http://schemas.openxmlformats.org/drawingml/2006/main">
+              <a:graphicData uri="http://schemas.openxmlformats.org/drawingml/2006/picture">
+                <pic:pic xmlns:pic="http://schemas.openxmlformats.org/drawingml/2006/picture">
+                  <pic:nvPicPr>
+                    <pic:cNvPr id="1" name=""/>
+                    <pic:cNvPicPr/>
+                  </pic:nvPicPr>
+                  <pic:blipFill>
+                    <a:blip r:embed="rId30"/>
+                    <a:stretch>
+                      <a:fillRect/>
+                    </a:stretch>
+                  </pic:blipFill>
+                  <pic:spPr>
+                    <a:xfrm>
+                      <a:off x="0" y="0"/>
+                      <a:ext cx="3429479" cy="228632"/>
+                    </a:xfrm>
+                    <a:prstGeom prst="rect">
+                      <a:avLst/>
+                    </a:prstGeom>
+                  </pic:spPr>
+                </pic:pic>
+              </a:graphicData>
+            </a:graphic>
+          </wp:inline>
+        </w:drawing>
+      </w:r>
+    </w:p>
+    <w:p>
+      <w:proofErr w:type="spellStart"/>
+      <w:r>
+        <w:t>Quedaria</w:t>
+      </w:r>
+      <w:proofErr w:type="spellEnd"/>
+    </w:p>
+    <w:p>
+      <w:r>
+        <w:drawing>
+          <wp:inline distT="0" distB="0" distL="0" distR="0" wp14:anchorId="158F11FC" wp14:editId="2CB1A705">
+            <wp:extent cx="4620270" cy="2743583"/>
+            <wp:effectExtent l="0" t="0" r="8890" b="0"/>
+            <wp:docPr id="31" name="Imagen 31"/>
+            <wp:cNvGraphicFramePr>
+              <a:graphicFrameLocks xmlns:a="http://schemas.openxmlformats.org/drawingml/2006/main" noChangeAspect="1"/>
+            </wp:cNvGraphicFramePr>
+            <a:graphic xmlns:a="http://schemas.openxmlformats.org/drawingml/2006/main">
+              <a:graphicData uri="http://schemas.openxmlformats.org/drawingml/2006/picture">
+                <pic:pic xmlns:pic="http://schemas.openxmlformats.org/drawingml/2006/picture">
+                  <pic:nvPicPr>
+                    <pic:cNvPr id="1" name=""/>
+                    <pic:cNvPicPr/>
+                  </pic:nvPicPr>
+                  <pic:blipFill>
+                    <a:blip r:embed="rId31"/>
+                    <a:stretch>
+                      <a:fillRect/>
+                    </a:stretch>
+                  </pic:blipFill>
+                  <pic:spPr>
+                    <a:xfrm>
+                      <a:off x="0" y="0"/>
+                      <a:ext cx="4620270" cy="2743583"/>
+                    </a:xfrm>
+                    <a:prstGeom prst="rect">
+                      <a:avLst/>
+                    </a:prstGeom>
+                  </pic:spPr>
+                </pic:pic>
+              </a:graphicData>
+            </a:graphic>
+          </wp:inline>
+        </w:drawing>
+      </w:r>
+    </w:p>
+    <w:p>
+      <w:r>
+        <w:t>ProductoServiceImpl.java</w:t>
+      </w:r>
+    </w:p>
+    <w:p>
+      <w:r>
+        <w:lastRenderedPageBreak/>
+        <w:drawing>
+          <wp:inline distT="0" distB="0" distL="0" distR="0" wp14:anchorId="120C64BC" wp14:editId="00812C82">
+            <wp:extent cx="4772691" cy="5172797"/>
+            <wp:effectExtent l="0" t="0" r="8890" b="8890"/>
+            <wp:docPr id="32" name="Imagen 32"/>
+            <wp:cNvGraphicFramePr>
+              <a:graphicFrameLocks xmlns:a="http://schemas.openxmlformats.org/drawingml/2006/main" noChangeAspect="1"/>
+            </wp:cNvGraphicFramePr>
+            <a:graphic xmlns:a="http://schemas.openxmlformats.org/drawingml/2006/main">
+              <a:graphicData uri="http://schemas.openxmlformats.org/drawingml/2006/picture">
+                <pic:pic xmlns:pic="http://schemas.openxmlformats.org/drawingml/2006/picture">
+                  <pic:nvPicPr>
+                    <pic:cNvPr id="1" name=""/>
+                    <pic:cNvPicPr/>
+                  </pic:nvPicPr>
+                  <pic:blipFill>
+                    <a:blip r:embed="rId32"/>
+                    <a:stretch>
+                      <a:fillRect/>
+                    </a:stretch>
+                  </pic:blipFill>
+                  <pic:spPr>
+                    <a:xfrm>
+                      <a:off x="0" y="0"/>
+                      <a:ext cx="4772691" cy="5172797"/>
+                    </a:xfrm>
+                    <a:prstGeom prst="rect">
+                      <a:avLst/>
+                    </a:prstGeom>
+                  </pic:spPr>
+                </pic:pic>
+              </a:graphicData>
+            </a:graphic>
+          </wp:inline>
+        </w:drawing>
+      </w:r>
+    </w:p>
+    <w:p>
+      <w:proofErr w:type="spellStart"/>
+      <w:r>
+        <w:t>Controller</w:t>
+      </w:r>
+      <w:proofErr w:type="spellEnd"/>
+    </w:p>
+    <w:p>
+      <w:r>
+        <w:drawing>
+          <wp:inline distT="0" distB="0" distL="0" distR="0" wp14:anchorId="5B19BDF4" wp14:editId="05992D09">
+            <wp:extent cx="3915321" cy="1695687"/>
+            <wp:effectExtent l="0" t="0" r="0" b="0"/>
+            <wp:docPr id="33" name="Imagen 33"/>
+            <wp:cNvGraphicFramePr>
+              <a:graphicFrameLocks xmlns:a="http://schemas.openxmlformats.org/drawingml/2006/main" noChangeAspect="1"/>
+            </wp:cNvGraphicFramePr>
+            <a:graphic xmlns:a="http://schemas.openxmlformats.org/drawingml/2006/main">
+              <a:graphicData uri="http://schemas.openxmlformats.org/drawingml/2006/picture">
+                <pic:pic xmlns:pic="http://schemas.openxmlformats.org/drawingml/2006/picture">
+                  <pic:nvPicPr>
+                    <pic:cNvPr id="1" name=""/>
+                    <pic:cNvPicPr/>
+                  </pic:nvPicPr>
+                  <pic:blipFill>
+                    <a:blip r:embed="rId33"/>
+                    <a:stretch>
+                      <a:fillRect/>
+                    </a:stretch>
+                  </pic:blipFill>
+                  <pic:spPr>
+                    <a:xfrm>
+                      <a:off x="0" y="0"/>
+                      <a:ext cx="3915321" cy="1695687"/>
+                    </a:xfrm>
+                    <a:prstGeom prst="rect">
+                      <a:avLst/>
+                    </a:prstGeom>
+                  </pic:spPr>
+                </pic:pic>
+              </a:graphicData>
+            </a:graphic>
+          </wp:inline>
+        </w:drawing>
       </w:r>
     </w:p>
     <w:p/>
@@ -3072,7 +3396,6 @@
   <w:style w:type="character" w:default="1" w:styleId="Fuentedeprrafopredeter">
     <w:name w:val="Default Paragraph Font"/>
     <w:uiPriority w:val="1"/>
-    <w:semiHidden/>
     <w:unhideWhenUsed/>
   </w:style>
   <w:style w:type="table" w:default="1" w:styleId="Tablanormal">

</xml_diff>

<commit_message>
Se termina de configurar Feign y logs con Feign
</commit_message>
<xml_diff>
--- a/docs/Instructivo 01.docx
+++ b/docs/Instructivo 01.docx
@@ -1,6 +1,6 @@
 
 <file path=word/document.xml><?xml version="1.0" encoding="utf-8"?>
-<w:document xmlns:wpc="http://schemas.microsoft.com/office/word/2010/wordprocessingCanvas" xmlns:cx="http://schemas.microsoft.com/office/drawing/2014/chartex" xmlns:cx1="http://schemas.microsoft.com/office/drawing/2015/9/8/chartex" xmlns:cx2="http://schemas.microsoft.com/office/drawing/2015/10/21/chartex" xmlns:cx3="http://schemas.microsoft.com/office/drawing/2016/5/9/chartex" xmlns:cx4="http://schemas.microsoft.com/office/drawing/2016/5/10/chartex" xmlns:cx5="http://schemas.microsoft.com/office/drawing/2016/5/11/chartex" xmlns:cx6="http://schemas.microsoft.com/office/drawing/2016/5/12/chartex" xmlns:cx7="http://schemas.microsoft.com/office/drawing/2016/5/13/chartex" xmlns:cx8="http://schemas.microsoft.com/office/drawing/2016/5/14/chartex" xmlns:mc="http://schemas.openxmlformats.org/markup-compatibility/2006" xmlns:aink="http://schemas.microsoft.com/office/drawing/2016/ink" xmlns:am3d="http://schemas.microsoft.com/office/drawing/2017/model3d" xmlns:o="urn:schemas-microsoft-com:office:office" xmlns:oel="http://schemas.microsoft.com/office/2019/extlst" xmlns:r="http://schemas.openxmlformats.org/officeDocument/2006/relationships" xmlns:m="http://schemas.openxmlformats.org/officeDocument/2006/math" xmlns:v="urn:schemas-microsoft-com:vml" xmlns:wp14="http://schemas.microsoft.com/office/word/2010/wordprocessingDrawing" xmlns:wp="http://schemas.openxmlformats.org/drawingml/2006/wordprocessingDrawing" xmlns:w10="urn:schemas-microsoft-com:office:word" xmlns:w="http://schemas.openxmlformats.org/wordprocessingml/2006/main" xmlns:w14="http://schemas.microsoft.com/office/word/2010/wordml" xmlns:w15="http://schemas.microsoft.com/office/word/2012/wordml" xmlns:w16cex="http://schemas.microsoft.com/office/word/2018/wordml/cex" xmlns:w16cid="http://schemas.microsoft.com/office/word/2016/wordml/cid" xmlns:w16="http://schemas.microsoft.com/office/word/2018/wordml" xmlns:w16sdtdh="http://schemas.microsoft.com/office/word/2020/wordml/sdtdatahash" xmlns:w16se="http://schemas.microsoft.com/office/word/2015/wordml/symex" xmlns:wpg="http://schemas.microsoft.com/office/word/2010/wordprocessingGroup" xmlns:wpi="http://schemas.microsoft.com/office/word/2010/wordprocessingInk" xmlns:wne="http://schemas.microsoft.com/office/word/2006/wordml" xmlns:wps="http://schemas.microsoft.com/office/word/2010/wordprocessingShape" mc:Ignorable="w14 w15 w16se w16cid w16 w16cex w16sdtdh wp14">
+<w:document xmlns:wpc="http://schemas.microsoft.com/office/word/2010/wordprocessingCanvas" xmlns:cx="http://schemas.microsoft.com/office/drawing/2014/chartex" xmlns:cx1="http://schemas.microsoft.com/office/drawing/2015/9/8/chartex" xmlns:cx2="http://schemas.microsoft.com/office/drawing/2015/10/21/chartex" xmlns:cx3="http://schemas.microsoft.com/office/drawing/2016/5/9/chartex" xmlns:cx4="http://schemas.microsoft.com/office/drawing/2016/5/10/chartex" xmlns:cx5="http://schemas.microsoft.com/office/drawing/2016/5/11/chartex" xmlns:cx6="http://schemas.microsoft.com/office/drawing/2016/5/12/chartex" xmlns:cx7="http://schemas.microsoft.com/office/drawing/2016/5/13/chartex" xmlns:cx8="http://schemas.microsoft.com/office/drawing/2016/5/14/chartex" xmlns:mc="http://schemas.openxmlformats.org/markup-compatibility/2006" xmlns:aink="http://schemas.microsoft.com/office/drawing/2016/ink" xmlns:am3d="http://schemas.microsoft.com/office/drawing/2017/model3d" xmlns:o="urn:schemas-microsoft-com:office:office" xmlns:oel="http://schemas.microsoft.com/office/2019/extlst" xmlns:r="http://schemas.openxmlformats.org/officeDocument/2006/relationships" xmlns:m="http://schemas.openxmlformats.org/officeDocument/2006/math" xmlns:v="urn:schemas-microsoft-com:vml" xmlns:wp14="http://schemas.microsoft.com/office/word/2010/wordprocessingDrawing" xmlns:wp="http://schemas.openxmlformats.org/drawingml/2006/wordprocessingDrawing" xmlns:w10="urn:schemas-microsoft-com:office:word" xmlns:w="http://schemas.openxmlformats.org/wordprocessingml/2006/main" xmlns:w14="http://schemas.microsoft.com/office/word/2010/wordml" xmlns:w15="http://schemas.microsoft.com/office/word/2012/wordml" xmlns:w16cex="http://schemas.microsoft.com/office/word/2018/wordml/cex" xmlns:w16cid="http://schemas.microsoft.com/office/word/2016/wordml/cid" xmlns:w16="http://schemas.microsoft.com/office/word/2018/wordml" xmlns:w16du="http://schemas.microsoft.com/office/word/2023/wordml/word16du" xmlns:w16sdtdh="http://schemas.microsoft.com/office/word/2020/wordml/sdtdatahash" xmlns:w16sdtfl="http://schemas.microsoft.com/office/word/2024/wordml/sdtformatlock" xmlns:w16se="http://schemas.microsoft.com/office/word/2015/wordml/symex" xmlns:wpg="http://schemas.microsoft.com/office/word/2010/wordprocessingGroup" xmlns:wpi="http://schemas.microsoft.com/office/word/2010/wordprocessingInk" xmlns:wne="http://schemas.microsoft.com/office/word/2006/wordml" xmlns:wps="http://schemas.microsoft.com/office/word/2010/wordprocessingShape" mc:Ignorable="w14 w15 w16se w16cid w16 w16cex w16sdtdh w16sdtfl w16du wp14">
   <w:body>
     <w:p>
       <w:pPr>
@@ -193,7 +193,6 @@
         <w:t xml:space="preserve">Se configura el </w:t>
       </w:r>
       <w:proofErr w:type="spellStart"/>
-      <w:proofErr w:type="gramStart"/>
       <w:r>
         <w:rPr>
           <w:b/>
@@ -202,10 +201,12 @@
         <w:t>application.yaml</w:t>
       </w:r>
       <w:proofErr w:type="spellEnd"/>
-      <w:proofErr w:type="gramEnd"/>
-    </w:p>
-    <w:p>
-      <w:r>
+    </w:p>
+    <w:p>
+      <w:r>
+        <w:rPr>
+          <w:noProof/>
+        </w:rPr>
         <w:drawing>
           <wp:inline distT="0" distB="0" distL="0" distR="0" wp14:anchorId="11D95F0C" wp14:editId="773F9697">
             <wp:extent cx="4915586" cy="6020640"/>
@@ -263,6 +264,9 @@
     </w:p>
     <w:p>
       <w:r>
+        <w:rPr>
+          <w:noProof/>
+        </w:rPr>
         <w:drawing>
           <wp:inline distT="0" distB="0" distL="0" distR="0" wp14:anchorId="66ACF540" wp14:editId="0E66A782">
             <wp:extent cx="3277057" cy="3820058"/>
@@ -334,6 +338,9 @@
     </w:p>
     <w:p>
       <w:r>
+        <w:rPr>
+          <w:noProof/>
+        </w:rPr>
         <w:drawing>
           <wp:inline distT="0" distB="0" distL="0" distR="0" wp14:anchorId="7A9F406E" wp14:editId="5FBAB461">
             <wp:extent cx="5353797" cy="7421011"/>
@@ -413,6 +420,9 @@
     </w:p>
     <w:p>
       <w:r>
+        <w:rPr>
+          <w:noProof/>
+        </w:rPr>
         <w:drawing>
           <wp:inline distT="0" distB="0" distL="0" distR="0" wp14:anchorId="46B139C4" wp14:editId="27C429D5">
             <wp:extent cx="5400040" cy="2476500"/>
@@ -493,6 +503,9 @@
     </w:p>
     <w:p>
       <w:r>
+        <w:rPr>
+          <w:noProof/>
+        </w:rPr>
         <w:drawing>
           <wp:inline distT="0" distB="0" distL="0" distR="0" wp14:anchorId="6C048AA9" wp14:editId="1736FC54">
             <wp:extent cx="5400040" cy="4686935"/>
@@ -582,6 +595,9 @@
     </w:p>
     <w:p>
       <w:r>
+        <w:rPr>
+          <w:noProof/>
+        </w:rPr>
         <w:drawing>
           <wp:inline distT="0" distB="0" distL="0" distR="0" wp14:anchorId="2BF89008" wp14:editId="2FB2EE48">
             <wp:extent cx="5400040" cy="2470785"/>
@@ -640,6 +656,9 @@
     </w:p>
     <w:p>
       <w:r>
+        <w:rPr>
+          <w:noProof/>
+        </w:rPr>
         <w:drawing>
           <wp:inline distT="0" distB="0" distL="0" distR="0" wp14:anchorId="4FD5D7E3" wp14:editId="117A9E0A">
             <wp:extent cx="5400040" cy="2399030"/>
@@ -704,6 +723,9 @@
         <w:jc w:val="left"/>
       </w:pPr>
       <w:r>
+        <w:rPr>
+          <w:noProof/>
+        </w:rPr>
         <w:drawing>
           <wp:inline distT="0" distB="0" distL="0" distR="0" wp14:anchorId="4C98FA68" wp14:editId="497132FB">
             <wp:extent cx="5400040" cy="2611755"/>
@@ -788,6 +810,7 @@
         <w:rPr>
           <w:b/>
           <w:bCs/>
+          <w:noProof/>
         </w:rPr>
         <w:drawing>
           <wp:inline distT="0" distB="0" distL="0" distR="0" wp14:anchorId="7C036B6F" wp14:editId="61F188E7">
@@ -872,6 +895,7 @@
         <w:rPr>
           <w:b/>
           <w:bCs/>
+          <w:noProof/>
         </w:rPr>
         <w:drawing>
           <wp:inline distT="0" distB="0" distL="0" distR="0" wp14:anchorId="5E2426B9" wp14:editId="1A1B1178">
@@ -962,6 +986,7 @@
         <w:rPr>
           <w:b/>
           <w:bCs/>
+          <w:noProof/>
         </w:rPr>
         <w:drawing>
           <wp:inline distT="0" distB="0" distL="0" distR="0" wp14:anchorId="064B7F4A" wp14:editId="16FD4681">
@@ -1031,6 +1056,9 @@
         <w:jc w:val="left"/>
       </w:pPr>
       <w:r>
+        <w:rPr>
+          <w:noProof/>
+        </w:rPr>
         <w:drawing>
           <wp:inline distT="0" distB="0" distL="0" distR="0" wp14:anchorId="096A3477" wp14:editId="10478DF9">
             <wp:extent cx="5027492" cy="3733965"/>
@@ -1091,7 +1119,6 @@
         <w:t>producto-</w:t>
       </w:r>
       <w:proofErr w:type="spellStart"/>
-      <w:proofErr w:type="gramStart"/>
       <w:r>
         <w:rPr>
           <w:b/>
@@ -1108,11 +1135,7 @@
         <w:t xml:space="preserve"> </w:t>
       </w:r>
       <w:r>
-        <w:t xml:space="preserve"> y</w:t>
-      </w:r>
-      <w:proofErr w:type="gramEnd"/>
-      <w:r>
-        <w:t xml:space="preserve"> </w:t>
+        <w:t xml:space="preserve">y </w:t>
       </w:r>
       <w:r>
         <w:rPr>
@@ -1468,6 +1491,10 @@
         <w:t>servi</w:t>
       </w:r>
       <w:r>
+        <w:rPr>
+          <w:b/>
+          <w:bCs/>
+        </w:rPr>
         <w:t>ce</w:t>
       </w:r>
       <w:proofErr w:type="spellEnd"/>
@@ -1567,6 +1594,9 @@
     </w:p>
     <w:p>
       <w:r>
+        <w:rPr>
+          <w:noProof/>
+        </w:rPr>
         <w:drawing>
           <wp:inline distT="0" distB="0" distL="0" distR="0" wp14:anchorId="52516A16" wp14:editId="20A22A32">
             <wp:extent cx="5400040" cy="2165350"/>
@@ -1615,6 +1645,10 @@
       </w:r>
       <w:proofErr w:type="spellStart"/>
       <w:r>
+        <w:rPr>
+          <w:b/>
+          <w:bCs/>
+        </w:rPr>
         <w:t>properties</w:t>
       </w:r>
       <w:proofErr w:type="spellEnd"/>
@@ -1623,12 +1657,19 @@
       </w:r>
       <w:proofErr w:type="spellStart"/>
       <w:r>
+        <w:rPr>
+          <w:b/>
+          <w:bCs/>
+        </w:rPr>
         <w:t>dependencyManagement</w:t>
       </w:r>
       <w:proofErr w:type="spellEnd"/>
     </w:p>
     <w:p>
       <w:r>
+        <w:rPr>
+          <w:noProof/>
+        </w:rPr>
         <w:drawing>
           <wp:inline distT="0" distB="0" distL="0" distR="0" wp14:anchorId="3AE33AC5" wp14:editId="3A077899">
             <wp:extent cx="4632463" cy="4930439"/>
@@ -1714,9 +1755,172 @@
           <w:bCs/>
         </w:rPr>
       </w:pPr>
-    </w:p>
-    <w:p>
-      <w:r>
+      <w:r>
+        <w:rPr>
+          <w:b/>
+          <w:bCs/>
+        </w:rPr>
+        <w:drawing>
+          <wp:inline distT="0" distB="0" distL="0" distR="0" wp14:anchorId="4383B5C5" wp14:editId="7206765C">
+            <wp:extent cx="5400040" cy="1109980"/>
+            <wp:effectExtent l="19050" t="19050" r="10160" b="13970"/>
+            <wp:docPr id="1948589964" name="Imagen 1"/>
+            <wp:cNvGraphicFramePr>
+              <a:graphicFrameLocks xmlns:a="http://schemas.openxmlformats.org/drawingml/2006/main" noChangeAspect="1"/>
+            </wp:cNvGraphicFramePr>
+            <a:graphic xmlns:a="http://schemas.openxmlformats.org/drawingml/2006/main">
+              <a:graphicData uri="http://schemas.openxmlformats.org/drawingml/2006/picture">
+                <pic:pic xmlns:pic="http://schemas.openxmlformats.org/drawingml/2006/picture">
+                  <pic:nvPicPr>
+                    <pic:cNvPr id="1948589964" name=""/>
+                    <pic:cNvPicPr/>
+                  </pic:nvPicPr>
+                  <pic:blipFill>
+                    <a:blip r:embed="rId22"/>
+                    <a:stretch>
+                      <a:fillRect/>
+                    </a:stretch>
+                  </pic:blipFill>
+                  <pic:spPr>
+                    <a:xfrm>
+                      <a:off x="0" y="0"/>
+                      <a:ext cx="5400040" cy="1109980"/>
+                    </a:xfrm>
+                    <a:prstGeom prst="rect">
+                      <a:avLst/>
+                    </a:prstGeom>
+                    <a:ln>
+                      <a:solidFill>
+                        <a:schemeClr val="tx1"/>
+                      </a:solidFill>
+                    </a:ln>
+                  </pic:spPr>
+                </pic:pic>
+              </a:graphicData>
+            </a:graphic>
+          </wp:inline>
+        </w:drawing>
+      </w:r>
+    </w:p>
+    <w:p>
+      <w:pPr>
+        <w:rPr>
+          <w:b/>
+          <w:bCs/>
+        </w:rPr>
+      </w:pPr>
+      <w:r>
+        <w:rPr>
+          <w:b/>
+          <w:bCs/>
+        </w:rPr>
+        <w:drawing>
+          <wp:inline distT="0" distB="0" distL="0" distR="0" wp14:anchorId="32E1470E" wp14:editId="41D2AEDF">
+            <wp:extent cx="5400040" cy="2820670"/>
+            <wp:effectExtent l="19050" t="19050" r="10160" b="17780"/>
+            <wp:docPr id="774261175" name="Imagen 1"/>
+            <wp:cNvGraphicFramePr>
+              <a:graphicFrameLocks xmlns:a="http://schemas.openxmlformats.org/drawingml/2006/main" noChangeAspect="1"/>
+            </wp:cNvGraphicFramePr>
+            <a:graphic xmlns:a="http://schemas.openxmlformats.org/drawingml/2006/main">
+              <a:graphicData uri="http://schemas.openxmlformats.org/drawingml/2006/picture">
+                <pic:pic xmlns:pic="http://schemas.openxmlformats.org/drawingml/2006/picture">
+                  <pic:nvPicPr>
+                    <pic:cNvPr id="774261175" name=""/>
+                    <pic:cNvPicPr/>
+                  </pic:nvPicPr>
+                  <pic:blipFill>
+                    <a:blip r:embed="rId23"/>
+                    <a:stretch>
+                      <a:fillRect/>
+                    </a:stretch>
+                  </pic:blipFill>
+                  <pic:spPr>
+                    <a:xfrm>
+                      <a:off x="0" y="0"/>
+                      <a:ext cx="5400040" cy="2820670"/>
+                    </a:xfrm>
+                    <a:prstGeom prst="rect">
+                      <a:avLst/>
+                    </a:prstGeom>
+                    <a:ln>
+                      <a:solidFill>
+                        <a:schemeClr val="tx1"/>
+                      </a:solidFill>
+                    </a:ln>
+                  </pic:spPr>
+                </pic:pic>
+              </a:graphicData>
+            </a:graphic>
+          </wp:inline>
+        </w:drawing>
+      </w:r>
+    </w:p>
+    <w:p>
+      <w:pPr>
+        <w:rPr>
+          <w:b/>
+          <w:bCs/>
+        </w:rPr>
+      </w:pPr>
+      <w:r>
+        <w:rPr>
+          <w:b/>
+          <w:bCs/>
+        </w:rPr>
+        <w:drawing>
+          <wp:inline distT="0" distB="0" distL="0" distR="0" wp14:anchorId="4AAED308" wp14:editId="39827914">
+            <wp:extent cx="5400040" cy="3172460"/>
+            <wp:effectExtent l="19050" t="19050" r="10160" b="27940"/>
+            <wp:docPr id="93273947" name="Imagen 1"/>
+            <wp:cNvGraphicFramePr>
+              <a:graphicFrameLocks xmlns:a="http://schemas.openxmlformats.org/drawingml/2006/main" noChangeAspect="1"/>
+            </wp:cNvGraphicFramePr>
+            <a:graphic xmlns:a="http://schemas.openxmlformats.org/drawingml/2006/main">
+              <a:graphicData uri="http://schemas.openxmlformats.org/drawingml/2006/picture">
+                <pic:pic xmlns:pic="http://schemas.openxmlformats.org/drawingml/2006/picture">
+                  <pic:nvPicPr>
+                    <pic:cNvPr id="93273947" name=""/>
+                    <pic:cNvPicPr/>
+                  </pic:nvPicPr>
+                  <pic:blipFill>
+                    <a:blip r:embed="rId24"/>
+                    <a:stretch>
+                      <a:fillRect/>
+                    </a:stretch>
+                  </pic:blipFill>
+                  <pic:spPr>
+                    <a:xfrm>
+                      <a:off x="0" y="0"/>
+                      <a:ext cx="5400040" cy="3172460"/>
+                    </a:xfrm>
+                    <a:prstGeom prst="rect">
+                      <a:avLst/>
+                    </a:prstGeom>
+                    <a:ln>
+                      <a:solidFill>
+                        <a:schemeClr val="tx1"/>
+                      </a:solidFill>
+                    </a:ln>
+                  </pic:spPr>
+                </pic:pic>
+              </a:graphicData>
+            </a:graphic>
+          </wp:inline>
+        </w:drawing>
+      </w:r>
+    </w:p>
+    <w:p>
+      <w:pPr>
+        <w:jc w:val="left"/>
+      </w:pPr>
+      <w:r>
+        <w:br w:type="page"/>
+      </w:r>
+    </w:p>
+    <w:p>
+      <w:r>
+        <w:lastRenderedPageBreak/>
         <w:t xml:space="preserve">Activar </w:t>
       </w:r>
       <w:proofErr w:type="spellStart"/>
@@ -1724,9 +1928,32 @@
         <w:t>Feign</w:t>
       </w:r>
       <w:proofErr w:type="spellEnd"/>
-    </w:p>
-    <w:p>
-      <w:r>
+      <w:r>
+        <w:t xml:space="preserve"> en el </w:t>
+      </w:r>
+      <w:r>
+        <w:rPr>
+          <w:b/>
+          <w:bCs/>
+        </w:rPr>
+        <w:t>VentaServiceApplication.java</w:t>
+      </w:r>
+      <w:r>
+        <w:rPr>
+          <w:b/>
+          <w:bCs/>
+        </w:rPr>
+        <w:t xml:space="preserve"> </w:t>
+      </w:r>
+      <w:r>
+        <w:t>con @EnableFeignClients</w:t>
+      </w:r>
+    </w:p>
+    <w:p>
+      <w:r>
+        <w:rPr>
+          <w:noProof/>
+        </w:rPr>
         <w:drawing>
           <wp:inline distT="0" distB="0" distL="0" distR="0" wp14:anchorId="16A56A80" wp14:editId="78C19B19">
             <wp:extent cx="5400040" cy="2635250"/>
@@ -1743,7 +1970,7 @@
                     <pic:cNvPicPr/>
                   </pic:nvPicPr>
                   <pic:blipFill>
-                    <a:blip r:embed="rId22"/>
+                    <a:blip r:embed="rId25"/>
                     <a:stretch>
                       <a:fillRect/>
                     </a:stretch>
@@ -1774,16 +2001,32 @@
         <w:jc w:val="left"/>
       </w:pPr>
       <w:r>
-        <w:br w:type="page"/>
-      </w:r>
-    </w:p>
-    <w:p>
-      <w:r>
-        <w:lastRenderedPageBreak/>
-        <w:t xml:space="preserve">Agregar los servicios en el </w:t>
-      </w:r>
-      <w:proofErr w:type="spellStart"/>
-      <w:proofErr w:type="gramStart"/>
+        <w:t>Agregar los servicios</w:t>
+      </w:r>
+      <w:r>
+        <w:t xml:space="preserve"> de </w:t>
+      </w:r>
+      <w:r>
+        <w:rPr>
+          <w:b/>
+          <w:bCs/>
+        </w:rPr>
+        <w:t>cliente</w:t>
+      </w:r>
+      <w:r>
+        <w:t xml:space="preserve"> y </w:t>
+      </w:r>
+      <w:r>
+        <w:rPr>
+          <w:b/>
+          <w:bCs/>
+        </w:rPr>
+        <w:t>producto</w:t>
+      </w:r>
+      <w:r>
+        <w:t xml:space="preserve"> en el </w:t>
+      </w:r>
+      <w:proofErr w:type="spellStart"/>
       <w:r>
         <w:rPr>
           <w:b/>
@@ -1792,15 +2035,14 @@
         <w:t>application.yaml</w:t>
       </w:r>
       <w:proofErr w:type="spellEnd"/>
-      <w:proofErr w:type="gramEnd"/>
     </w:p>
     <w:p>
       <w:r>
         <w:drawing>
-          <wp:inline distT="0" distB="0" distL="0" distR="0" wp14:anchorId="1BC0A8F3" wp14:editId="60508B0A">
-            <wp:extent cx="4753638" cy="7106642"/>
-            <wp:effectExtent l="19050" t="19050" r="27940" b="18415"/>
-            <wp:docPr id="23" name="Imagen 23"/>
+          <wp:inline distT="0" distB="0" distL="0" distR="0" wp14:anchorId="385032D9" wp14:editId="3895E61F">
+            <wp:extent cx="3077004" cy="1171739"/>
+            <wp:effectExtent l="19050" t="19050" r="9525" b="28575"/>
+            <wp:docPr id="1489557960" name="Imagen 1"/>
             <wp:cNvGraphicFramePr>
               <a:graphicFrameLocks xmlns:a="http://schemas.openxmlformats.org/drawingml/2006/main" noChangeAspect="1"/>
             </wp:cNvGraphicFramePr>
@@ -1808,11 +2050,11 @@
               <a:graphicData uri="http://schemas.openxmlformats.org/drawingml/2006/picture">
                 <pic:pic xmlns:pic="http://schemas.openxmlformats.org/drawingml/2006/picture">
                   <pic:nvPicPr>
-                    <pic:cNvPr id="1" name=""/>
+                    <pic:cNvPr id="1489557960" name=""/>
                     <pic:cNvPicPr/>
                   </pic:nvPicPr>
                   <pic:blipFill>
-                    <a:blip r:embed="rId23"/>
+                    <a:blip r:embed="rId26"/>
                     <a:stretch>
                       <a:fillRect/>
                     </a:stretch>
@@ -1820,7 +2062,7 @@
                   <pic:spPr>
                     <a:xfrm>
                       <a:off x="0" y="0"/>
-                      <a:ext cx="4753638" cy="7106642"/>
+                      <a:ext cx="3077004" cy="1171739"/>
                     </a:xfrm>
                     <a:prstGeom prst="rect">
                       <a:avLst/>
@@ -1843,44 +2085,94 @@
         <w:jc w:val="left"/>
       </w:pPr>
       <w:r>
+        <w:t xml:space="preserve">Crear la carpeta </w:t>
+      </w:r>
+      <w:proofErr w:type="spellStart"/>
+      <w:r>
+        <w:rPr>
+          <w:b/>
+          <w:bCs/>
+        </w:rPr>
+        <w:t>client</w:t>
+      </w:r>
+      <w:proofErr w:type="spellEnd"/>
+      <w:r>
+        <w:t xml:space="preserve"> en </w:t>
+      </w:r>
+      <w:r>
+        <w:rPr>
+          <w:b/>
+          <w:bCs/>
+        </w:rPr>
+        <w:t>api</w:t>
+      </w:r>
+      <w:r>
+        <w:t xml:space="preserve"> para crear las interfaces de </w:t>
+      </w:r>
+      <w:proofErr w:type="spellStart"/>
+      <w:r>
+        <w:t>feign</w:t>
+      </w:r>
+      <w:proofErr w:type="spellEnd"/>
+    </w:p>
+    <w:p>
+      <w:pPr>
+        <w:jc w:val="left"/>
+      </w:pPr>
+      <w:r>
+        <w:drawing>
+          <wp:inline distT="0" distB="0" distL="0" distR="0" wp14:anchorId="2ACACEDE" wp14:editId="0C8E7F3D">
+            <wp:extent cx="2962688" cy="1400370"/>
+            <wp:effectExtent l="19050" t="19050" r="28575" b="28575"/>
+            <wp:docPr id="220245251" name="Imagen 1"/>
+            <wp:cNvGraphicFramePr>
+              <a:graphicFrameLocks xmlns:a="http://schemas.openxmlformats.org/drawingml/2006/main" noChangeAspect="1"/>
+            </wp:cNvGraphicFramePr>
+            <a:graphic xmlns:a="http://schemas.openxmlformats.org/drawingml/2006/main">
+              <a:graphicData uri="http://schemas.openxmlformats.org/drawingml/2006/picture">
+                <pic:pic xmlns:pic="http://schemas.openxmlformats.org/drawingml/2006/picture">
+                  <pic:nvPicPr>
+                    <pic:cNvPr id="220245251" name=""/>
+                    <pic:cNvPicPr/>
+                  </pic:nvPicPr>
+                  <pic:blipFill>
+                    <a:blip r:embed="rId27"/>
+                    <a:stretch>
+                      <a:fillRect/>
+                    </a:stretch>
+                  </pic:blipFill>
+                  <pic:spPr>
+                    <a:xfrm>
+                      <a:off x="0" y="0"/>
+                      <a:ext cx="2962688" cy="1400370"/>
+                    </a:xfrm>
+                    <a:prstGeom prst="rect">
+                      <a:avLst/>
+                    </a:prstGeom>
+                    <a:ln>
+                      <a:solidFill>
+                        <a:schemeClr val="tx1"/>
+                      </a:solidFill>
+                    </a:ln>
+                  </pic:spPr>
+                </pic:pic>
+              </a:graphicData>
+            </a:graphic>
+          </wp:inline>
+        </w:drawing>
+      </w:r>
+    </w:p>
+    <w:p>
+      <w:pPr>
+        <w:jc w:val="left"/>
+      </w:pPr>
+      <w:r>
         <w:br w:type="page"/>
       </w:r>
     </w:p>
     <w:p>
       <w:r>
         <w:lastRenderedPageBreak/>
-        <w:t xml:space="preserve">Crear la carpeta </w:t>
-      </w:r>
-      <w:proofErr w:type="spellStart"/>
-      <w:r>
-        <w:rPr>
-          <w:b/>
-          <w:bCs/>
-        </w:rPr>
-        <w:t>client</w:t>
-      </w:r>
-      <w:proofErr w:type="spellEnd"/>
-      <w:r>
-        <w:t xml:space="preserve"> en </w:t>
-      </w:r>
-      <w:r>
-        <w:rPr>
-          <w:b/>
-          <w:bCs/>
-        </w:rPr>
-        <w:t>api</w:t>
-      </w:r>
-      <w:r>
-        <w:t xml:space="preserve"> para crear las interfaces de </w:t>
-      </w:r>
-      <w:proofErr w:type="spellStart"/>
-      <w:r>
-        <w:t>feign</w:t>
-      </w:r>
-      <w:proofErr w:type="spellEnd"/>
-    </w:p>
-    <w:p>
-      <w:r>
         <w:t xml:space="preserve">Crear la interface </w:t>
       </w:r>
       <w:proofErr w:type="spellStart"/>
@@ -1895,6 +2187,9 @@
     </w:p>
     <w:p>
       <w:r>
+        <w:rPr>
+          <w:noProof/>
+        </w:rPr>
         <w:drawing>
           <wp:inline distT="0" distB="0" distL="0" distR="0" wp14:anchorId="3BF988D5" wp14:editId="4223BB87">
             <wp:extent cx="5283278" cy="3821430"/>
@@ -1911,7 +2206,7 @@
                     <pic:cNvPicPr/>
                   </pic:nvPicPr>
                   <pic:blipFill>
-                    <a:blip r:embed="rId24"/>
+                    <a:blip r:embed="rId28"/>
                     <a:stretch>
                       <a:fillRect/>
                     </a:stretch>
@@ -1953,6 +2248,9 @@
     </w:p>
     <w:p>
       <w:r>
+        <w:rPr>
+          <w:noProof/>
+        </w:rPr>
         <w:drawing>
           <wp:inline distT="0" distB="0" distL="0" distR="0" wp14:anchorId="609262E6" wp14:editId="7CC34348">
             <wp:extent cx="5300373" cy="3749029"/>
@@ -1969,7 +2267,7 @@
                     <pic:cNvPicPr/>
                   </pic:nvPicPr>
                   <pic:blipFill>
-                    <a:blip r:embed="rId25"/>
+                    <a:blip r:embed="rId29"/>
                     <a:stretch>
                       <a:fillRect/>
                     </a:stretch>
@@ -1997,6 +2295,14 @@
     </w:p>
     <w:p>
       <w:pPr>
+        <w:jc w:val="left"/>
+      </w:pPr>
+      <w:r>
+        <w:br w:type="page"/>
+      </w:r>
+    </w:p>
+    <w:p>
+      <w:pPr>
         <w:rPr>
           <w:b/>
           <w:bCs/>
@@ -2034,344 +2340,14 @@
     </w:p>
     <w:p>
       <w:r>
+        <w:rPr>
+          <w:noProof/>
+        </w:rPr>
         <w:drawing>
-          <wp:inline distT="0" distB="0" distL="0" distR="0" wp14:anchorId="3D068B89" wp14:editId="17F0A978">
-            <wp:extent cx="4296375" cy="3982006"/>
-            <wp:effectExtent l="19050" t="19050" r="28575" b="19050"/>
+          <wp:inline distT="0" distB="0" distL="0" distR="0" wp14:anchorId="3D068B89" wp14:editId="502C3A4C">
+            <wp:extent cx="4052087" cy="3755593"/>
+            <wp:effectExtent l="19050" t="19050" r="24765" b="16510"/>
             <wp:docPr id="26" name="Imagen 26"/>
-            <wp:cNvGraphicFramePr>
-              <a:graphicFrameLocks xmlns:a="http://schemas.openxmlformats.org/drawingml/2006/main" noChangeAspect="1"/>
-            </wp:cNvGraphicFramePr>
-            <a:graphic xmlns:a="http://schemas.openxmlformats.org/drawingml/2006/main">
-              <a:graphicData uri="http://schemas.openxmlformats.org/drawingml/2006/picture">
-                <pic:pic xmlns:pic="http://schemas.openxmlformats.org/drawingml/2006/picture">
-                  <pic:nvPicPr>
-                    <pic:cNvPr id="1" name=""/>
-                    <pic:cNvPicPr/>
-                  </pic:nvPicPr>
-                  <pic:blipFill>
-                    <a:blip r:embed="rId26"/>
-                    <a:stretch>
-                      <a:fillRect/>
-                    </a:stretch>
-                  </pic:blipFill>
-                  <pic:spPr>
-                    <a:xfrm>
-                      <a:off x="0" y="0"/>
-                      <a:ext cx="4296375" cy="3982006"/>
-                    </a:xfrm>
-                    <a:prstGeom prst="rect">
-                      <a:avLst/>
-                    </a:prstGeom>
-                    <a:ln>
-                      <a:solidFill>
-                        <a:schemeClr val="tx1"/>
-                      </a:solidFill>
-                    </a:ln>
-                  </pic:spPr>
-                </pic:pic>
-              </a:graphicData>
-            </a:graphic>
-          </wp:inline>
-        </w:drawing>
-      </w:r>
-    </w:p>
-    <w:p>
-      <w:pPr>
-        <w:rPr>
-          <w:b/>
-          <w:bCs/>
-        </w:rPr>
-      </w:pPr>
-      <w:r>
-        <w:t xml:space="preserve">Crear el </w:t>
-      </w:r>
-      <w:proofErr w:type="spellStart"/>
-      <w:r>
-        <w:t>record</w:t>
-      </w:r>
-      <w:proofErr w:type="spellEnd"/>
-      <w:r>
-        <w:t xml:space="preserve"> </w:t>
-      </w:r>
-      <w:proofErr w:type="spellStart"/>
-      <w:r>
-        <w:t>dto</w:t>
-      </w:r>
-      <w:proofErr w:type="spellEnd"/>
-      <w:r>
-        <w:t xml:space="preserve"> de </w:t>
-      </w:r>
-      <w:proofErr w:type="spellStart"/>
-      <w:r>
-        <w:rPr>
-          <w:b/>
-          <w:bCs/>
-        </w:rPr>
-        <w:t>ProductoResponseDto</w:t>
-      </w:r>
-      <w:proofErr w:type="spellEnd"/>
-    </w:p>
-    <w:p>
-      <w:r>
-        <w:lastRenderedPageBreak/>
-        <w:drawing>
-          <wp:inline distT="0" distB="0" distL="0" distR="0" wp14:anchorId="69169252" wp14:editId="5704F75D">
-            <wp:extent cx="4420217" cy="4210638"/>
-            <wp:effectExtent l="19050" t="19050" r="19050" b="19050"/>
-            <wp:docPr id="27" name="Imagen 27"/>
-            <wp:cNvGraphicFramePr>
-              <a:graphicFrameLocks xmlns:a="http://schemas.openxmlformats.org/drawingml/2006/main" noChangeAspect="1"/>
-            </wp:cNvGraphicFramePr>
-            <a:graphic xmlns:a="http://schemas.openxmlformats.org/drawingml/2006/main">
-              <a:graphicData uri="http://schemas.openxmlformats.org/drawingml/2006/picture">
-                <pic:pic xmlns:pic="http://schemas.openxmlformats.org/drawingml/2006/picture">
-                  <pic:nvPicPr>
-                    <pic:cNvPr id="1" name=""/>
-                    <pic:cNvPicPr/>
-                  </pic:nvPicPr>
-                  <pic:blipFill>
-                    <a:blip r:embed="rId27"/>
-                    <a:stretch>
-                      <a:fillRect/>
-                    </a:stretch>
-                  </pic:blipFill>
-                  <pic:spPr>
-                    <a:xfrm>
-                      <a:off x="0" y="0"/>
-                      <a:ext cx="4420217" cy="4210638"/>
-                    </a:xfrm>
-                    <a:prstGeom prst="rect">
-                      <a:avLst/>
-                    </a:prstGeom>
-                    <a:ln>
-                      <a:solidFill>
-                        <a:schemeClr val="tx1"/>
-                      </a:solidFill>
-                    </a:ln>
-                  </pic:spPr>
-                </pic:pic>
-              </a:graphicData>
-            </a:graphic>
-          </wp:inline>
-        </w:drawing>
-      </w:r>
-    </w:p>
-    <w:p>
-      <w:pPr>
-        <w:rPr>
-          <w:b/>
-          <w:bCs/>
-        </w:rPr>
-      </w:pPr>
-      <w:r>
-        <w:t xml:space="preserve">Modificar </w:t>
-      </w:r>
-      <w:proofErr w:type="spellStart"/>
-      <w:r>
-        <w:rPr>
-          <w:b/>
-          <w:bCs/>
-        </w:rPr>
-        <w:t>DetalleVentaRequestDto</w:t>
-      </w:r>
-      <w:proofErr w:type="spellEnd"/>
-    </w:p>
-    <w:p>
-      <w:pPr>
-        <w:rPr>
-          <w:i/>
-          <w:iCs/>
-        </w:rPr>
-      </w:pPr>
-      <w:r>
-        <w:rPr>
-          <w:b/>
-          <w:bCs/>
-          <w:i/>
-          <w:iCs/>
-        </w:rPr>
-        <w:t xml:space="preserve">Nota: </w:t>
-      </w:r>
-      <w:r>
-        <w:rPr>
-          <w:i/>
-          <w:iCs/>
-        </w:rPr>
-        <w:t>Ya no debe recibir precio, porque el precio viene de producto-</w:t>
-      </w:r>
-      <w:proofErr w:type="spellStart"/>
-      <w:r>
-        <w:rPr>
-          <w:i/>
-          <w:iCs/>
-        </w:rPr>
-        <w:t>service</w:t>
-      </w:r>
-      <w:proofErr w:type="spellEnd"/>
-      <w:r>
-        <w:rPr>
-          <w:i/>
-          <w:iCs/>
-        </w:rPr>
-        <w:t>.</w:t>
-      </w:r>
-    </w:p>
-    <w:p>
-      <w:r>
-        <w:t>Probar que este funcional</w:t>
-      </w:r>
-    </w:p>
-    <w:p>
-      <w:r>
-        <w:drawing>
-          <wp:inline distT="0" distB="0" distL="0" distR="0" wp14:anchorId="2ED2071E" wp14:editId="04A4286B">
-            <wp:extent cx="5400040" cy="2999105"/>
-            <wp:effectExtent l="19050" t="19050" r="10160" b="10795"/>
-            <wp:docPr id="28" name="Imagen 28"/>
-            <wp:cNvGraphicFramePr>
-              <a:graphicFrameLocks xmlns:a="http://schemas.openxmlformats.org/drawingml/2006/main" noChangeAspect="1"/>
-            </wp:cNvGraphicFramePr>
-            <a:graphic xmlns:a="http://schemas.openxmlformats.org/drawingml/2006/main">
-              <a:graphicData uri="http://schemas.openxmlformats.org/drawingml/2006/picture">
-                <pic:pic xmlns:pic="http://schemas.openxmlformats.org/drawingml/2006/picture">
-                  <pic:nvPicPr>
-                    <pic:cNvPr id="1" name=""/>
-                    <pic:cNvPicPr/>
-                  </pic:nvPicPr>
-                  <pic:blipFill>
-                    <a:blip r:embed="rId28"/>
-                    <a:stretch>
-                      <a:fillRect/>
-                    </a:stretch>
-                  </pic:blipFill>
-                  <pic:spPr>
-                    <a:xfrm>
-                      <a:off x="0" y="0"/>
-                      <a:ext cx="5400040" cy="2999105"/>
-                    </a:xfrm>
-                    <a:prstGeom prst="rect">
-                      <a:avLst/>
-                    </a:prstGeom>
-                    <a:ln>
-                      <a:solidFill>
-                        <a:schemeClr val="tx1"/>
-                      </a:solidFill>
-                    </a:ln>
-                  </pic:spPr>
-                </pic:pic>
-              </a:graphicData>
-            </a:graphic>
-          </wp:inline>
-        </w:drawing>
-      </w:r>
-    </w:p>
-    <w:p>
-      <w:pPr>
-        <w:jc w:val="left"/>
-      </w:pPr>
-      <w:r>
-        <w:br w:type="page"/>
-      </w:r>
-    </w:p>
-    <w:p>
-      <w:r>
-        <w:lastRenderedPageBreak/>
-        <w:t>Agregar el método descontar stock en Producto-</w:t>
-      </w:r>
-      <w:proofErr w:type="spellStart"/>
-      <w:r>
-        <w:t>Service</w:t>
-      </w:r>
-      <w:proofErr w:type="spellEnd"/>
-    </w:p>
-    <w:p>
-      <w:pPr>
-        <w:rPr>
-          <w:b/>
-          <w:bCs/>
-        </w:rPr>
-      </w:pPr>
-      <w:r>
-        <w:t xml:space="preserve">Crear el </w:t>
-      </w:r>
-      <w:proofErr w:type="spellStart"/>
-      <w:r>
-        <w:t>record</w:t>
-      </w:r>
-      <w:proofErr w:type="spellEnd"/>
-      <w:r>
-        <w:t xml:space="preserve"> </w:t>
-      </w:r>
-      <w:proofErr w:type="spellStart"/>
-      <w:r>
-        <w:t>dto</w:t>
-      </w:r>
-      <w:proofErr w:type="spellEnd"/>
-      <w:r>
-        <w:t xml:space="preserve"> </w:t>
-      </w:r>
-      <w:proofErr w:type="spellStart"/>
-      <w:r>
-        <w:rPr>
-          <w:b/>
-          <w:bCs/>
-        </w:rPr>
-        <w:t>StockRequestDto</w:t>
-      </w:r>
-      <w:proofErr w:type="spellEnd"/>
-    </w:p>
-    <w:p>
-      <w:r>
-        <w:drawing>
-          <wp:inline distT="0" distB="0" distL="0" distR="0" wp14:anchorId="74EF6C33" wp14:editId="2016E48E">
-            <wp:extent cx="4544059" cy="2362530"/>
-            <wp:effectExtent l="0" t="0" r="0" b="0"/>
-            <wp:docPr id="29" name="Imagen 29"/>
-            <wp:cNvGraphicFramePr>
-              <a:graphicFrameLocks xmlns:a="http://schemas.openxmlformats.org/drawingml/2006/main" noChangeAspect="1"/>
-            </wp:cNvGraphicFramePr>
-            <a:graphic xmlns:a="http://schemas.openxmlformats.org/drawingml/2006/main">
-              <a:graphicData uri="http://schemas.openxmlformats.org/drawingml/2006/picture">
-                <pic:pic xmlns:pic="http://schemas.openxmlformats.org/drawingml/2006/picture">
-                  <pic:nvPicPr>
-                    <pic:cNvPr id="1" name=""/>
-                    <pic:cNvPicPr/>
-                  </pic:nvPicPr>
-                  <pic:blipFill>
-                    <a:blip r:embed="rId29"/>
-                    <a:stretch>
-                      <a:fillRect/>
-                    </a:stretch>
-                  </pic:blipFill>
-                  <pic:spPr>
-                    <a:xfrm>
-                      <a:off x="0" y="0"/>
-                      <a:ext cx="4544059" cy="2362530"/>
-                    </a:xfrm>
-                    <a:prstGeom prst="rect">
-                      <a:avLst/>
-                    </a:prstGeom>
-                  </pic:spPr>
-                </pic:pic>
-              </a:graphicData>
-            </a:graphic>
-          </wp:inline>
-        </w:drawing>
-      </w:r>
-    </w:p>
-    <w:p>
-      <w:r>
-        <w:t>ProductoService.java</w:t>
-      </w:r>
-    </w:p>
-    <w:p>
-      <w:r>
-        <w:drawing>
-          <wp:inline distT="0" distB="0" distL="0" distR="0" wp14:anchorId="0EAA1AE0" wp14:editId="2ED5C191">
-            <wp:extent cx="3429479" cy="228632"/>
-            <wp:effectExtent l="0" t="0" r="0" b="0"/>
-            <wp:docPr id="30" name="Imagen 30"/>
             <wp:cNvGraphicFramePr>
               <a:graphicFrameLocks xmlns:a="http://schemas.openxmlformats.org/drawingml/2006/main" noChangeAspect="1"/>
             </wp:cNvGraphicFramePr>
@@ -2391,11 +2367,16 @@
                   <pic:spPr>
                     <a:xfrm>
                       <a:off x="0" y="0"/>
-                      <a:ext cx="3429479" cy="228632"/>
+                      <a:ext cx="4060421" cy="3763317"/>
                     </a:xfrm>
                     <a:prstGeom prst="rect">
                       <a:avLst/>
                     </a:prstGeom>
+                    <a:ln>
+                      <a:solidFill>
+                        <a:schemeClr val="tx1"/>
+                      </a:solidFill>
+                    </a:ln>
                   </pic:spPr>
                 </pic:pic>
               </a:graphicData>
@@ -2405,19 +2386,51 @@
       </w:r>
     </w:p>
     <w:p>
-      <w:proofErr w:type="spellStart"/>
-      <w:r>
-        <w:t>Quedaria</w:t>
-      </w:r>
-      <w:proofErr w:type="spellEnd"/>
-    </w:p>
-    <w:p>
-      <w:r>
+      <w:pPr>
+        <w:rPr>
+          <w:b/>
+          <w:bCs/>
+        </w:rPr>
+      </w:pPr>
+      <w:r>
+        <w:t xml:space="preserve">Crear el </w:t>
+      </w:r>
+      <w:proofErr w:type="spellStart"/>
+      <w:r>
+        <w:t>record</w:t>
+      </w:r>
+      <w:proofErr w:type="spellEnd"/>
+      <w:r>
+        <w:t xml:space="preserve"> </w:t>
+      </w:r>
+      <w:proofErr w:type="spellStart"/>
+      <w:r>
+        <w:t>dto</w:t>
+      </w:r>
+      <w:proofErr w:type="spellEnd"/>
+      <w:r>
+        <w:t xml:space="preserve"> de </w:t>
+      </w:r>
+      <w:proofErr w:type="spellStart"/>
+      <w:r>
+        <w:rPr>
+          <w:b/>
+          <w:bCs/>
+        </w:rPr>
+        <w:t>ProductoResponseDto</w:t>
+      </w:r>
+      <w:proofErr w:type="spellEnd"/>
+    </w:p>
+    <w:p>
+      <w:r>
+        <w:rPr>
+          <w:noProof/>
+        </w:rPr>
         <w:drawing>
-          <wp:inline distT="0" distB="0" distL="0" distR="0" wp14:anchorId="158F11FC" wp14:editId="2CB1A705">
-            <wp:extent cx="4620270" cy="2743583"/>
-            <wp:effectExtent l="0" t="0" r="8890" b="0"/>
-            <wp:docPr id="31" name="Imagen 31"/>
+          <wp:inline distT="0" distB="0" distL="0" distR="0" wp14:anchorId="69169252" wp14:editId="33195738">
+            <wp:extent cx="4062831" cy="3870197"/>
+            <wp:effectExtent l="19050" t="19050" r="13970" b="16510"/>
+            <wp:docPr id="27" name="Imagen 27"/>
             <wp:cNvGraphicFramePr>
               <a:graphicFrameLocks xmlns:a="http://schemas.openxmlformats.org/drawingml/2006/main" noChangeAspect="1"/>
             </wp:cNvGraphicFramePr>
@@ -2437,11 +2450,16 @@
                   <pic:spPr>
                     <a:xfrm>
                       <a:off x="0" y="0"/>
-                      <a:ext cx="4620270" cy="2743583"/>
+                      <a:ext cx="4070239" cy="3877254"/>
                     </a:xfrm>
                     <a:prstGeom prst="rect">
                       <a:avLst/>
                     </a:prstGeom>
+                    <a:ln>
+                      <a:solidFill>
+                        <a:schemeClr val="tx1"/>
+                      </a:solidFill>
+                    </a:ln>
                   </pic:spPr>
                 </pic:pic>
               </a:graphicData>
@@ -2451,18 +2469,54 @@
       </w:r>
     </w:p>
     <w:p>
-      <w:r>
-        <w:t>ProductoServiceImpl.java</w:t>
+      <w:pPr>
+        <w:jc w:val="left"/>
+      </w:pPr>
+      <w:r>
+        <w:br w:type="page"/>
       </w:r>
     </w:p>
     <w:p>
       <w:r>
         <w:lastRenderedPageBreak/>
+        <w:t xml:space="preserve">Para usar el </w:t>
+      </w:r>
+      <w:r>
+        <w:rPr>
+          <w:b/>
+          <w:bCs/>
+        </w:rPr>
+        <w:t>cliente-</w:t>
+      </w:r>
+      <w:proofErr w:type="spellStart"/>
+      <w:r>
+        <w:rPr>
+          <w:b/>
+          <w:bCs/>
+        </w:rPr>
+        <w:t>service</w:t>
+      </w:r>
+      <w:proofErr w:type="spellEnd"/>
+      <w:r>
+        <w:t xml:space="preserve"> se realiza la modificación en el </w:t>
+      </w:r>
+      <w:proofErr w:type="spellStart"/>
+      <w:r>
+        <w:rPr>
+          <w:b/>
+          <w:bCs/>
+        </w:rPr>
+        <w:t>VentaServiceImpl</w:t>
+      </w:r>
+      <w:proofErr w:type="spellEnd"/>
+    </w:p>
+    <w:p>
+      <w:r>
         <w:drawing>
-          <wp:inline distT="0" distB="0" distL="0" distR="0" wp14:anchorId="120C64BC" wp14:editId="00812C82">
-            <wp:extent cx="4772691" cy="5172797"/>
-            <wp:effectExtent l="0" t="0" r="8890" b="8890"/>
-            <wp:docPr id="32" name="Imagen 32"/>
+          <wp:inline distT="0" distB="0" distL="0" distR="0" wp14:anchorId="24B97A3A" wp14:editId="7EF1FD26">
+            <wp:extent cx="5287113" cy="1286054"/>
+            <wp:effectExtent l="19050" t="19050" r="27940" b="28575"/>
+            <wp:docPr id="1202093286" name="Imagen 1"/>
             <wp:cNvGraphicFramePr>
               <a:graphicFrameLocks xmlns:a="http://schemas.openxmlformats.org/drawingml/2006/main" noChangeAspect="1"/>
             </wp:cNvGraphicFramePr>
@@ -2470,7 +2524,7 @@
               <a:graphicData uri="http://schemas.openxmlformats.org/drawingml/2006/picture">
                 <pic:pic xmlns:pic="http://schemas.openxmlformats.org/drawingml/2006/picture">
                   <pic:nvPicPr>
-                    <pic:cNvPr id="1" name=""/>
+                    <pic:cNvPr id="1202093286" name=""/>
                     <pic:cNvPicPr/>
                   </pic:nvPicPr>
                   <pic:blipFill>
@@ -2482,11 +2536,16 @@
                   <pic:spPr>
                     <a:xfrm>
                       <a:off x="0" y="0"/>
-                      <a:ext cx="4772691" cy="5172797"/>
+                      <a:ext cx="5287113" cy="1286054"/>
                     </a:xfrm>
                     <a:prstGeom prst="rect">
                       <a:avLst/>
                     </a:prstGeom>
+                    <a:ln>
+                      <a:solidFill>
+                        <a:schemeClr val="tx1"/>
+                      </a:solidFill>
+                    </a:ln>
                   </pic:spPr>
                 </pic:pic>
               </a:graphicData>
@@ -2496,19 +2555,12 @@
       </w:r>
     </w:p>
     <w:p>
-      <w:proofErr w:type="spellStart"/>
-      <w:r>
-        <w:t>Controller</w:t>
-      </w:r>
-      <w:proofErr w:type="spellEnd"/>
-    </w:p>
-    <w:p>
       <w:r>
         <w:drawing>
-          <wp:inline distT="0" distB="0" distL="0" distR="0" wp14:anchorId="5B19BDF4" wp14:editId="05992D09">
-            <wp:extent cx="3915321" cy="1695687"/>
-            <wp:effectExtent l="0" t="0" r="0" b="0"/>
-            <wp:docPr id="33" name="Imagen 33"/>
+          <wp:inline distT="0" distB="0" distL="0" distR="0" wp14:anchorId="48AB2109" wp14:editId="14C72E2A">
+            <wp:extent cx="5400040" cy="1762760"/>
+            <wp:effectExtent l="19050" t="19050" r="10160" b="27940"/>
+            <wp:docPr id="1838593948" name="Imagen 1"/>
             <wp:cNvGraphicFramePr>
               <a:graphicFrameLocks xmlns:a="http://schemas.openxmlformats.org/drawingml/2006/main" noChangeAspect="1"/>
             </wp:cNvGraphicFramePr>
@@ -2516,7 +2568,7 @@
               <a:graphicData uri="http://schemas.openxmlformats.org/drawingml/2006/picture">
                 <pic:pic xmlns:pic="http://schemas.openxmlformats.org/drawingml/2006/picture">
                   <pic:nvPicPr>
-                    <pic:cNvPr id="1" name=""/>
+                    <pic:cNvPr id="1838593948" name=""/>
                     <pic:cNvPicPr/>
                   </pic:nvPicPr>
                   <pic:blipFill>
@@ -2528,17 +2580,915 @@
                   <pic:spPr>
                     <a:xfrm>
                       <a:off x="0" y="0"/>
-                      <a:ext cx="3915321" cy="1695687"/>
+                      <a:ext cx="5400040" cy="1762760"/>
                     </a:xfrm>
                     <a:prstGeom prst="rect">
                       <a:avLst/>
                     </a:prstGeom>
+                    <a:ln>
+                      <a:solidFill>
+                        <a:schemeClr val="tx1"/>
+                      </a:solidFill>
+                    </a:ln>
                   </pic:spPr>
                 </pic:pic>
               </a:graphicData>
             </a:graphic>
           </wp:inline>
         </w:drawing>
+      </w:r>
+    </w:p>
+    <w:p>
+      <w:r>
+        <w:drawing>
+          <wp:inline distT="0" distB="0" distL="0" distR="0" wp14:anchorId="2201A0CA" wp14:editId="4CAFE420">
+            <wp:extent cx="5400040" cy="1236345"/>
+            <wp:effectExtent l="19050" t="19050" r="10160" b="20955"/>
+            <wp:docPr id="1393002509" name="Imagen 1"/>
+            <wp:cNvGraphicFramePr>
+              <a:graphicFrameLocks xmlns:a="http://schemas.openxmlformats.org/drawingml/2006/main" noChangeAspect="1"/>
+            </wp:cNvGraphicFramePr>
+            <a:graphic xmlns:a="http://schemas.openxmlformats.org/drawingml/2006/main">
+              <a:graphicData uri="http://schemas.openxmlformats.org/drawingml/2006/picture">
+                <pic:pic xmlns:pic="http://schemas.openxmlformats.org/drawingml/2006/picture">
+                  <pic:nvPicPr>
+                    <pic:cNvPr id="1393002509" name=""/>
+                    <pic:cNvPicPr/>
+                  </pic:nvPicPr>
+                  <pic:blipFill>
+                    <a:blip r:embed="rId34"/>
+                    <a:stretch>
+                      <a:fillRect/>
+                    </a:stretch>
+                  </pic:blipFill>
+                  <pic:spPr>
+                    <a:xfrm>
+                      <a:off x="0" y="0"/>
+                      <a:ext cx="5400040" cy="1236345"/>
+                    </a:xfrm>
+                    <a:prstGeom prst="rect">
+                      <a:avLst/>
+                    </a:prstGeom>
+                    <a:ln>
+                      <a:solidFill>
+                        <a:schemeClr val="tx1"/>
+                      </a:solidFill>
+                    </a:ln>
+                  </pic:spPr>
+                </pic:pic>
+              </a:graphicData>
+            </a:graphic>
+          </wp:inline>
+        </w:drawing>
+      </w:r>
+    </w:p>
+    <w:p>
+      <w:r>
+        <w:drawing>
+          <wp:inline distT="0" distB="0" distL="0" distR="0" wp14:anchorId="357F95B3" wp14:editId="7EE1FB33">
+            <wp:extent cx="5400040" cy="1113155"/>
+            <wp:effectExtent l="19050" t="19050" r="10160" b="10795"/>
+            <wp:docPr id="843332716" name="Imagen 1"/>
+            <wp:cNvGraphicFramePr>
+              <a:graphicFrameLocks xmlns:a="http://schemas.openxmlformats.org/drawingml/2006/main" noChangeAspect="1"/>
+            </wp:cNvGraphicFramePr>
+            <a:graphic xmlns:a="http://schemas.openxmlformats.org/drawingml/2006/main">
+              <a:graphicData uri="http://schemas.openxmlformats.org/drawingml/2006/picture">
+                <pic:pic xmlns:pic="http://schemas.openxmlformats.org/drawingml/2006/picture">
+                  <pic:nvPicPr>
+                    <pic:cNvPr id="843332716" name=""/>
+                    <pic:cNvPicPr/>
+                  </pic:nvPicPr>
+                  <pic:blipFill>
+                    <a:blip r:embed="rId35"/>
+                    <a:stretch>
+                      <a:fillRect/>
+                    </a:stretch>
+                  </pic:blipFill>
+                  <pic:spPr>
+                    <a:xfrm>
+                      <a:off x="0" y="0"/>
+                      <a:ext cx="5400040" cy="1113155"/>
+                    </a:xfrm>
+                    <a:prstGeom prst="rect">
+                      <a:avLst/>
+                    </a:prstGeom>
+                    <a:ln>
+                      <a:solidFill>
+                        <a:schemeClr val="tx1"/>
+                      </a:solidFill>
+                    </a:ln>
+                  </pic:spPr>
+                </pic:pic>
+              </a:graphicData>
+            </a:graphic>
+          </wp:inline>
+        </w:drawing>
+      </w:r>
+    </w:p>
+    <w:p>
+      <w:r>
+        <w:t>Hasta aquí se harán llamadas HTTP de tipo GET a cliente-</w:t>
+      </w:r>
+      <w:proofErr w:type="spellStart"/>
+      <w:r>
+        <w:t>service</w:t>
+      </w:r>
+      <w:proofErr w:type="spellEnd"/>
+    </w:p>
+    <w:p>
+      <w:pPr>
+        <w:jc w:val="left"/>
+      </w:pPr>
+      <w:r>
+        <w:br w:type="page"/>
+      </w:r>
+    </w:p>
+    <w:p>
+      <w:r>
+        <w:lastRenderedPageBreak/>
+        <w:t>Ahora se quiere realizar el descuento de stock con producto-</w:t>
+      </w:r>
+      <w:proofErr w:type="spellStart"/>
+      <w:r>
+        <w:t>service</w:t>
+      </w:r>
+      <w:proofErr w:type="spellEnd"/>
+      <w:r>
+        <w:t xml:space="preserve"> para ellos implementaremos un método HTTP de tipo </w:t>
+      </w:r>
+      <w:r>
+        <w:rPr>
+          <w:b/>
+          <w:bCs/>
+        </w:rPr>
+        <w:t>PUT</w:t>
+      </w:r>
+    </w:p>
+    <w:p>
+      <w:r>
+        <w:t xml:space="preserve">En </w:t>
+      </w:r>
+      <w:r>
+        <w:rPr>
+          <w:b/>
+          <w:bCs/>
+        </w:rPr>
+        <w:t>producto-</w:t>
+      </w:r>
+      <w:proofErr w:type="spellStart"/>
+      <w:r>
+        <w:rPr>
+          <w:b/>
+          <w:bCs/>
+        </w:rPr>
+        <w:t>service</w:t>
+      </w:r>
+      <w:proofErr w:type="spellEnd"/>
+      <w:r>
+        <w:rPr>
+          <w:b/>
+          <w:bCs/>
+        </w:rPr>
+        <w:t xml:space="preserve"> </w:t>
+      </w:r>
+      <w:r>
+        <w:t xml:space="preserve">agregamos el </w:t>
+      </w:r>
+      <w:proofErr w:type="spellStart"/>
+      <w:r>
+        <w:t>record</w:t>
+      </w:r>
+      <w:proofErr w:type="spellEnd"/>
+      <w:r>
+        <w:t xml:space="preserve"> </w:t>
+      </w:r>
+      <w:proofErr w:type="spellStart"/>
+      <w:r>
+        <w:t>dto</w:t>
+      </w:r>
+      <w:proofErr w:type="spellEnd"/>
+      <w:r>
+        <w:t xml:space="preserve"> </w:t>
+      </w:r>
+      <w:proofErr w:type="spellStart"/>
+      <w:r>
+        <w:rPr>
+          <w:b/>
+          <w:bCs/>
+        </w:rPr>
+        <w:t>StockRequestDto</w:t>
+      </w:r>
+      <w:proofErr w:type="spellEnd"/>
+    </w:p>
+    <w:p>
+      <w:r>
+        <w:drawing>
+          <wp:inline distT="0" distB="0" distL="0" distR="0" wp14:anchorId="741CA43B" wp14:editId="3D1AA497">
+            <wp:extent cx="2138632" cy="1341577"/>
+            <wp:effectExtent l="19050" t="19050" r="14605" b="11430"/>
+            <wp:docPr id="1688598000" name="Imagen 1"/>
+            <wp:cNvGraphicFramePr>
+              <a:graphicFrameLocks xmlns:a="http://schemas.openxmlformats.org/drawingml/2006/main" noChangeAspect="1"/>
+            </wp:cNvGraphicFramePr>
+            <a:graphic xmlns:a="http://schemas.openxmlformats.org/drawingml/2006/main">
+              <a:graphicData uri="http://schemas.openxmlformats.org/drawingml/2006/picture">
+                <pic:pic xmlns:pic="http://schemas.openxmlformats.org/drawingml/2006/picture">
+                  <pic:nvPicPr>
+                    <pic:cNvPr id="1688598000" name=""/>
+                    <pic:cNvPicPr/>
+                  </pic:nvPicPr>
+                  <pic:blipFill>
+                    <a:blip r:embed="rId36"/>
+                    <a:stretch>
+                      <a:fillRect/>
+                    </a:stretch>
+                  </pic:blipFill>
+                  <pic:spPr>
+                    <a:xfrm>
+                      <a:off x="0" y="0"/>
+                      <a:ext cx="2142708" cy="1344134"/>
+                    </a:xfrm>
+                    <a:prstGeom prst="rect">
+                      <a:avLst/>
+                    </a:prstGeom>
+                    <a:ln>
+                      <a:solidFill>
+                        <a:schemeClr val="tx1"/>
+                      </a:solidFill>
+                    </a:ln>
+                  </pic:spPr>
+                </pic:pic>
+              </a:graphicData>
+            </a:graphic>
+          </wp:inline>
+        </w:drawing>
+      </w:r>
+    </w:p>
+    <w:p>
+      <w:r>
+        <w:drawing>
+          <wp:inline distT="0" distB="0" distL="0" distR="0" wp14:anchorId="2A45E801" wp14:editId="474C8948">
+            <wp:extent cx="4677308" cy="2132949"/>
+            <wp:effectExtent l="19050" t="19050" r="9525" b="20320"/>
+            <wp:docPr id="905250770" name="Imagen 1"/>
+            <wp:cNvGraphicFramePr>
+              <a:graphicFrameLocks xmlns:a="http://schemas.openxmlformats.org/drawingml/2006/main" noChangeAspect="1"/>
+            </wp:cNvGraphicFramePr>
+            <a:graphic xmlns:a="http://schemas.openxmlformats.org/drawingml/2006/main">
+              <a:graphicData uri="http://schemas.openxmlformats.org/drawingml/2006/picture">
+                <pic:pic xmlns:pic="http://schemas.openxmlformats.org/drawingml/2006/picture">
+                  <pic:nvPicPr>
+                    <pic:cNvPr id="905250770" name=""/>
+                    <pic:cNvPicPr/>
+                  </pic:nvPicPr>
+                  <pic:blipFill>
+                    <a:blip r:embed="rId37"/>
+                    <a:stretch>
+                      <a:fillRect/>
+                    </a:stretch>
+                  </pic:blipFill>
+                  <pic:spPr>
+                    <a:xfrm>
+                      <a:off x="0" y="0"/>
+                      <a:ext cx="4680195" cy="2134265"/>
+                    </a:xfrm>
+                    <a:prstGeom prst="rect">
+                      <a:avLst/>
+                    </a:prstGeom>
+                    <a:ln>
+                      <a:solidFill>
+                        <a:schemeClr val="tx1"/>
+                      </a:solidFill>
+                    </a:ln>
+                  </pic:spPr>
+                </pic:pic>
+              </a:graphicData>
+            </a:graphic>
+          </wp:inline>
+        </w:drawing>
+      </w:r>
+    </w:p>
+    <w:p>
+      <w:r>
+        <w:t xml:space="preserve">Agregar el método </w:t>
+      </w:r>
+      <w:proofErr w:type="spellStart"/>
+      <w:r>
+        <w:rPr>
+          <w:b/>
+          <w:bCs/>
+        </w:rPr>
+        <w:t>descontarStock</w:t>
+      </w:r>
+      <w:proofErr w:type="spellEnd"/>
+      <w:r>
+        <w:t xml:space="preserve"> en el </w:t>
+      </w:r>
+      <w:proofErr w:type="spellStart"/>
+      <w:r>
+        <w:rPr>
+          <w:b/>
+          <w:bCs/>
+        </w:rPr>
+        <w:t>ProductService</w:t>
+      </w:r>
+      <w:proofErr w:type="spellEnd"/>
+    </w:p>
+    <w:p>
+      <w:r>
+        <w:drawing>
+          <wp:inline distT="0" distB="0" distL="0" distR="0" wp14:anchorId="0C0AD9AF" wp14:editId="458046A0">
+            <wp:extent cx="4487113" cy="3262444"/>
+            <wp:effectExtent l="19050" t="19050" r="27940" b="14605"/>
+            <wp:docPr id="558305765" name="Imagen 1"/>
+            <wp:cNvGraphicFramePr>
+              <a:graphicFrameLocks xmlns:a="http://schemas.openxmlformats.org/drawingml/2006/main" noChangeAspect="1"/>
+            </wp:cNvGraphicFramePr>
+            <a:graphic xmlns:a="http://schemas.openxmlformats.org/drawingml/2006/main">
+              <a:graphicData uri="http://schemas.openxmlformats.org/drawingml/2006/picture">
+                <pic:pic xmlns:pic="http://schemas.openxmlformats.org/drawingml/2006/picture">
+                  <pic:nvPicPr>
+                    <pic:cNvPr id="558305765" name=""/>
+                    <pic:cNvPicPr/>
+                  </pic:nvPicPr>
+                  <pic:blipFill>
+                    <a:blip r:embed="rId38"/>
+                    <a:stretch>
+                      <a:fillRect/>
+                    </a:stretch>
+                  </pic:blipFill>
+                  <pic:spPr>
+                    <a:xfrm>
+                      <a:off x="0" y="0"/>
+                      <a:ext cx="4488619" cy="3263539"/>
+                    </a:xfrm>
+                    <a:prstGeom prst="rect">
+                      <a:avLst/>
+                    </a:prstGeom>
+                    <a:ln>
+                      <a:solidFill>
+                        <a:schemeClr val="tx1"/>
+                      </a:solidFill>
+                    </a:ln>
+                  </pic:spPr>
+                </pic:pic>
+              </a:graphicData>
+            </a:graphic>
+          </wp:inline>
+        </w:drawing>
+      </w:r>
+    </w:p>
+    <w:p>
+      <w:pPr>
+        <w:jc w:val="left"/>
+      </w:pPr>
+      <w:r>
+        <w:br w:type="page"/>
+      </w:r>
+    </w:p>
+    <w:p>
+      <w:r>
+        <w:lastRenderedPageBreak/>
+        <w:t xml:space="preserve">Agregar la implementación al </w:t>
+      </w:r>
+      <w:proofErr w:type="spellStart"/>
+      <w:r>
+        <w:rPr>
+          <w:b/>
+          <w:bCs/>
+        </w:rPr>
+        <w:t>ProductoServiceImpl</w:t>
+      </w:r>
+      <w:proofErr w:type="spellEnd"/>
+    </w:p>
+    <w:p>
+      <w:r>
+        <w:drawing>
+          <wp:inline distT="0" distB="0" distL="0" distR="0" wp14:anchorId="3C814DD5" wp14:editId="0D24F00F">
+            <wp:extent cx="5400040" cy="5245100"/>
+            <wp:effectExtent l="19050" t="19050" r="10160" b="12700"/>
+            <wp:docPr id="1849523573" name="Imagen 1"/>
+            <wp:cNvGraphicFramePr>
+              <a:graphicFrameLocks xmlns:a="http://schemas.openxmlformats.org/drawingml/2006/main" noChangeAspect="1"/>
+            </wp:cNvGraphicFramePr>
+            <a:graphic xmlns:a="http://schemas.openxmlformats.org/drawingml/2006/main">
+              <a:graphicData uri="http://schemas.openxmlformats.org/drawingml/2006/picture">
+                <pic:pic xmlns:pic="http://schemas.openxmlformats.org/drawingml/2006/picture">
+                  <pic:nvPicPr>
+                    <pic:cNvPr id="1849523573" name=""/>
+                    <pic:cNvPicPr/>
+                  </pic:nvPicPr>
+                  <pic:blipFill>
+                    <a:blip r:embed="rId39"/>
+                    <a:stretch>
+                      <a:fillRect/>
+                    </a:stretch>
+                  </pic:blipFill>
+                  <pic:spPr>
+                    <a:xfrm>
+                      <a:off x="0" y="0"/>
+                      <a:ext cx="5400040" cy="5245100"/>
+                    </a:xfrm>
+                    <a:prstGeom prst="rect">
+                      <a:avLst/>
+                    </a:prstGeom>
+                    <a:ln>
+                      <a:solidFill>
+                        <a:schemeClr val="tx1"/>
+                      </a:solidFill>
+                    </a:ln>
+                  </pic:spPr>
+                </pic:pic>
+              </a:graphicData>
+            </a:graphic>
+          </wp:inline>
+        </w:drawing>
+      </w:r>
+    </w:p>
+    <w:p>
+      <w:r>
+        <w:t xml:space="preserve">Agregar al </w:t>
+      </w:r>
+      <w:proofErr w:type="spellStart"/>
+      <w:r>
+        <w:rPr>
+          <w:b/>
+          <w:bCs/>
+        </w:rPr>
+        <w:t>Controller</w:t>
+      </w:r>
+      <w:proofErr w:type="spellEnd"/>
+    </w:p>
+    <w:p>
+      <w:r>
+        <w:drawing>
+          <wp:inline distT="0" distB="0" distL="0" distR="0" wp14:anchorId="4D825CE5" wp14:editId="1A661B9C">
+            <wp:extent cx="5353797" cy="1962424"/>
+            <wp:effectExtent l="19050" t="19050" r="18415" b="19050"/>
+            <wp:docPr id="286281176" name="Imagen 1"/>
+            <wp:cNvGraphicFramePr>
+              <a:graphicFrameLocks xmlns:a="http://schemas.openxmlformats.org/drawingml/2006/main" noChangeAspect="1"/>
+            </wp:cNvGraphicFramePr>
+            <a:graphic xmlns:a="http://schemas.openxmlformats.org/drawingml/2006/main">
+              <a:graphicData uri="http://schemas.openxmlformats.org/drawingml/2006/picture">
+                <pic:pic xmlns:pic="http://schemas.openxmlformats.org/drawingml/2006/picture">
+                  <pic:nvPicPr>
+                    <pic:cNvPr id="286281176" name=""/>
+                    <pic:cNvPicPr/>
+                  </pic:nvPicPr>
+                  <pic:blipFill>
+                    <a:blip r:embed="rId40"/>
+                    <a:stretch>
+                      <a:fillRect/>
+                    </a:stretch>
+                  </pic:blipFill>
+                  <pic:spPr>
+                    <a:xfrm>
+                      <a:off x="0" y="0"/>
+                      <a:ext cx="5353797" cy="1962424"/>
+                    </a:xfrm>
+                    <a:prstGeom prst="rect">
+                      <a:avLst/>
+                    </a:prstGeom>
+                    <a:ln>
+                      <a:solidFill>
+                        <a:schemeClr val="tx1"/>
+                      </a:solidFill>
+                    </a:ln>
+                  </pic:spPr>
+                </pic:pic>
+              </a:graphicData>
+            </a:graphic>
+          </wp:inline>
+        </w:drawing>
+      </w:r>
+    </w:p>
+    <w:p>
+      <w:pPr>
+        <w:jc w:val="left"/>
+      </w:pPr>
+      <w:r>
+        <w:br w:type="page"/>
+      </w:r>
+    </w:p>
+    <w:p>
+      <w:pPr>
+        <w:jc w:val="left"/>
+      </w:pPr>
+      <w:proofErr w:type="spellStart"/>
+      <w:r>
+        <w:lastRenderedPageBreak/>
+        <w:t>Endpoint</w:t>
+      </w:r>
+      <w:proofErr w:type="spellEnd"/>
+      <w:r>
+        <w:t xml:space="preserve">: </w:t>
+      </w:r>
+      <w:r>
+        <w:t>PUT http://localhost:8082/api/v1/productos/1/descontar-stock</w:t>
+      </w:r>
+    </w:p>
+    <w:p>
+      <w:r>
+        <w:drawing>
+          <wp:inline distT="0" distB="0" distL="0" distR="0" wp14:anchorId="646F7AAE" wp14:editId="2F1C3CE6">
+            <wp:extent cx="5400040" cy="1043305"/>
+            <wp:effectExtent l="19050" t="19050" r="10160" b="23495"/>
+            <wp:docPr id="1634292667" name="Imagen 1"/>
+            <wp:cNvGraphicFramePr>
+              <a:graphicFrameLocks xmlns:a="http://schemas.openxmlformats.org/drawingml/2006/main" noChangeAspect="1"/>
+            </wp:cNvGraphicFramePr>
+            <a:graphic xmlns:a="http://schemas.openxmlformats.org/drawingml/2006/main">
+              <a:graphicData uri="http://schemas.openxmlformats.org/drawingml/2006/picture">
+                <pic:pic xmlns:pic="http://schemas.openxmlformats.org/drawingml/2006/picture">
+                  <pic:nvPicPr>
+                    <pic:cNvPr id="1634292667" name=""/>
+                    <pic:cNvPicPr/>
+                  </pic:nvPicPr>
+                  <pic:blipFill>
+                    <a:blip r:embed="rId41"/>
+                    <a:stretch>
+                      <a:fillRect/>
+                    </a:stretch>
+                  </pic:blipFill>
+                  <pic:spPr>
+                    <a:xfrm>
+                      <a:off x="0" y="0"/>
+                      <a:ext cx="5400040" cy="1043305"/>
+                    </a:xfrm>
+                    <a:prstGeom prst="rect">
+                      <a:avLst/>
+                    </a:prstGeom>
+                    <a:ln>
+                      <a:solidFill>
+                        <a:schemeClr val="tx1"/>
+                      </a:solidFill>
+                    </a:ln>
+                  </pic:spPr>
+                </pic:pic>
+              </a:graphicData>
+            </a:graphic>
+          </wp:inline>
+        </w:drawing>
+      </w:r>
+    </w:p>
+    <w:p/>
+    <w:p>
+      <w:pPr>
+        <w:rPr>
+          <w:b/>
+          <w:bCs/>
+          <w:lang w:val="es-ES"/>
+        </w:rPr>
+      </w:pPr>
+      <w:r>
+        <w:t xml:space="preserve">Agregar en Venta-Service en </w:t>
+      </w:r>
+      <w:r>
+        <w:rPr>
+          <w:b/>
+          <w:bCs/>
+          <w:lang w:val="es-ES"/>
+        </w:rPr>
+        <w:t>ProductoClient.java</w:t>
+      </w:r>
+    </w:p>
+    <w:p>
+      <w:r>
+        <w:drawing>
+          <wp:inline distT="0" distB="0" distL="0" distR="0" wp14:anchorId="51823FC9" wp14:editId="0084F20D">
+            <wp:extent cx="5400040" cy="898525"/>
+            <wp:effectExtent l="19050" t="19050" r="10160" b="15875"/>
+            <wp:docPr id="1775248912" name="Imagen 1"/>
+            <wp:cNvGraphicFramePr>
+              <a:graphicFrameLocks xmlns:a="http://schemas.openxmlformats.org/drawingml/2006/main" noChangeAspect="1"/>
+            </wp:cNvGraphicFramePr>
+            <a:graphic xmlns:a="http://schemas.openxmlformats.org/drawingml/2006/main">
+              <a:graphicData uri="http://schemas.openxmlformats.org/drawingml/2006/picture">
+                <pic:pic xmlns:pic="http://schemas.openxmlformats.org/drawingml/2006/picture">
+                  <pic:nvPicPr>
+                    <pic:cNvPr id="1775248912" name=""/>
+                    <pic:cNvPicPr/>
+                  </pic:nvPicPr>
+                  <pic:blipFill>
+                    <a:blip r:embed="rId42"/>
+                    <a:stretch>
+                      <a:fillRect/>
+                    </a:stretch>
+                  </pic:blipFill>
+                  <pic:spPr>
+                    <a:xfrm>
+                      <a:off x="0" y="0"/>
+                      <a:ext cx="5400040" cy="898525"/>
+                    </a:xfrm>
+                    <a:prstGeom prst="rect">
+                      <a:avLst/>
+                    </a:prstGeom>
+                    <a:ln>
+                      <a:solidFill>
+                        <a:schemeClr val="tx1"/>
+                      </a:solidFill>
+                    </a:ln>
+                  </pic:spPr>
+                </pic:pic>
+              </a:graphicData>
+            </a:graphic>
+          </wp:inline>
+        </w:drawing>
+      </w:r>
+    </w:p>
+    <w:p/>
+    <w:p>
+      <w:r>
+        <w:t xml:space="preserve">Agrega en </w:t>
+      </w:r>
+      <w:proofErr w:type="spellStart"/>
+      <w:r>
+        <w:t>VentaServiceImpl</w:t>
+      </w:r>
+      <w:proofErr w:type="spellEnd"/>
+    </w:p>
+    <w:p>
+      <w:r>
+        <w:drawing>
+          <wp:inline distT="0" distB="0" distL="0" distR="0" wp14:anchorId="5E247630" wp14:editId="0418A04F">
+            <wp:extent cx="5400040" cy="986155"/>
+            <wp:effectExtent l="19050" t="19050" r="10160" b="23495"/>
+            <wp:docPr id="12559925" name="Imagen 1"/>
+            <wp:cNvGraphicFramePr>
+              <a:graphicFrameLocks xmlns:a="http://schemas.openxmlformats.org/drawingml/2006/main" noChangeAspect="1"/>
+            </wp:cNvGraphicFramePr>
+            <a:graphic xmlns:a="http://schemas.openxmlformats.org/drawingml/2006/main">
+              <a:graphicData uri="http://schemas.openxmlformats.org/drawingml/2006/picture">
+                <pic:pic xmlns:pic="http://schemas.openxmlformats.org/drawingml/2006/picture">
+                  <pic:nvPicPr>
+                    <pic:cNvPr id="12559925" name=""/>
+                    <pic:cNvPicPr/>
+                  </pic:nvPicPr>
+                  <pic:blipFill>
+                    <a:blip r:embed="rId43"/>
+                    <a:stretch>
+                      <a:fillRect/>
+                    </a:stretch>
+                  </pic:blipFill>
+                  <pic:spPr>
+                    <a:xfrm>
+                      <a:off x="0" y="0"/>
+                      <a:ext cx="5400040" cy="986155"/>
+                    </a:xfrm>
+                    <a:prstGeom prst="rect">
+                      <a:avLst/>
+                    </a:prstGeom>
+                    <a:ln>
+                      <a:solidFill>
+                        <a:schemeClr val="tx1"/>
+                      </a:solidFill>
+                    </a:ln>
+                  </pic:spPr>
+                </pic:pic>
+              </a:graphicData>
+            </a:graphic>
+          </wp:inline>
+        </w:drawing>
+      </w:r>
+    </w:p>
+    <w:p>
+      <w:pPr>
+        <w:jc w:val="left"/>
+      </w:pPr>
+      <w:r>
+        <w:br w:type="page"/>
+      </w:r>
+    </w:p>
+    <w:p>
+      <w:pPr>
+        <w:rPr>
+          <w:b/>
+          <w:bCs/>
+        </w:rPr>
+      </w:pPr>
+      <w:r>
+        <w:lastRenderedPageBreak/>
+        <w:t xml:space="preserve">Modificar </w:t>
+      </w:r>
+      <w:proofErr w:type="spellStart"/>
+      <w:r>
+        <w:rPr>
+          <w:b/>
+          <w:bCs/>
+        </w:rPr>
+        <w:t>DetalleVentaRequestDto</w:t>
+      </w:r>
+      <w:proofErr w:type="spellEnd"/>
+    </w:p>
+    <w:p>
+      <w:pPr>
+        <w:rPr>
+          <w:i/>
+          <w:iCs/>
+        </w:rPr>
+      </w:pPr>
+      <w:r>
+        <w:rPr>
+          <w:b/>
+          <w:bCs/>
+          <w:i/>
+          <w:iCs/>
+        </w:rPr>
+        <w:t xml:space="preserve">Nota: </w:t>
+      </w:r>
+      <w:r>
+        <w:rPr>
+          <w:i/>
+          <w:iCs/>
+        </w:rPr>
+        <w:t xml:space="preserve">Ya no debe recibir precio, porque el precio viene de </w:t>
+      </w:r>
+      <w:r>
+        <w:rPr>
+          <w:b/>
+          <w:bCs/>
+          <w:i/>
+          <w:iCs/>
+        </w:rPr>
+        <w:t>producto-</w:t>
+      </w:r>
+      <w:proofErr w:type="spellStart"/>
+      <w:r>
+        <w:rPr>
+          <w:b/>
+          <w:bCs/>
+          <w:i/>
+          <w:iCs/>
+        </w:rPr>
+        <w:t>service</w:t>
+      </w:r>
+      <w:proofErr w:type="spellEnd"/>
+      <w:r>
+        <w:rPr>
+          <w:i/>
+          <w:iCs/>
+        </w:rPr>
+        <w:t>.</w:t>
+      </w:r>
+    </w:p>
+    <w:p>
+      <w:r>
+        <w:t>Probar que este funcional al crear una venta, debe descontar Stock</w:t>
+      </w:r>
+    </w:p>
+    <w:p>
+      <w:r>
+        <w:t>Consultar cuantos productos hay</w:t>
+      </w:r>
+    </w:p>
+    <w:p>
+      <w:r>
+        <w:drawing>
+          <wp:inline distT="0" distB="0" distL="0" distR="0" wp14:anchorId="6B0F3954" wp14:editId="42173BE9">
+            <wp:extent cx="5400040" cy="2557145"/>
+            <wp:effectExtent l="19050" t="19050" r="10160" b="14605"/>
+            <wp:docPr id="1570206496" name="Imagen 1"/>
+            <wp:cNvGraphicFramePr>
+              <a:graphicFrameLocks xmlns:a="http://schemas.openxmlformats.org/drawingml/2006/main" noChangeAspect="1"/>
+            </wp:cNvGraphicFramePr>
+            <a:graphic xmlns:a="http://schemas.openxmlformats.org/drawingml/2006/main">
+              <a:graphicData uri="http://schemas.openxmlformats.org/drawingml/2006/picture">
+                <pic:pic xmlns:pic="http://schemas.openxmlformats.org/drawingml/2006/picture">
+                  <pic:nvPicPr>
+                    <pic:cNvPr id="1570206496" name=""/>
+                    <pic:cNvPicPr/>
+                  </pic:nvPicPr>
+                  <pic:blipFill>
+                    <a:blip r:embed="rId44"/>
+                    <a:stretch>
+                      <a:fillRect/>
+                    </a:stretch>
+                  </pic:blipFill>
+                  <pic:spPr>
+                    <a:xfrm>
+                      <a:off x="0" y="0"/>
+                      <a:ext cx="5400040" cy="2557145"/>
+                    </a:xfrm>
+                    <a:prstGeom prst="rect">
+                      <a:avLst/>
+                    </a:prstGeom>
+                    <a:ln>
+                      <a:solidFill>
+                        <a:schemeClr val="tx1"/>
+                      </a:solidFill>
+                    </a:ln>
+                  </pic:spPr>
+                </pic:pic>
+              </a:graphicData>
+            </a:graphic>
+          </wp:inline>
+        </w:drawing>
+      </w:r>
+    </w:p>
+    <w:p>
+      <w:r>
+        <w:t>Crear la venta</w:t>
+      </w:r>
+    </w:p>
+    <w:p>
+      <w:r>
+        <w:drawing>
+          <wp:inline distT="0" distB="0" distL="0" distR="0" wp14:anchorId="10621ECE" wp14:editId="1F44916A">
+            <wp:extent cx="5400040" cy="2458720"/>
+            <wp:effectExtent l="19050" t="19050" r="10160" b="17780"/>
+            <wp:docPr id="137776906" name="Imagen 1"/>
+            <wp:cNvGraphicFramePr>
+              <a:graphicFrameLocks xmlns:a="http://schemas.openxmlformats.org/drawingml/2006/main" noChangeAspect="1"/>
+            </wp:cNvGraphicFramePr>
+            <a:graphic xmlns:a="http://schemas.openxmlformats.org/drawingml/2006/main">
+              <a:graphicData uri="http://schemas.openxmlformats.org/drawingml/2006/picture">
+                <pic:pic xmlns:pic="http://schemas.openxmlformats.org/drawingml/2006/picture">
+                  <pic:nvPicPr>
+                    <pic:cNvPr id="137776906" name=""/>
+                    <pic:cNvPicPr/>
+                  </pic:nvPicPr>
+                  <pic:blipFill>
+                    <a:blip r:embed="rId45"/>
+                    <a:stretch>
+                      <a:fillRect/>
+                    </a:stretch>
+                  </pic:blipFill>
+                  <pic:spPr>
+                    <a:xfrm>
+                      <a:off x="0" y="0"/>
+                      <a:ext cx="5400040" cy="2458720"/>
+                    </a:xfrm>
+                    <a:prstGeom prst="rect">
+                      <a:avLst/>
+                    </a:prstGeom>
+                    <a:ln>
+                      <a:solidFill>
+                        <a:schemeClr val="tx1"/>
+                      </a:solidFill>
+                    </a:ln>
+                  </pic:spPr>
+                </pic:pic>
+              </a:graphicData>
+            </a:graphic>
+          </wp:inline>
+        </w:drawing>
+      </w:r>
+    </w:p>
+    <w:p>
+      <w:r>
+        <w:t>Consultar si descontó el stock</w:t>
+      </w:r>
+    </w:p>
+    <w:p>
+      <w:r>
+        <w:lastRenderedPageBreak/>
+        <w:drawing>
+          <wp:inline distT="0" distB="0" distL="0" distR="0" wp14:anchorId="248B5B6A" wp14:editId="113EA510">
+            <wp:extent cx="5400040" cy="2658110"/>
+            <wp:effectExtent l="19050" t="19050" r="10160" b="27940"/>
+            <wp:docPr id="740239928" name="Imagen 1"/>
+            <wp:cNvGraphicFramePr>
+              <a:graphicFrameLocks xmlns:a="http://schemas.openxmlformats.org/drawingml/2006/main" noChangeAspect="1"/>
+            </wp:cNvGraphicFramePr>
+            <a:graphic xmlns:a="http://schemas.openxmlformats.org/drawingml/2006/main">
+              <a:graphicData uri="http://schemas.openxmlformats.org/drawingml/2006/picture">
+                <pic:pic xmlns:pic="http://schemas.openxmlformats.org/drawingml/2006/picture">
+                  <pic:nvPicPr>
+                    <pic:cNvPr id="740239928" name=""/>
+                    <pic:cNvPicPr/>
+                  </pic:nvPicPr>
+                  <pic:blipFill>
+                    <a:blip r:embed="rId46"/>
+                    <a:stretch>
+                      <a:fillRect/>
+                    </a:stretch>
+                  </pic:blipFill>
+                  <pic:spPr>
+                    <a:xfrm>
+                      <a:off x="0" y="0"/>
+                      <a:ext cx="5400040" cy="2658110"/>
+                    </a:xfrm>
+                    <a:prstGeom prst="rect">
+                      <a:avLst/>
+                    </a:prstGeom>
+                    <a:ln>
+                      <a:solidFill>
+                        <a:schemeClr val="tx1"/>
+                      </a:solidFill>
+                    </a:ln>
+                  </pic:spPr>
+                </pic:pic>
+              </a:graphicData>
+            </a:graphic>
+          </wp:inline>
+        </w:drawing>
+      </w:r>
+    </w:p>
+    <w:p>
+      <w:r>
+        <w:t>Si se descontó el stock de los productos.</w:t>
       </w:r>
     </w:p>
     <w:p/>
@@ -2553,7 +3503,7 @@
 </file>
 
 <file path=word/numbering.xml><?xml version="1.0" encoding="utf-8"?>
-<w:numbering xmlns:wpc="http://schemas.microsoft.com/office/word/2010/wordprocessingCanvas" xmlns:cx="http://schemas.microsoft.com/office/drawing/2014/chartex" xmlns:cx1="http://schemas.microsoft.com/office/drawing/2015/9/8/chartex" xmlns:cx2="http://schemas.microsoft.com/office/drawing/2015/10/21/chartex" xmlns:cx3="http://schemas.microsoft.com/office/drawing/2016/5/9/chartex" xmlns:cx4="http://schemas.microsoft.com/office/drawing/2016/5/10/chartex" xmlns:cx5="http://schemas.microsoft.com/office/drawing/2016/5/11/chartex" xmlns:cx6="http://schemas.microsoft.com/office/drawing/2016/5/12/chartex" xmlns:cx7="http://schemas.microsoft.com/office/drawing/2016/5/13/chartex" xmlns:cx8="http://schemas.microsoft.com/office/drawing/2016/5/14/chartex" xmlns:mc="http://schemas.openxmlformats.org/markup-compatibility/2006" xmlns:aink="http://schemas.microsoft.com/office/drawing/2016/ink" xmlns:am3d="http://schemas.microsoft.com/office/drawing/2017/model3d" xmlns:o="urn:schemas-microsoft-com:office:office" xmlns:oel="http://schemas.microsoft.com/office/2019/extlst" xmlns:r="http://schemas.openxmlformats.org/officeDocument/2006/relationships" xmlns:m="http://schemas.openxmlformats.org/officeDocument/2006/math" xmlns:v="urn:schemas-microsoft-com:vml" xmlns:wp14="http://schemas.microsoft.com/office/word/2010/wordprocessingDrawing" xmlns:wp="http://schemas.openxmlformats.org/drawingml/2006/wordprocessingDrawing" xmlns:w10="urn:schemas-microsoft-com:office:word" xmlns:w="http://schemas.openxmlformats.org/wordprocessingml/2006/main" xmlns:w14="http://schemas.microsoft.com/office/word/2010/wordml" xmlns:w15="http://schemas.microsoft.com/office/word/2012/wordml" xmlns:w16cex="http://schemas.microsoft.com/office/word/2018/wordml/cex" xmlns:w16cid="http://schemas.microsoft.com/office/word/2016/wordml/cid" xmlns:w16="http://schemas.microsoft.com/office/word/2018/wordml" xmlns:w16sdtdh="http://schemas.microsoft.com/office/word/2020/wordml/sdtdatahash" xmlns:w16se="http://schemas.microsoft.com/office/word/2015/wordml/symex" xmlns:wpg="http://schemas.microsoft.com/office/word/2010/wordprocessingGroup" xmlns:wpi="http://schemas.microsoft.com/office/word/2010/wordprocessingInk" xmlns:wne="http://schemas.microsoft.com/office/word/2006/wordml" xmlns:wps="http://schemas.microsoft.com/office/word/2010/wordprocessingShape" mc:Ignorable="w14 w15 w16se w16cid w16 w16cex w16sdtdh wp14">
+<w:numbering xmlns:wpc="http://schemas.microsoft.com/office/word/2010/wordprocessingCanvas" xmlns:cx="http://schemas.microsoft.com/office/drawing/2014/chartex" xmlns:cx1="http://schemas.microsoft.com/office/drawing/2015/9/8/chartex" xmlns:cx2="http://schemas.microsoft.com/office/drawing/2015/10/21/chartex" xmlns:cx3="http://schemas.microsoft.com/office/drawing/2016/5/9/chartex" xmlns:cx4="http://schemas.microsoft.com/office/drawing/2016/5/10/chartex" xmlns:cx5="http://schemas.microsoft.com/office/drawing/2016/5/11/chartex" xmlns:cx6="http://schemas.microsoft.com/office/drawing/2016/5/12/chartex" xmlns:cx7="http://schemas.microsoft.com/office/drawing/2016/5/13/chartex" xmlns:cx8="http://schemas.microsoft.com/office/drawing/2016/5/14/chartex" xmlns:mc="http://schemas.openxmlformats.org/markup-compatibility/2006" xmlns:aink="http://schemas.microsoft.com/office/drawing/2016/ink" xmlns:am3d="http://schemas.microsoft.com/office/drawing/2017/model3d" xmlns:o="urn:schemas-microsoft-com:office:office" xmlns:oel="http://schemas.microsoft.com/office/2019/extlst" xmlns:r="http://schemas.openxmlformats.org/officeDocument/2006/relationships" xmlns:m="http://schemas.openxmlformats.org/officeDocument/2006/math" xmlns:v="urn:schemas-microsoft-com:vml" xmlns:wp14="http://schemas.microsoft.com/office/word/2010/wordprocessingDrawing" xmlns:wp="http://schemas.openxmlformats.org/drawingml/2006/wordprocessingDrawing" xmlns:w10="urn:schemas-microsoft-com:office:word" xmlns:w="http://schemas.openxmlformats.org/wordprocessingml/2006/main" xmlns:w14="http://schemas.microsoft.com/office/word/2010/wordml" xmlns:w15="http://schemas.microsoft.com/office/word/2012/wordml" xmlns:w16cex="http://schemas.microsoft.com/office/word/2018/wordml/cex" xmlns:w16cid="http://schemas.microsoft.com/office/word/2016/wordml/cid" xmlns:w16="http://schemas.microsoft.com/office/word/2018/wordml" xmlns:w16du="http://schemas.microsoft.com/office/word/2023/wordml/word16du" xmlns:w16sdtdh="http://schemas.microsoft.com/office/word/2020/wordml/sdtdatahash" xmlns:w16sdtfl="http://schemas.microsoft.com/office/word/2024/wordml/sdtformatlock" xmlns:w16se="http://schemas.microsoft.com/office/word/2015/wordml/symex" xmlns:wpg="http://schemas.microsoft.com/office/word/2010/wordprocessingGroup" xmlns:wpi="http://schemas.microsoft.com/office/word/2010/wordprocessingInk" xmlns:wne="http://schemas.microsoft.com/office/word/2006/wordml" xmlns:wps="http://schemas.microsoft.com/office/word/2010/wordprocessingShape" mc:Ignorable="w14 w15 w16se w16cid w16 w16cex w16sdtdh w16sdtfl w16du wp14">
   <w:abstractNum w:abstractNumId="0" w15:restartNumberingAfterBreak="0">
     <w:nsid w:val="4FF23CF2"/>
     <w:multiLevelType w:val="hybridMultilevel"/>
@@ -2790,7 +3740,7 @@
 </file>
 
 <file path=word/styles.xml><?xml version="1.0" encoding="utf-8"?>
-<w:styles xmlns:mc="http://schemas.openxmlformats.org/markup-compatibility/2006" xmlns:r="http://schemas.openxmlformats.org/officeDocument/2006/relationships" xmlns:w="http://schemas.openxmlformats.org/wordprocessingml/2006/main" xmlns:w14="http://schemas.microsoft.com/office/word/2010/wordml" xmlns:w15="http://schemas.microsoft.com/office/word/2012/wordml" xmlns:w16cex="http://schemas.microsoft.com/office/word/2018/wordml/cex" xmlns:w16cid="http://schemas.microsoft.com/office/word/2016/wordml/cid" xmlns:w16="http://schemas.microsoft.com/office/word/2018/wordml" xmlns:w16sdtdh="http://schemas.microsoft.com/office/word/2020/wordml/sdtdatahash" xmlns:w16se="http://schemas.microsoft.com/office/word/2015/wordml/symex" mc:Ignorable="w14 w15 w16se w16cid w16 w16cex w16sdtdh">
+<w:styles xmlns:mc="http://schemas.openxmlformats.org/markup-compatibility/2006" xmlns:r="http://schemas.openxmlformats.org/officeDocument/2006/relationships" xmlns:w="http://schemas.openxmlformats.org/wordprocessingml/2006/main" xmlns:w14="http://schemas.microsoft.com/office/word/2010/wordml" xmlns:w15="http://schemas.microsoft.com/office/word/2012/wordml" xmlns:w16cex="http://schemas.microsoft.com/office/word/2018/wordml/cex" xmlns:w16cid="http://schemas.microsoft.com/office/word/2016/wordml/cid" xmlns:w16="http://schemas.microsoft.com/office/word/2018/wordml" xmlns:w16du="http://schemas.microsoft.com/office/word/2023/wordml/word16du" xmlns:w16sdtdh="http://schemas.microsoft.com/office/word/2020/wordml/sdtdatahash" xmlns:w16sdtfl="http://schemas.microsoft.com/office/word/2024/wordml/sdtformatlock" xmlns:w16se="http://schemas.microsoft.com/office/word/2015/wordml/symex" mc:Ignorable="w14 w15 w16se w16cid w16 w16cex w16sdtdh w16sdtfl w16du">
   <w:docDefaults>
     <w:rPrDefault>
       <w:rPr>

</xml_diff>

<commit_message>
Se completa el Instructivo 01 con Feign Logger
</commit_message>
<xml_diff>
--- a/docs/Instructivo 01.docx
+++ b/docs/Instructivo 01.docx
@@ -1,6 +1,6 @@
 
 <file path=word/document.xml><?xml version="1.0" encoding="utf-8"?>
-<w:document xmlns:wpc="http://schemas.microsoft.com/office/word/2010/wordprocessingCanvas" xmlns:cx="http://schemas.microsoft.com/office/drawing/2014/chartex" xmlns:cx1="http://schemas.microsoft.com/office/drawing/2015/9/8/chartex" xmlns:cx2="http://schemas.microsoft.com/office/drawing/2015/10/21/chartex" xmlns:cx3="http://schemas.microsoft.com/office/drawing/2016/5/9/chartex" xmlns:cx4="http://schemas.microsoft.com/office/drawing/2016/5/10/chartex" xmlns:cx5="http://schemas.microsoft.com/office/drawing/2016/5/11/chartex" xmlns:cx6="http://schemas.microsoft.com/office/drawing/2016/5/12/chartex" xmlns:cx7="http://schemas.microsoft.com/office/drawing/2016/5/13/chartex" xmlns:cx8="http://schemas.microsoft.com/office/drawing/2016/5/14/chartex" xmlns:mc="http://schemas.openxmlformats.org/markup-compatibility/2006" xmlns:aink="http://schemas.microsoft.com/office/drawing/2016/ink" xmlns:am3d="http://schemas.microsoft.com/office/drawing/2017/model3d" xmlns:o="urn:schemas-microsoft-com:office:office" xmlns:oel="http://schemas.microsoft.com/office/2019/extlst" xmlns:r="http://schemas.openxmlformats.org/officeDocument/2006/relationships" xmlns:m="http://schemas.openxmlformats.org/officeDocument/2006/math" xmlns:v="urn:schemas-microsoft-com:vml" xmlns:wp14="http://schemas.microsoft.com/office/word/2010/wordprocessingDrawing" xmlns:wp="http://schemas.openxmlformats.org/drawingml/2006/wordprocessingDrawing" xmlns:w10="urn:schemas-microsoft-com:office:word" xmlns:w="http://schemas.openxmlformats.org/wordprocessingml/2006/main" xmlns:w14="http://schemas.microsoft.com/office/word/2010/wordml" xmlns:w15="http://schemas.microsoft.com/office/word/2012/wordml" xmlns:w16cex="http://schemas.microsoft.com/office/word/2018/wordml/cex" xmlns:w16cid="http://schemas.microsoft.com/office/word/2016/wordml/cid" xmlns:w16="http://schemas.microsoft.com/office/word/2018/wordml" xmlns:w16du="http://schemas.microsoft.com/office/word/2023/wordml/word16du" xmlns:w16sdtdh="http://schemas.microsoft.com/office/word/2020/wordml/sdtdatahash" xmlns:w16sdtfl="http://schemas.microsoft.com/office/word/2024/wordml/sdtformatlock" xmlns:w16se="http://schemas.microsoft.com/office/word/2015/wordml/symex" xmlns:wpg="http://schemas.microsoft.com/office/word/2010/wordprocessingGroup" xmlns:wpi="http://schemas.microsoft.com/office/word/2010/wordprocessingInk" xmlns:wne="http://schemas.microsoft.com/office/word/2006/wordml" xmlns:wps="http://schemas.microsoft.com/office/word/2010/wordprocessingShape" mc:Ignorable="w14 w15 w16se w16cid w16 w16cex w16sdtdh w16sdtfl w16du wp14">
+<w:document xmlns:wpc="http://schemas.microsoft.com/office/word/2010/wordprocessingCanvas" xmlns:cx="http://schemas.microsoft.com/office/drawing/2014/chartex" xmlns:cx1="http://schemas.microsoft.com/office/drawing/2015/9/8/chartex" xmlns:cx2="http://schemas.microsoft.com/office/drawing/2015/10/21/chartex" xmlns:cx3="http://schemas.microsoft.com/office/drawing/2016/5/9/chartex" xmlns:cx4="http://schemas.microsoft.com/office/drawing/2016/5/10/chartex" xmlns:cx5="http://schemas.microsoft.com/office/drawing/2016/5/11/chartex" xmlns:cx6="http://schemas.microsoft.com/office/drawing/2016/5/12/chartex" xmlns:cx7="http://schemas.microsoft.com/office/drawing/2016/5/13/chartex" xmlns:cx8="http://schemas.microsoft.com/office/drawing/2016/5/14/chartex" xmlns:mc="http://schemas.openxmlformats.org/markup-compatibility/2006" xmlns:aink="http://schemas.microsoft.com/office/drawing/2016/ink" xmlns:am3d="http://schemas.microsoft.com/office/drawing/2017/model3d" xmlns:o="urn:schemas-microsoft-com:office:office" xmlns:oel="http://schemas.microsoft.com/office/2019/extlst" xmlns:r="http://schemas.openxmlformats.org/officeDocument/2006/relationships" xmlns:m="http://schemas.openxmlformats.org/officeDocument/2006/math" xmlns:v="urn:schemas-microsoft-com:vml" xmlns:wp14="http://schemas.microsoft.com/office/word/2010/wordprocessingDrawing" xmlns:wp="http://schemas.openxmlformats.org/drawingml/2006/wordprocessingDrawing" xmlns:w10="urn:schemas-microsoft-com:office:word" xmlns:w="http://schemas.openxmlformats.org/wordprocessingml/2006/main" xmlns:w14="http://schemas.microsoft.com/office/word/2010/wordml" xmlns:w15="http://schemas.microsoft.com/office/word/2012/wordml" xmlns:w16cex="http://schemas.microsoft.com/office/word/2018/wordml/cex" xmlns:w16cid="http://schemas.microsoft.com/office/word/2016/wordml/cid" xmlns:w16="http://schemas.microsoft.com/office/word/2018/wordml" xmlns:w16sdtdh="http://schemas.microsoft.com/office/word/2020/wordml/sdtdatahash" xmlns:w16se="http://schemas.microsoft.com/office/word/2015/wordml/symex" xmlns:wpg="http://schemas.microsoft.com/office/word/2010/wordprocessingGroup" xmlns:wpi="http://schemas.microsoft.com/office/word/2010/wordprocessingInk" xmlns:wne="http://schemas.microsoft.com/office/word/2006/wordml" xmlns:wps="http://schemas.microsoft.com/office/word/2010/wordprocessingShape" mc:Ignorable="w14 w15 w16se w16cid w16 w16cex w16sdtdh wp14">
   <w:body>
     <w:p>
       <w:pPr>
@@ -192,7 +192,6 @@
         <w:lastRenderedPageBreak/>
         <w:t xml:space="preserve">Se configura el </w:t>
       </w:r>
-      <w:proofErr w:type="spellStart"/>
       <w:r>
         <w:rPr>
           <w:b/>
@@ -200,7 +199,6 @@
         </w:rPr>
         <w:t>application.yaml</w:t>
       </w:r>
-      <w:proofErr w:type="spellEnd"/>
     </w:p>
     <w:p>
       <w:r>
@@ -408,7 +406,6 @@
       <w:r>
         <w:t xml:space="preserve">el repositorio </w:t>
       </w:r>
-      <w:proofErr w:type="spellStart"/>
       <w:r>
         <w:rPr>
           <w:b/>
@@ -416,7 +413,6 @@
         </w:rPr>
         <w:t>ClienteRepository</w:t>
       </w:r>
-      <w:proofErr w:type="spellEnd"/>
     </w:p>
     <w:p>
       <w:r>
@@ -473,25 +469,8 @@
         </w:rPr>
       </w:pPr>
       <w:r>
-        <w:t xml:space="preserve">Se crea el </w:t>
-      </w:r>
-      <w:proofErr w:type="spellStart"/>
-      <w:r>
-        <w:t>record</w:t>
-      </w:r>
-      <w:proofErr w:type="spellEnd"/>
-      <w:r>
-        <w:t xml:space="preserve"> </w:t>
-      </w:r>
-      <w:proofErr w:type="spellStart"/>
-      <w:r>
-        <w:t>dto</w:t>
-      </w:r>
-      <w:proofErr w:type="spellEnd"/>
-      <w:r>
-        <w:t xml:space="preserve"> </w:t>
-      </w:r>
-      <w:proofErr w:type="spellStart"/>
+        <w:t xml:space="preserve">Se crea el record dto </w:t>
+      </w:r>
       <w:r>
         <w:rPr>
           <w:b/>
@@ -499,7 +478,6 @@
         </w:rPr>
         <w:t>ClienteRequestDto</w:t>
       </w:r>
-      <w:proofErr w:type="spellEnd"/>
     </w:p>
     <w:p>
       <w:r>
@@ -565,25 +543,8 @@
       </w:pPr>
       <w:r>
         <w:lastRenderedPageBreak/>
-        <w:t xml:space="preserve">Se crea el </w:t>
-      </w:r>
-      <w:proofErr w:type="spellStart"/>
-      <w:r>
-        <w:t>record</w:t>
-      </w:r>
-      <w:proofErr w:type="spellEnd"/>
-      <w:r>
-        <w:t xml:space="preserve"> </w:t>
-      </w:r>
-      <w:proofErr w:type="spellStart"/>
-      <w:r>
-        <w:t>dto</w:t>
-      </w:r>
-      <w:proofErr w:type="spellEnd"/>
-      <w:r>
-        <w:t xml:space="preserve"> </w:t>
-      </w:r>
-      <w:proofErr w:type="spellStart"/>
+        <w:t xml:space="preserve">Se crea el record dto </w:t>
+      </w:r>
       <w:r>
         <w:rPr>
           <w:b/>
@@ -591,7 +552,6 @@
         </w:rPr>
         <w:t>ClienteResponseDto</w:t>
       </w:r>
-      <w:proofErr w:type="spellEnd"/>
     </w:p>
     <w:p>
       <w:r>
@@ -644,7 +604,6 @@
       <w:r>
         <w:t xml:space="preserve">Se crea la interface </w:t>
       </w:r>
-      <w:proofErr w:type="spellStart"/>
       <w:r>
         <w:rPr>
           <w:b/>
@@ -652,7 +611,6 @@
         </w:rPr>
         <w:t>ClienteMapper</w:t>
       </w:r>
-      <w:proofErr w:type="spellEnd"/>
     </w:p>
     <w:p>
       <w:r>
@@ -708,7 +666,6 @@
       <w:r>
         <w:t xml:space="preserve">Se crea la interface de </w:t>
       </w:r>
-      <w:proofErr w:type="spellStart"/>
       <w:r>
         <w:rPr>
           <w:b/>
@@ -716,7 +673,6 @@
         </w:rPr>
         <w:t>ClienteService</w:t>
       </w:r>
-      <w:proofErr w:type="spellEnd"/>
     </w:p>
     <w:p>
       <w:pPr>
@@ -778,17 +734,8 @@
       </w:pPr>
       <w:r>
         <w:lastRenderedPageBreak/>
-        <w:t xml:space="preserve">Se crea la clase de error </w:t>
-      </w:r>
-      <w:proofErr w:type="spellStart"/>
-      <w:r>
-        <w:t>exception</w:t>
-      </w:r>
-      <w:proofErr w:type="spellEnd"/>
-      <w:r>
-        <w:t xml:space="preserve"> </w:t>
-      </w:r>
-      <w:proofErr w:type="spellStart"/>
+        <w:t xml:space="preserve">Se crea la clase de error exception </w:t>
+      </w:r>
       <w:r>
         <w:rPr>
           <w:b/>
@@ -796,7 +743,6 @@
         </w:rPr>
         <w:t>BadRequestException</w:t>
       </w:r>
-      <w:proofErr w:type="spellEnd"/>
     </w:p>
     <w:p>
       <w:pPr>
@@ -863,17 +809,8 @@
         </w:rPr>
       </w:pPr>
       <w:r>
-        <w:t xml:space="preserve">Se crea la clase de error </w:t>
-      </w:r>
-      <w:proofErr w:type="spellStart"/>
-      <w:r>
-        <w:t>exception</w:t>
-      </w:r>
-      <w:proofErr w:type="spellEnd"/>
-      <w:r>
-        <w:t xml:space="preserve"> </w:t>
-      </w:r>
-      <w:proofErr w:type="spellStart"/>
+        <w:t xml:space="preserve">Se crea la clase de error exception </w:t>
+      </w:r>
       <w:r>
         <w:rPr>
           <w:b/>
@@ -881,7 +818,6 @@
         </w:rPr>
         <w:t>ResourceNotFoundException</w:t>
       </w:r>
-      <w:proofErr w:type="spellEnd"/>
     </w:p>
     <w:p>
       <w:pPr>
@@ -964,7 +900,6 @@
         <w:lastRenderedPageBreak/>
         <w:t xml:space="preserve">Se crea la clase de la implementación </w:t>
       </w:r>
-      <w:proofErr w:type="spellStart"/>
       <w:r>
         <w:rPr>
           <w:b/>
@@ -972,7 +907,6 @@
         </w:rPr>
         <w:t>ClienteServiceImpl</w:t>
       </w:r>
-      <w:proofErr w:type="spellEnd"/>
     </w:p>
     <w:p>
       <w:pPr>
@@ -1041,7 +975,6 @@
       <w:r>
         <w:t xml:space="preserve">Se crea la clase del controlador </w:t>
       </w:r>
-      <w:proofErr w:type="spellStart"/>
       <w:r>
         <w:rPr>
           <w:b/>
@@ -1049,7 +982,6 @@
         </w:rPr>
         <w:t>ClienteController</w:t>
       </w:r>
-      <w:proofErr w:type="spellEnd"/>
     </w:p>
     <w:p>
       <w:pPr>
@@ -1116,9 +1048,18 @@
           <w:b/>
           <w:bCs/>
         </w:rPr>
-        <w:t>producto-</w:t>
-      </w:r>
-      <w:proofErr w:type="spellStart"/>
+        <w:t xml:space="preserve">producto-service </w:t>
+      </w:r>
+      <w:r>
+        <w:t xml:space="preserve">y </w:t>
+      </w:r>
+      <w:r>
+        <w:rPr>
+          <w:b/>
+          <w:bCs/>
+        </w:rPr>
+        <w:t>venta-</w:t>
+      </w:r>
       <w:r>
         <w:rPr>
           <w:b/>
@@ -1126,33 +1067,6 @@
         </w:rPr>
         <w:t>service</w:t>
       </w:r>
-      <w:proofErr w:type="spellEnd"/>
-      <w:r>
-        <w:rPr>
-          <w:b/>
-          <w:bCs/>
-        </w:rPr>
-        <w:t xml:space="preserve"> </w:t>
-      </w:r>
-      <w:r>
-        <w:t xml:space="preserve">y </w:t>
-      </w:r>
-      <w:r>
-        <w:rPr>
-          <w:b/>
-          <w:bCs/>
-        </w:rPr>
-        <w:t>venta-</w:t>
-      </w:r>
-      <w:proofErr w:type="spellStart"/>
-      <w:r>
-        <w:rPr>
-          <w:b/>
-          <w:bCs/>
-        </w:rPr>
-        <w:t>service</w:t>
-      </w:r>
-      <w:proofErr w:type="spellEnd"/>
     </w:p>
     <w:p>
       <w:pPr>
@@ -1180,17 +1094,8 @@
           <w:b/>
           <w:bCs/>
         </w:rPr>
-        <w:t>venta-</w:t>
-      </w:r>
-      <w:proofErr w:type="spellStart"/>
-      <w:r>
-        <w:rPr>
-          <w:b/>
-          <w:bCs/>
-        </w:rPr>
-        <w:t>service</w:t>
-      </w:r>
-      <w:proofErr w:type="spellEnd"/>
+        <w:t>venta-service</w:t>
+      </w:r>
       <w:r>
         <w:t xml:space="preserve"> queda así</w:t>
       </w:r>
@@ -1204,13 +1109,8 @@
         </w:numPr>
       </w:pPr>
       <w:r>
-        <w:t xml:space="preserve">Guarda </w:t>
-      </w:r>
-      <w:proofErr w:type="spellStart"/>
-      <w:r>
-        <w:t>clienteId</w:t>
-      </w:r>
-      <w:proofErr w:type="spellEnd"/>
+        <w:t>Guarda clienteId</w:t>
+      </w:r>
     </w:p>
     <w:p>
       <w:pPr>
@@ -1221,13 +1121,8 @@
         </w:numPr>
       </w:pPr>
       <w:r>
-        <w:t xml:space="preserve">Guarda </w:t>
-      </w:r>
-      <w:proofErr w:type="spellStart"/>
-      <w:r>
-        <w:t>productoId</w:t>
-      </w:r>
-      <w:proofErr w:type="spellEnd"/>
+        <w:t>Guarda productoId</w:t>
+      </w:r>
     </w:p>
     <w:p>
       <w:pPr>
@@ -1335,7 +1230,6 @@
       <w:r>
         <w:t xml:space="preserve">Esto necesita comunicación entre microservicios, por ello aplicaremos </w:t>
       </w:r>
-      <w:proofErr w:type="spellStart"/>
       <w:r>
         <w:rPr>
           <w:b/>
@@ -1343,109 +1237,106 @@
         </w:rPr>
         <w:t>Feign</w:t>
       </w:r>
-      <w:proofErr w:type="spellEnd"/>
-      <w:r>
-        <w:t xml:space="preserve"> porque venta-</w:t>
-      </w:r>
-      <w:proofErr w:type="spellStart"/>
-      <w:r>
-        <w:t>service</w:t>
-      </w:r>
-      <w:proofErr w:type="spellEnd"/>
-      <w:r>
-        <w:t xml:space="preserve"> necesita hablar con </w:t>
-      </w:r>
-      <w:r>
-        <w:rPr>
-          <w:b/>
-          <w:bCs/>
-        </w:rPr>
-        <w:t>cliente-</w:t>
-      </w:r>
-      <w:proofErr w:type="spellStart"/>
-      <w:r>
-        <w:rPr>
-          <w:b/>
-          <w:bCs/>
-        </w:rPr>
-        <w:t>service</w:t>
-      </w:r>
-      <w:proofErr w:type="spellEnd"/>
-      <w:r>
-        <w:rPr>
-          <w:b/>
-          <w:bCs/>
+      <w:r>
+        <w:t xml:space="preserve"> porque venta-service necesita hablar con </w:t>
+      </w:r>
+      <w:r>
+        <w:rPr>
+          <w:b/>
+          <w:bCs/>
+        </w:rPr>
+        <w:t xml:space="preserve">cliente-service </w:t>
+      </w:r>
+      <w:r>
+        <w:t xml:space="preserve">y </w:t>
+      </w:r>
+      <w:r>
+        <w:rPr>
+          <w:b/>
+          <w:bCs/>
+        </w:rPr>
+        <w:t>producto-service</w:t>
+      </w:r>
+    </w:p>
+    <w:p/>
+    <w:p>
+      <w:r>
+        <w:t xml:space="preserve">El siguiente paso con </w:t>
+      </w:r>
+      <w:r>
+        <w:rPr>
+          <w:b/>
+          <w:bCs/>
+        </w:rPr>
+        <w:t>Feign</w:t>
+      </w:r>
+      <w:r>
+        <w:t xml:space="preserve"> sería:</w:t>
+      </w:r>
+    </w:p>
+    <w:p>
+      <w:r>
+        <w:rPr>
+          <w:b/>
+          <w:bCs/>
+        </w:rPr>
+        <w:t>venta-service</w:t>
+      </w:r>
+      <w:r>
+        <w:t xml:space="preserve"> -&gt; </w:t>
+      </w:r>
+      <w:r>
+        <w:rPr>
+          <w:b/>
+          <w:bCs/>
+          <w:color w:val="4EA72E" w:themeColor="accent6"/>
+        </w:rPr>
+        <w:t>ClienteClient</w:t>
+      </w:r>
+      <w:r>
+        <w:rPr>
+          <w:color w:val="4EA72E" w:themeColor="accent6"/>
         </w:rPr>
         <w:t xml:space="preserve"> </w:t>
       </w:r>
       <w:r>
-        <w:t xml:space="preserve">y </w:t>
-      </w:r>
-      <w:r>
-        <w:rPr>
-          <w:b/>
-          <w:bCs/>
-        </w:rPr>
-        <w:t>producto-</w:t>
-      </w:r>
-      <w:proofErr w:type="spellStart"/>
-      <w:r>
-        <w:rPr>
-          <w:b/>
-          <w:bCs/>
-        </w:rPr>
-        <w:t>service</w:t>
-      </w:r>
-      <w:proofErr w:type="spellEnd"/>
-    </w:p>
-    <w:p/>
-    <w:p>
-      <w:r>
-        <w:t xml:space="preserve">El siguiente paso con </w:t>
-      </w:r>
-      <w:proofErr w:type="spellStart"/>
-      <w:r>
-        <w:rPr>
-          <w:b/>
-          <w:bCs/>
-        </w:rPr>
-        <w:t>Feign</w:t>
-      </w:r>
-      <w:proofErr w:type="spellEnd"/>
-      <w:r>
-        <w:t xml:space="preserve"> sería:</w:t>
-      </w:r>
-    </w:p>
-    <w:p>
-      <w:r>
-        <w:rPr>
-          <w:b/>
-          <w:bCs/>
-        </w:rPr>
-        <w:t>venta-</w:t>
-      </w:r>
-      <w:proofErr w:type="spellStart"/>
-      <w:r>
-        <w:rPr>
-          <w:b/>
-          <w:bCs/>
-        </w:rPr>
-        <w:t>service</w:t>
-      </w:r>
-      <w:proofErr w:type="spellEnd"/>
+        <w:t xml:space="preserve">-&gt; consulta a </w:t>
+      </w:r>
+      <w:r>
+        <w:rPr>
+          <w:b/>
+          <w:bCs/>
+          <w:color w:val="00B0F0"/>
+        </w:rPr>
+        <w:t>cliente-service</w:t>
+      </w:r>
+    </w:p>
+    <w:p>
+      <w:r>
+        <w:rPr>
+          <w:b/>
+          <w:bCs/>
+        </w:rPr>
+        <w:t>venta-servi</w:t>
+      </w:r>
+      <w:r>
+        <w:rPr>
+          <w:b/>
+          <w:bCs/>
+        </w:rPr>
+        <w:t>ce</w:t>
+      </w:r>
       <w:r>
         <w:t xml:space="preserve"> -&gt; </w:t>
       </w:r>
-      <w:proofErr w:type="spellStart"/>
       <w:r>
         <w:rPr>
           <w:b/>
           <w:bCs/>
           <w:color w:val="4EA72E" w:themeColor="accent6"/>
         </w:rPr>
-        <w:t>ClienteClient</w:t>
-      </w:r>
-      <w:proofErr w:type="spellEnd"/>
+        <w:t>ProductoClient</w:t>
+      </w:r>
       <w:r>
         <w:rPr>
           <w:color w:val="4EA72E" w:themeColor="accent6"/>
@@ -1459,85 +1350,10 @@
         <w:rPr>
           <w:b/>
           <w:bCs/>
-          <w:color w:val="00B0F0"/>
-        </w:rPr>
-        <w:t>cliente-</w:t>
-      </w:r>
-      <w:proofErr w:type="spellStart"/>
-      <w:r>
-        <w:rPr>
-          <w:b/>
-          <w:bCs/>
-          <w:color w:val="00B0F0"/>
-        </w:rPr>
-        <w:t>service</w:t>
-      </w:r>
-      <w:proofErr w:type="spellEnd"/>
-    </w:p>
-    <w:p>
-      <w:r>
-        <w:rPr>
-          <w:b/>
-          <w:bCs/>
-        </w:rPr>
-        <w:t>venta-</w:t>
-      </w:r>
-      <w:proofErr w:type="spellStart"/>
-      <w:r>
-        <w:rPr>
-          <w:b/>
-          <w:bCs/>
-        </w:rPr>
-        <w:t>servi</w:t>
-      </w:r>
-      <w:r>
-        <w:rPr>
-          <w:b/>
-          <w:bCs/>
-        </w:rPr>
-        <w:t>ce</w:t>
-      </w:r>
-      <w:proofErr w:type="spellEnd"/>
-      <w:r>
-        <w:t xml:space="preserve"> -&gt; </w:t>
-      </w:r>
-      <w:proofErr w:type="spellStart"/>
-      <w:r>
-        <w:rPr>
-          <w:b/>
-          <w:bCs/>
-          <w:color w:val="4EA72E" w:themeColor="accent6"/>
-        </w:rPr>
-        <w:t>ProductoClient</w:t>
-      </w:r>
-      <w:proofErr w:type="spellEnd"/>
-      <w:r>
-        <w:rPr>
-          <w:color w:val="4EA72E" w:themeColor="accent6"/>
-        </w:rPr>
-        <w:t xml:space="preserve"> </w:t>
-      </w:r>
-      <w:r>
-        <w:t xml:space="preserve">-&gt; consulta a </w:t>
-      </w:r>
-      <w:r>
-        <w:rPr>
-          <w:b/>
-          <w:bCs/>
           <w:color w:val="E97132" w:themeColor="accent2"/>
         </w:rPr>
-        <w:t>producto-</w:t>
-      </w:r>
-      <w:proofErr w:type="spellStart"/>
-      <w:r>
-        <w:rPr>
-          <w:b/>
-          <w:bCs/>
-          <w:color w:val="E97132" w:themeColor="accent2"/>
-        </w:rPr>
-        <w:t>service</w:t>
-      </w:r>
-      <w:proofErr w:type="spellEnd"/>
+        <w:t>producto-service</w:t>
+      </w:r>
       <w:r>
         <w:rPr>
           <w:color w:val="E97132" w:themeColor="accent2"/>
@@ -1560,7 +1376,6 @@
           <w:szCs w:val="24"/>
         </w:rPr>
       </w:pPr>
-      <w:proofErr w:type="spellStart"/>
       <w:r>
         <w:rPr>
           <w:b/>
@@ -1569,28 +1384,13 @@
           <w:szCs w:val="24"/>
         </w:rPr>
         <w:lastRenderedPageBreak/>
-        <w:t>Feign</w:t>
-      </w:r>
-      <w:proofErr w:type="spellEnd"/>
-      <w:r>
-        <w:rPr>
-          <w:b/>
-          <w:bCs/>
-          <w:sz w:val="24"/>
-          <w:szCs w:val="24"/>
-        </w:rPr>
-        <w:t xml:space="preserve"> Client</w:t>
-      </w:r>
-    </w:p>
-    <w:p>
-      <w:r>
-        <w:t xml:space="preserve">Obtener la dependencia de </w:t>
-      </w:r>
-      <w:proofErr w:type="spellStart"/>
-      <w:r>
-        <w:t>feign</w:t>
-      </w:r>
-      <w:proofErr w:type="spellEnd"/>
+        <w:t>Feign Client</w:t>
+      </w:r>
+    </w:p>
+    <w:p>
+      <w:r>
+        <w:t>Obtener la dependencia de feign</w:t>
+      </w:r>
     </w:p>
     <w:p>
       <w:r>
@@ -1643,7 +1443,6 @@
       <w:r>
         <w:t xml:space="preserve">Agregar en el </w:t>
       </w:r>
-      <w:proofErr w:type="spellStart"/>
       <w:r>
         <w:rPr>
           <w:b/>
@@ -1651,11 +1450,9 @@
         </w:rPr>
         <w:t>properties</w:t>
       </w:r>
-      <w:proofErr w:type="spellEnd"/>
       <w:r>
         <w:t xml:space="preserve">, la dependencia y el </w:t>
       </w:r>
-      <w:proofErr w:type="spellStart"/>
       <w:r>
         <w:rPr>
           <w:b/>
@@ -1663,7 +1460,6 @@
         </w:rPr>
         <w:t>dependencyManagement</w:t>
       </w:r>
-      <w:proofErr w:type="spellEnd"/>
     </w:p>
     <w:p>
       <w:r>
@@ -1736,29 +1532,21 @@
           <w:b/>
           <w:bCs/>
         </w:rPr>
-        <w:t>venta-</w:t>
-      </w:r>
-      <w:proofErr w:type="spellStart"/>
-      <w:r>
-        <w:rPr>
-          <w:b/>
-          <w:bCs/>
-        </w:rPr>
-        <w:t>service</w:t>
-      </w:r>
-      <w:proofErr w:type="spellEnd"/>
-    </w:p>
-    <w:p>
-      <w:pPr>
-        <w:rPr>
-          <w:b/>
-          <w:bCs/>
-        </w:rPr>
-      </w:pPr>
-      <w:r>
-        <w:rPr>
-          <w:b/>
-          <w:bCs/>
+        <w:t>venta-service</w:t>
+      </w:r>
+    </w:p>
+    <w:p>
+      <w:pPr>
+        <w:rPr>
+          <w:b/>
+          <w:bCs/>
+        </w:rPr>
+      </w:pPr>
+      <w:r>
+        <w:rPr>
+          <w:b/>
+          <w:bCs/>
+          <w:noProof/>
         </w:rPr>
         <w:drawing>
           <wp:inline distT="0" distB="0" distL="0" distR="0" wp14:anchorId="4383B5C5" wp14:editId="7206765C">
@@ -1813,6 +1601,7 @@
         <w:rPr>
           <w:b/>
           <w:bCs/>
+          <w:noProof/>
         </w:rPr>
         <w:drawing>
           <wp:inline distT="0" distB="0" distL="0" distR="0" wp14:anchorId="32E1470E" wp14:editId="41D2AEDF">
@@ -1867,6 +1656,7 @@
         <w:rPr>
           <w:b/>
           <w:bCs/>
+          <w:noProof/>
         </w:rPr>
         <w:drawing>
           <wp:inline distT="0" distB="0" distL="0" distR="0" wp14:anchorId="4AAED308" wp14:editId="39827914">
@@ -1921,13 +1711,8 @@
     <w:p>
       <w:r>
         <w:lastRenderedPageBreak/>
-        <w:t xml:space="preserve">Activar </w:t>
-      </w:r>
-      <w:proofErr w:type="spellStart"/>
-      <w:r>
-        <w:t>Feign</w:t>
-      </w:r>
-      <w:proofErr w:type="spellEnd"/>
+        <w:t>Activar Feign</w:t>
+      </w:r>
       <w:r>
         <w:t xml:space="preserve"> en el </w:t>
       </w:r>
@@ -2026,7 +1811,6 @@
       <w:r>
         <w:t xml:space="preserve"> en el </w:t>
       </w:r>
-      <w:proofErr w:type="spellStart"/>
       <w:r>
         <w:rPr>
           <w:b/>
@@ -2034,10 +1818,12 @@
         </w:rPr>
         <w:t>application.yaml</w:t>
       </w:r>
-      <w:proofErr w:type="spellEnd"/>
-    </w:p>
-    <w:p>
-      <w:r>
+    </w:p>
+    <w:p>
+      <w:r>
+        <w:rPr>
+          <w:noProof/>
+        </w:rPr>
         <w:drawing>
           <wp:inline distT="0" distB="0" distL="0" distR="0" wp14:anchorId="385032D9" wp14:editId="3895E61F">
             <wp:extent cx="3077004" cy="1171739"/>
@@ -2087,7 +1873,6 @@
       <w:r>
         <w:t xml:space="preserve">Crear la carpeta </w:t>
       </w:r>
-      <w:proofErr w:type="spellStart"/>
       <w:r>
         <w:rPr>
           <w:b/>
@@ -2095,7 +1880,6 @@
         </w:rPr>
         <w:t>client</w:t>
       </w:r>
-      <w:proofErr w:type="spellEnd"/>
       <w:r>
         <w:t xml:space="preserve"> en </w:t>
       </w:r>
@@ -2107,19 +1891,17 @@
         <w:t>api</w:t>
       </w:r>
       <w:r>
-        <w:t xml:space="preserve"> para crear las interfaces de </w:t>
-      </w:r>
-      <w:proofErr w:type="spellStart"/>
-      <w:r>
-        <w:t>feign</w:t>
-      </w:r>
-      <w:proofErr w:type="spellEnd"/>
+        <w:t xml:space="preserve"> para crear las interfaces de feign</w:t>
+      </w:r>
     </w:p>
     <w:p>
       <w:pPr>
         <w:jc w:val="left"/>
       </w:pPr>
       <w:r>
+        <w:rPr>
+          <w:noProof/>
+        </w:rPr>
         <w:drawing>
           <wp:inline distT="0" distB="0" distL="0" distR="0" wp14:anchorId="2ACACEDE" wp14:editId="0C8E7F3D">
             <wp:extent cx="2962688" cy="1400370"/>
@@ -2175,7 +1957,6 @@
         <w:lastRenderedPageBreak/>
         <w:t xml:space="preserve">Crear la interface </w:t>
       </w:r>
-      <w:proofErr w:type="spellStart"/>
       <w:r>
         <w:rPr>
           <w:b/>
@@ -2183,7 +1964,6 @@
         </w:rPr>
         <w:t>ClienteClient</w:t>
       </w:r>
-      <w:proofErr w:type="spellEnd"/>
     </w:p>
     <w:p>
       <w:r>
@@ -2236,7 +2016,6 @@
       <w:r>
         <w:t xml:space="preserve">Crear la interface </w:t>
       </w:r>
-      <w:proofErr w:type="spellStart"/>
       <w:r>
         <w:rPr>
           <w:b/>
@@ -2244,7 +2023,6 @@
         </w:rPr>
         <w:t>ProductoClient</w:t>
       </w:r>
-      <w:proofErr w:type="spellEnd"/>
     </w:p>
     <w:p>
       <w:r>
@@ -2310,25 +2088,8 @@
       </w:pPr>
       <w:r>
         <w:lastRenderedPageBreak/>
-        <w:t xml:space="preserve">Crear los </w:t>
-      </w:r>
-      <w:proofErr w:type="spellStart"/>
-      <w:r>
-        <w:t>record</w:t>
-      </w:r>
-      <w:proofErr w:type="spellEnd"/>
-      <w:r>
-        <w:t xml:space="preserve"> </w:t>
-      </w:r>
-      <w:proofErr w:type="spellStart"/>
-      <w:r>
-        <w:t>dto</w:t>
-      </w:r>
-      <w:proofErr w:type="spellEnd"/>
-      <w:r>
-        <w:t xml:space="preserve"> de </w:t>
-      </w:r>
-      <w:proofErr w:type="spellStart"/>
+        <w:t xml:space="preserve">Crear los record dto de </w:t>
+      </w:r>
       <w:r>
         <w:rPr>
           <w:b/>
@@ -2336,7 +2097,6 @@
         </w:rPr>
         <w:t>ClienteResponseDto</w:t>
       </w:r>
-      <w:proofErr w:type="spellEnd"/>
     </w:p>
     <w:p>
       <w:r>
@@ -2393,25 +2153,8 @@
         </w:rPr>
       </w:pPr>
       <w:r>
-        <w:t xml:space="preserve">Crear el </w:t>
-      </w:r>
-      <w:proofErr w:type="spellStart"/>
-      <w:r>
-        <w:t>record</w:t>
-      </w:r>
-      <w:proofErr w:type="spellEnd"/>
-      <w:r>
-        <w:t xml:space="preserve"> </w:t>
-      </w:r>
-      <w:proofErr w:type="spellStart"/>
-      <w:r>
-        <w:t>dto</w:t>
-      </w:r>
-      <w:proofErr w:type="spellEnd"/>
-      <w:r>
-        <w:t xml:space="preserve"> de </w:t>
-      </w:r>
-      <w:proofErr w:type="spellStart"/>
+        <w:t xml:space="preserve">Crear el record dto de </w:t>
+      </w:r>
       <w:r>
         <w:rPr>
           <w:b/>
@@ -2419,7 +2162,6 @@
         </w:rPr>
         <w:t>ProductoResponseDto</w:t>
       </w:r>
-      <w:proofErr w:type="spellEnd"/>
     </w:p>
     <w:p>
       <w:r>
@@ -2486,21 +2228,11 @@
           <w:b/>
           <w:bCs/>
         </w:rPr>
-        <w:t>cliente-</w:t>
-      </w:r>
-      <w:proofErr w:type="spellStart"/>
-      <w:r>
-        <w:rPr>
-          <w:b/>
-          <w:bCs/>
-        </w:rPr>
-        <w:t>service</w:t>
-      </w:r>
-      <w:proofErr w:type="spellEnd"/>
+        <w:t>cliente-service</w:t>
+      </w:r>
       <w:r>
         <w:t xml:space="preserve"> se realiza la modificación en el </w:t>
       </w:r>
-      <w:proofErr w:type="spellStart"/>
       <w:r>
         <w:rPr>
           <w:b/>
@@ -2508,10 +2240,12 @@
         </w:rPr>
         <w:t>VentaServiceImpl</w:t>
       </w:r>
-      <w:proofErr w:type="spellEnd"/>
-    </w:p>
-    <w:p>
-      <w:r>
+    </w:p>
+    <w:p>
+      <w:r>
+        <w:rPr>
+          <w:noProof/>
+        </w:rPr>
         <w:drawing>
           <wp:inline distT="0" distB="0" distL="0" distR="0" wp14:anchorId="24B97A3A" wp14:editId="7EF1FD26">
             <wp:extent cx="5287113" cy="1286054"/>
@@ -2556,6 +2290,9 @@
     </w:p>
     <w:p>
       <w:r>
+        <w:rPr>
+          <w:noProof/>
+        </w:rPr>
         <w:drawing>
           <wp:inline distT="0" distB="0" distL="0" distR="0" wp14:anchorId="48AB2109" wp14:editId="14C72E2A">
             <wp:extent cx="5400040" cy="1762760"/>
@@ -2600,6 +2337,9 @@
     </w:p>
     <w:p>
       <w:r>
+        <w:rPr>
+          <w:noProof/>
+        </w:rPr>
         <w:drawing>
           <wp:inline distT="0" distB="0" distL="0" distR="0" wp14:anchorId="2201A0CA" wp14:editId="4CAFE420">
             <wp:extent cx="5400040" cy="1236345"/>
@@ -2644,6 +2384,9 @@
     </w:p>
     <w:p>
       <w:r>
+        <w:rPr>
+          <w:noProof/>
+        </w:rPr>
         <w:drawing>
           <wp:inline distT="0" distB="0" distL="0" distR="0" wp14:anchorId="357F95B3" wp14:editId="7EE1FB33">
             <wp:extent cx="5400040" cy="1113155"/>
@@ -2688,13 +2431,8 @@
     </w:p>
     <w:p>
       <w:r>
-        <w:t>Hasta aquí se harán llamadas HTTP de tipo GET a cliente-</w:t>
-      </w:r>
-      <w:proofErr w:type="spellStart"/>
-      <w:r>
-        <w:t>service</w:t>
-      </w:r>
-      <w:proofErr w:type="spellEnd"/>
+        <w:t>Hasta aquí se harán llamadas HTTP de tipo GET a cliente-service</w:t>
+      </w:r>
     </w:p>
     <w:p>
       <w:pPr>
@@ -2707,15 +2445,7 @@
     <w:p>
       <w:r>
         <w:lastRenderedPageBreak/>
-        <w:t>Ahora se quiere realizar el descuento de stock con producto-</w:t>
-      </w:r>
-      <w:proofErr w:type="spellStart"/>
-      <w:r>
-        <w:t>service</w:t>
-      </w:r>
-      <w:proofErr w:type="spellEnd"/>
-      <w:r>
-        <w:t xml:space="preserve"> para ellos implementaremos un método HTTP de tipo </w:t>
+        <w:t xml:space="preserve">Ahora se quiere realizar el descuento de stock con producto-service para ellos implementaremos un método HTTP de tipo </w:t>
       </w:r>
       <w:r>
         <w:rPr>
@@ -2734,44 +2464,11 @@
           <w:b/>
           <w:bCs/>
         </w:rPr>
-        <w:t>producto-</w:t>
-      </w:r>
-      <w:proofErr w:type="spellStart"/>
-      <w:r>
-        <w:rPr>
-          <w:b/>
-          <w:bCs/>
-        </w:rPr>
-        <w:t>service</w:t>
-      </w:r>
-      <w:proofErr w:type="spellEnd"/>
-      <w:r>
-        <w:rPr>
-          <w:b/>
-          <w:bCs/>
-        </w:rPr>
-        <w:t xml:space="preserve"> </w:t>
-      </w:r>
-      <w:r>
-        <w:t xml:space="preserve">agregamos el </w:t>
-      </w:r>
-      <w:proofErr w:type="spellStart"/>
-      <w:r>
-        <w:t>record</w:t>
-      </w:r>
-      <w:proofErr w:type="spellEnd"/>
-      <w:r>
-        <w:t xml:space="preserve"> </w:t>
-      </w:r>
-      <w:proofErr w:type="spellStart"/>
-      <w:r>
-        <w:t>dto</w:t>
-      </w:r>
-      <w:proofErr w:type="spellEnd"/>
-      <w:r>
-        <w:t xml:space="preserve"> </w:t>
-      </w:r>
-      <w:proofErr w:type="spellStart"/>
+        <w:t xml:space="preserve">producto-service </w:t>
+      </w:r>
+      <w:r>
+        <w:t xml:space="preserve">agregamos el record dto </w:t>
+      </w:r>
       <w:r>
         <w:rPr>
           <w:b/>
@@ -2779,10 +2476,12 @@
         </w:rPr>
         <w:t>StockRequestDto</w:t>
       </w:r>
-      <w:proofErr w:type="spellEnd"/>
-    </w:p>
-    <w:p>
-      <w:r>
+    </w:p>
+    <w:p>
+      <w:r>
+        <w:rPr>
+          <w:noProof/>
+        </w:rPr>
         <w:drawing>
           <wp:inline distT="0" distB="0" distL="0" distR="0" wp14:anchorId="741CA43B" wp14:editId="3D1AA497">
             <wp:extent cx="2138632" cy="1341577"/>
@@ -2827,6 +2526,9 @@
     </w:p>
     <w:p>
       <w:r>
+        <w:rPr>
+          <w:noProof/>
+        </w:rPr>
         <w:drawing>
           <wp:inline distT="0" distB="0" distL="0" distR="0" wp14:anchorId="2A45E801" wp14:editId="474C8948">
             <wp:extent cx="4677308" cy="2132949"/>
@@ -2873,7 +2575,6 @@
       <w:r>
         <w:t xml:space="preserve">Agregar el método </w:t>
       </w:r>
-      <w:proofErr w:type="spellStart"/>
       <w:r>
         <w:rPr>
           <w:b/>
@@ -2881,11 +2582,9 @@
         </w:rPr>
         <w:t>descontarStock</w:t>
       </w:r>
-      <w:proofErr w:type="spellEnd"/>
       <w:r>
         <w:t xml:space="preserve"> en el </w:t>
       </w:r>
-      <w:proofErr w:type="spellStart"/>
       <w:r>
         <w:rPr>
           <w:b/>
@@ -2893,10 +2592,12 @@
         </w:rPr>
         <w:t>ProductService</w:t>
       </w:r>
-      <w:proofErr w:type="spellEnd"/>
-    </w:p>
-    <w:p>
-      <w:r>
+    </w:p>
+    <w:p>
+      <w:r>
+        <w:rPr>
+          <w:noProof/>
+        </w:rPr>
         <w:drawing>
           <wp:inline distT="0" distB="0" distL="0" distR="0" wp14:anchorId="0C0AD9AF" wp14:editId="458046A0">
             <wp:extent cx="4487113" cy="3262444"/>
@@ -2952,7 +2653,6 @@
         <w:lastRenderedPageBreak/>
         <w:t xml:space="preserve">Agregar la implementación al </w:t>
       </w:r>
-      <w:proofErr w:type="spellStart"/>
       <w:r>
         <w:rPr>
           <w:b/>
@@ -2960,10 +2660,12 @@
         </w:rPr>
         <w:t>ProductoServiceImpl</w:t>
       </w:r>
-      <w:proofErr w:type="spellEnd"/>
-    </w:p>
-    <w:p>
-      <w:r>
+    </w:p>
+    <w:p>
+      <w:r>
+        <w:rPr>
+          <w:noProof/>
+        </w:rPr>
         <w:drawing>
           <wp:inline distT="0" distB="0" distL="0" distR="0" wp14:anchorId="3C814DD5" wp14:editId="0D24F00F">
             <wp:extent cx="5400040" cy="5245100"/>
@@ -3010,7 +2712,6 @@
       <w:r>
         <w:t xml:space="preserve">Agregar al </w:t>
       </w:r>
-      <w:proofErr w:type="spellStart"/>
       <w:r>
         <w:rPr>
           <w:b/>
@@ -3018,10 +2719,12 @@
         </w:rPr>
         <w:t>Controller</w:t>
       </w:r>
-      <w:proofErr w:type="spellEnd"/>
-    </w:p>
-    <w:p>
-      <w:r>
+    </w:p>
+    <w:p>
+      <w:r>
+        <w:rPr>
+          <w:noProof/>
+        </w:rPr>
         <w:drawing>
           <wp:inline distT="0" distB="0" distL="0" distR="0" wp14:anchorId="4D825CE5" wp14:editId="1A661B9C">
             <wp:extent cx="5353797" cy="1962424"/>
@@ -3076,14 +2779,9 @@
       <w:pPr>
         <w:jc w:val="left"/>
       </w:pPr>
-      <w:proofErr w:type="spellStart"/>
       <w:r>
         <w:lastRenderedPageBreak/>
-        <w:t>Endpoint</w:t>
-      </w:r>
-      <w:proofErr w:type="spellEnd"/>
-      <w:r>
-        <w:t xml:space="preserve">: </w:t>
+        <w:t xml:space="preserve">Endpoint: </w:t>
       </w:r>
       <w:r>
         <w:t>PUT http://localhost:8082/api/v1/productos/1/descontar-stock</w:t>
@@ -3091,6 +2789,9 @@
     </w:p>
     <w:p>
       <w:r>
+        <w:rPr>
+          <w:noProof/>
+        </w:rPr>
         <w:drawing>
           <wp:inline distT="0" distB="0" distL="0" distR="0" wp14:anchorId="646F7AAE" wp14:editId="2F1C3CE6">
             <wp:extent cx="5400040" cy="1043305"/>
@@ -3156,6 +2857,9 @@
     </w:p>
     <w:p>
       <w:r>
+        <w:rPr>
+          <w:noProof/>
+        </w:rPr>
         <w:drawing>
           <wp:inline distT="0" distB="0" distL="0" distR="0" wp14:anchorId="51823FC9" wp14:editId="0084F20D">
             <wp:extent cx="5400040" cy="898525"/>
@@ -3203,14 +2907,15 @@
       <w:r>
         <w:t xml:space="preserve">Agrega en </w:t>
       </w:r>
-      <w:proofErr w:type="spellStart"/>
       <w:r>
         <w:t>VentaServiceImpl</w:t>
       </w:r>
-      <w:proofErr w:type="spellEnd"/>
-    </w:p>
-    <w:p>
-      <w:r>
+    </w:p>
+    <w:p>
+      <w:r>
+        <w:rPr>
+          <w:noProof/>
+        </w:rPr>
         <w:drawing>
           <wp:inline distT="0" distB="0" distL="0" distR="0" wp14:anchorId="5E247630" wp14:editId="0418A04F">
             <wp:extent cx="5400040" cy="986155"/>
@@ -3272,7 +2977,6 @@
         <w:lastRenderedPageBreak/>
         <w:t xml:space="preserve">Modificar </w:t>
       </w:r>
-      <w:proofErr w:type="spellStart"/>
       <w:r>
         <w:rPr>
           <w:b/>
@@ -3280,7 +2984,6 @@
         </w:rPr>
         <w:t>DetalleVentaRequestDto</w:t>
       </w:r>
-      <w:proofErr w:type="spellEnd"/>
     </w:p>
     <w:p>
       <w:pPr>
@@ -3312,24 +3015,13 @@
           <w:i/>
           <w:iCs/>
         </w:rPr>
-        <w:t>producto-</w:t>
-      </w:r>
-      <w:proofErr w:type="spellStart"/>
-      <w:r>
-        <w:rPr>
-          <w:b/>
-          <w:bCs/>
+        <w:t>producto-service</w:t>
+      </w:r>
+      <w:r>
+        <w:rPr>
           <w:i/>
           <w:iCs/>
         </w:rPr>
-        <w:t>service</w:t>
-      </w:r>
-      <w:proofErr w:type="spellEnd"/>
-      <w:r>
-        <w:rPr>
-          <w:i/>
-          <w:iCs/>
-        </w:rPr>
         <w:t>.</w:t>
       </w:r>
     </w:p>
@@ -3345,6 +3037,9 @@
     </w:p>
     <w:p>
       <w:r>
+        <w:rPr>
+          <w:noProof/>
+        </w:rPr>
         <w:drawing>
           <wp:inline distT="0" distB="0" distL="0" distR="0" wp14:anchorId="6B0F3954" wp14:editId="42173BE9">
             <wp:extent cx="5400040" cy="2557145"/>
@@ -3394,6 +3089,9 @@
     </w:p>
     <w:p>
       <w:r>
+        <w:rPr>
+          <w:noProof/>
+        </w:rPr>
         <w:drawing>
           <wp:inline distT="0" distB="0" distL="0" distR="0" wp14:anchorId="10621ECE" wp14:editId="1F44916A">
             <wp:extent cx="5400040" cy="2458720"/>
@@ -3443,6 +3141,9 @@
     </w:p>
     <w:p>
       <w:r>
+        <w:rPr>
+          <w:noProof/>
+        </w:rPr>
         <w:lastRenderedPageBreak/>
         <w:drawing>
           <wp:inline distT="0" distB="0" distL="0" distR="0" wp14:anchorId="248B5B6A" wp14:editId="113EA510">
@@ -3491,7 +3192,848 @@
         <w:t>Si se descontó el stock de los productos.</w:t>
       </w:r>
     </w:p>
-    <w:p/>
+    <w:p>
+      <w:pPr>
+        <w:pStyle w:val="Ttulo1"/>
+      </w:pPr>
+      <w:r>
+        <w:br w:type="column"/>
+      </w:r>
+      <w:r>
+        <w:lastRenderedPageBreak/>
+        <w:t>Feign Logger</w:t>
+      </w:r>
+    </w:p>
+    <w:p>
+      <w:r>
+        <w:t>Para aplicar logs y ver los eventos de la aplicación utilizando feign debemos hacer la siguiente configuración</w:t>
+      </w:r>
+      <w:r>
+        <w:t xml:space="preserve"> del logger</w:t>
+      </w:r>
+    </w:p>
+    <w:p>
+      <w:r>
+        <w:t xml:space="preserve">Agregar la siguiente dependencia en </w:t>
+      </w:r>
+      <w:r>
+        <w:rPr>
+          <w:b/>
+          <w:bCs/>
+        </w:rPr>
+        <w:t>venta-service</w:t>
+      </w:r>
+    </w:p>
+    <w:p>
+      <w:r>
+        <w:rPr>
+          <w:noProof/>
+        </w:rPr>
+        <w:drawing>
+          <wp:inline distT="0" distB="0" distL="0" distR="0" wp14:anchorId="4C08C00C" wp14:editId="1D53C35B">
+            <wp:extent cx="5400040" cy="2541270"/>
+            <wp:effectExtent l="19050" t="19050" r="10160" b="11430"/>
+            <wp:docPr id="4" name="Imagen 4"/>
+            <wp:cNvGraphicFramePr>
+              <a:graphicFrameLocks xmlns:a="http://schemas.openxmlformats.org/drawingml/2006/main" noChangeAspect="1"/>
+            </wp:cNvGraphicFramePr>
+            <a:graphic xmlns:a="http://schemas.openxmlformats.org/drawingml/2006/main">
+              <a:graphicData uri="http://schemas.openxmlformats.org/drawingml/2006/picture">
+                <pic:pic xmlns:pic="http://schemas.openxmlformats.org/drawingml/2006/picture">
+                  <pic:nvPicPr>
+                    <pic:cNvPr id="1" name=""/>
+                    <pic:cNvPicPr/>
+                  </pic:nvPicPr>
+                  <pic:blipFill>
+                    <a:blip r:embed="rId47"/>
+                    <a:stretch>
+                      <a:fillRect/>
+                    </a:stretch>
+                  </pic:blipFill>
+                  <pic:spPr>
+                    <a:xfrm>
+                      <a:off x="0" y="0"/>
+                      <a:ext cx="5400040" cy="2541270"/>
+                    </a:xfrm>
+                    <a:prstGeom prst="rect">
+                      <a:avLst/>
+                    </a:prstGeom>
+                    <a:ln>
+                      <a:solidFill>
+                        <a:schemeClr val="tx1"/>
+                      </a:solidFill>
+                    </a:ln>
+                  </pic:spPr>
+                </pic:pic>
+              </a:graphicData>
+            </a:graphic>
+          </wp:inline>
+        </w:drawing>
+      </w:r>
+    </w:p>
+    <w:p>
+      <w:r>
+        <w:rPr>
+          <w:noProof/>
+        </w:rPr>
+        <w:drawing>
+          <wp:inline distT="0" distB="0" distL="0" distR="0" wp14:anchorId="1A32FE09" wp14:editId="7D088D11">
+            <wp:extent cx="5006178" cy="1830222"/>
+            <wp:effectExtent l="19050" t="19050" r="23495" b="17780"/>
+            <wp:docPr id="12" name="Imagen 12"/>
+            <wp:cNvGraphicFramePr>
+              <a:graphicFrameLocks xmlns:a="http://schemas.openxmlformats.org/drawingml/2006/main" noChangeAspect="1"/>
+            </wp:cNvGraphicFramePr>
+            <a:graphic xmlns:a="http://schemas.openxmlformats.org/drawingml/2006/main">
+              <a:graphicData uri="http://schemas.openxmlformats.org/drawingml/2006/picture">
+                <pic:pic xmlns:pic="http://schemas.openxmlformats.org/drawingml/2006/picture">
+                  <pic:nvPicPr>
+                    <pic:cNvPr id="1" name=""/>
+                    <pic:cNvPicPr/>
+                  </pic:nvPicPr>
+                  <pic:blipFill>
+                    <a:blip r:embed="rId48"/>
+                    <a:stretch>
+                      <a:fillRect/>
+                    </a:stretch>
+                  </pic:blipFill>
+                  <pic:spPr>
+                    <a:xfrm>
+                      <a:off x="0" y="0"/>
+                      <a:ext cx="5019462" cy="1835079"/>
+                    </a:xfrm>
+                    <a:prstGeom prst="rect">
+                      <a:avLst/>
+                    </a:prstGeom>
+                    <a:ln>
+                      <a:solidFill>
+                        <a:schemeClr val="tx1"/>
+                      </a:solidFill>
+                    </a:ln>
+                  </pic:spPr>
+                </pic:pic>
+              </a:graphicData>
+            </a:graphic>
+          </wp:inline>
+        </w:drawing>
+      </w:r>
+    </w:p>
+    <w:p>
+      <w:r>
+        <w:rPr>
+          <w:noProof/>
+        </w:rPr>
+        <w:drawing>
+          <wp:inline distT="0" distB="0" distL="0" distR="0" wp14:anchorId="01AAB207" wp14:editId="703767B2">
+            <wp:extent cx="4962383" cy="1065535"/>
+            <wp:effectExtent l="19050" t="19050" r="10160" b="20320"/>
+            <wp:docPr id="13" name="Imagen 13"/>
+            <wp:cNvGraphicFramePr>
+              <a:graphicFrameLocks xmlns:a="http://schemas.openxmlformats.org/drawingml/2006/main" noChangeAspect="1"/>
+            </wp:cNvGraphicFramePr>
+            <a:graphic xmlns:a="http://schemas.openxmlformats.org/drawingml/2006/main">
+              <a:graphicData uri="http://schemas.openxmlformats.org/drawingml/2006/picture">
+                <pic:pic xmlns:pic="http://schemas.openxmlformats.org/drawingml/2006/picture">
+                  <pic:nvPicPr>
+                    <pic:cNvPr id="1" name=""/>
+                    <pic:cNvPicPr/>
+                  </pic:nvPicPr>
+                  <pic:blipFill>
+                    <a:blip r:embed="rId49"/>
+                    <a:stretch>
+                      <a:fillRect/>
+                    </a:stretch>
+                  </pic:blipFill>
+                  <pic:spPr>
+                    <a:xfrm>
+                      <a:off x="0" y="0"/>
+                      <a:ext cx="4974013" cy="1068032"/>
+                    </a:xfrm>
+                    <a:prstGeom prst="rect">
+                      <a:avLst/>
+                    </a:prstGeom>
+                    <a:ln>
+                      <a:solidFill>
+                        <a:schemeClr val="tx1"/>
+                      </a:solidFill>
+                    </a:ln>
+                  </pic:spPr>
+                </pic:pic>
+              </a:graphicData>
+            </a:graphic>
+          </wp:inline>
+        </w:drawing>
+      </w:r>
+    </w:p>
+    <w:p>
+      <w:pPr>
+        <w:rPr>
+          <w:b/>
+          <w:bCs/>
+        </w:rPr>
+      </w:pPr>
+      <w:r>
+        <w:t xml:space="preserve">Configurar Feign creando la clase </w:t>
+      </w:r>
+      <w:r>
+        <w:rPr>
+          <w:b/>
+          <w:bCs/>
+        </w:rPr>
+        <w:t>FeignConfig</w:t>
+      </w:r>
+    </w:p>
+    <w:p>
+      <w:r>
+        <w:rPr>
+          <w:noProof/>
+        </w:rPr>
+        <w:drawing>
+          <wp:inline distT="0" distB="0" distL="0" distR="0" wp14:anchorId="45352568" wp14:editId="57B43C1E">
+            <wp:extent cx="2458019" cy="964239"/>
+            <wp:effectExtent l="19050" t="19050" r="19050" b="26670"/>
+            <wp:docPr id="20" name="Imagen 20"/>
+            <wp:cNvGraphicFramePr>
+              <a:graphicFrameLocks xmlns:a="http://schemas.openxmlformats.org/drawingml/2006/main" noChangeAspect="1"/>
+            </wp:cNvGraphicFramePr>
+            <a:graphic xmlns:a="http://schemas.openxmlformats.org/drawingml/2006/main">
+              <a:graphicData uri="http://schemas.openxmlformats.org/drawingml/2006/picture">
+                <pic:pic xmlns:pic="http://schemas.openxmlformats.org/drawingml/2006/picture">
+                  <pic:nvPicPr>
+                    <pic:cNvPr id="1" name=""/>
+                    <pic:cNvPicPr/>
+                  </pic:nvPicPr>
+                  <pic:blipFill>
+                    <a:blip r:embed="rId50"/>
+                    <a:stretch>
+                      <a:fillRect/>
+                    </a:stretch>
+                  </pic:blipFill>
+                  <pic:spPr>
+                    <a:xfrm>
+                      <a:off x="0" y="0"/>
+                      <a:ext cx="2477797" cy="971997"/>
+                    </a:xfrm>
+                    <a:prstGeom prst="rect">
+                      <a:avLst/>
+                    </a:prstGeom>
+                    <a:ln>
+                      <a:solidFill>
+                        <a:schemeClr val="tx1"/>
+                      </a:solidFill>
+                    </a:ln>
+                  </pic:spPr>
+                </pic:pic>
+              </a:graphicData>
+            </a:graphic>
+          </wp:inline>
+        </w:drawing>
+      </w:r>
+    </w:p>
+    <w:p>
+      <w:pPr>
+        <w:jc w:val="left"/>
+      </w:pPr>
+      <w:r>
+        <w:br w:type="page"/>
+      </w:r>
+    </w:p>
+    <w:p>
+      <w:r>
+        <w:rPr>
+          <w:noProof/>
+        </w:rPr>
+        <w:lastRenderedPageBreak/>
+        <w:drawing>
+          <wp:inline distT="0" distB="0" distL="0" distR="0" wp14:anchorId="5EF5FC7B" wp14:editId="4640F7EC">
+            <wp:extent cx="4284587" cy="2874276"/>
+            <wp:effectExtent l="19050" t="19050" r="20955" b="21590"/>
+            <wp:docPr id="23" name="Imagen 23"/>
+            <wp:cNvGraphicFramePr>
+              <a:graphicFrameLocks xmlns:a="http://schemas.openxmlformats.org/drawingml/2006/main" noChangeAspect="1"/>
+            </wp:cNvGraphicFramePr>
+            <a:graphic xmlns:a="http://schemas.openxmlformats.org/drawingml/2006/main">
+              <a:graphicData uri="http://schemas.openxmlformats.org/drawingml/2006/picture">
+                <pic:pic xmlns:pic="http://schemas.openxmlformats.org/drawingml/2006/picture">
+                  <pic:nvPicPr>
+                    <pic:cNvPr id="1" name=""/>
+                    <pic:cNvPicPr/>
+                  </pic:nvPicPr>
+                  <pic:blipFill>
+                    <a:blip r:embed="rId51"/>
+                    <a:stretch>
+                      <a:fillRect/>
+                    </a:stretch>
+                  </pic:blipFill>
+                  <pic:spPr>
+                    <a:xfrm>
+                      <a:off x="0" y="0"/>
+                      <a:ext cx="4290412" cy="2878183"/>
+                    </a:xfrm>
+                    <a:prstGeom prst="rect">
+                      <a:avLst/>
+                    </a:prstGeom>
+                    <a:ln>
+                      <a:solidFill>
+                        <a:schemeClr val="tx1"/>
+                      </a:solidFill>
+                    </a:ln>
+                  </pic:spPr>
+                </pic:pic>
+              </a:graphicData>
+            </a:graphic>
+          </wp:inline>
+        </w:drawing>
+      </w:r>
+    </w:p>
+    <w:p>
+      <w:r>
+        <w:t xml:space="preserve">Usar </w:t>
+      </w:r>
+      <w:r>
+        <w:rPr>
+          <w:b/>
+          <w:bCs/>
+        </w:rPr>
+        <w:t>config</w:t>
+      </w:r>
+      <w:r>
+        <w:t xml:space="preserve"> en los </w:t>
+      </w:r>
+      <w:r>
+        <w:rPr>
+          <w:b/>
+          <w:bCs/>
+        </w:rPr>
+        <w:t>clients</w:t>
+      </w:r>
+    </w:p>
+    <w:p>
+      <w:r>
+        <w:rPr>
+          <w:noProof/>
+        </w:rPr>
+        <w:drawing>
+          <wp:inline distT="0" distB="0" distL="0" distR="0" wp14:anchorId="105DDF7F" wp14:editId="2EC05DBB">
+            <wp:extent cx="3382273" cy="2089529"/>
+            <wp:effectExtent l="19050" t="19050" r="27940" b="25400"/>
+            <wp:docPr id="30" name="Imagen 30"/>
+            <wp:cNvGraphicFramePr>
+              <a:graphicFrameLocks xmlns:a="http://schemas.openxmlformats.org/drawingml/2006/main" noChangeAspect="1"/>
+            </wp:cNvGraphicFramePr>
+            <a:graphic xmlns:a="http://schemas.openxmlformats.org/drawingml/2006/main">
+              <a:graphicData uri="http://schemas.openxmlformats.org/drawingml/2006/picture">
+                <pic:pic xmlns:pic="http://schemas.openxmlformats.org/drawingml/2006/picture">
+                  <pic:nvPicPr>
+                    <pic:cNvPr id="1" name=""/>
+                    <pic:cNvPicPr/>
+                  </pic:nvPicPr>
+                  <pic:blipFill>
+                    <a:blip r:embed="rId52"/>
+                    <a:stretch>
+                      <a:fillRect/>
+                    </a:stretch>
+                  </pic:blipFill>
+                  <pic:spPr>
+                    <a:xfrm>
+                      <a:off x="0" y="0"/>
+                      <a:ext cx="3394734" cy="2097227"/>
+                    </a:xfrm>
+                    <a:prstGeom prst="rect">
+                      <a:avLst/>
+                    </a:prstGeom>
+                    <a:ln>
+                      <a:solidFill>
+                        <a:schemeClr val="tx1"/>
+                      </a:solidFill>
+                    </a:ln>
+                  </pic:spPr>
+                </pic:pic>
+              </a:graphicData>
+            </a:graphic>
+          </wp:inline>
+        </w:drawing>
+      </w:r>
+    </w:p>
+    <w:p>
+      <w:r>
+        <w:rPr>
+          <w:noProof/>
+        </w:rPr>
+        <w:drawing>
+          <wp:inline distT="0" distB="0" distL="0" distR="0" wp14:anchorId="3EB05699" wp14:editId="029EB91F">
+            <wp:extent cx="3392890" cy="2150775"/>
+            <wp:effectExtent l="19050" t="19050" r="17145" b="20955"/>
+            <wp:docPr id="29" name="Imagen 29"/>
+            <wp:cNvGraphicFramePr>
+              <a:graphicFrameLocks xmlns:a="http://schemas.openxmlformats.org/drawingml/2006/main" noChangeAspect="1"/>
+            </wp:cNvGraphicFramePr>
+            <a:graphic xmlns:a="http://schemas.openxmlformats.org/drawingml/2006/main">
+              <a:graphicData uri="http://schemas.openxmlformats.org/drawingml/2006/picture">
+                <pic:pic xmlns:pic="http://schemas.openxmlformats.org/drawingml/2006/picture">
+                  <pic:nvPicPr>
+                    <pic:cNvPr id="1" name=""/>
+                    <pic:cNvPicPr/>
+                  </pic:nvPicPr>
+                  <pic:blipFill>
+                    <a:blip r:embed="rId53"/>
+                    <a:stretch>
+                      <a:fillRect/>
+                    </a:stretch>
+                  </pic:blipFill>
+                  <pic:spPr>
+                    <a:xfrm>
+                      <a:off x="0" y="0"/>
+                      <a:ext cx="3403562" cy="2157540"/>
+                    </a:xfrm>
+                    <a:prstGeom prst="rect">
+                      <a:avLst/>
+                    </a:prstGeom>
+                    <a:ln>
+                      <a:solidFill>
+                        <a:schemeClr val="tx1"/>
+                      </a:solidFill>
+                    </a:ln>
+                  </pic:spPr>
+                </pic:pic>
+              </a:graphicData>
+            </a:graphic>
+          </wp:inline>
+        </w:drawing>
+      </w:r>
+    </w:p>
+    <w:p>
+      <w:pPr>
+        <w:jc w:val="left"/>
+      </w:pPr>
+      <w:r>
+        <w:br w:type="page"/>
+      </w:r>
+    </w:p>
+    <w:p>
+      <w:pPr>
+        <w:rPr>
+          <w:b/>
+          <w:bCs/>
+        </w:rPr>
+      </w:pPr>
+      <w:r>
+        <w:lastRenderedPageBreak/>
+        <w:t xml:space="preserve">Editar el </w:t>
+      </w:r>
+      <w:r>
+        <w:rPr>
+          <w:b/>
+          <w:bCs/>
+        </w:rPr>
+        <w:t>application.yaml</w:t>
+      </w:r>
+    </w:p>
+    <w:p>
+      <w:pPr>
+        <w:rPr>
+          <w:b/>
+          <w:bCs/>
+        </w:rPr>
+      </w:pPr>
+      <w:r>
+        <w:rPr>
+          <w:b/>
+          <w:bCs/>
+          <w:noProof/>
+        </w:rPr>
+        <w:drawing>
+          <wp:inline distT="0" distB="0" distL="0" distR="0" wp14:anchorId="75D8D85C" wp14:editId="7EAD2B99">
+            <wp:extent cx="4193661" cy="7813735"/>
+            <wp:effectExtent l="19050" t="19050" r="16510" b="15875"/>
+            <wp:docPr id="32" name="Imagen 32"/>
+            <wp:cNvGraphicFramePr>
+              <a:graphicFrameLocks xmlns:a="http://schemas.openxmlformats.org/drawingml/2006/main" noChangeAspect="1"/>
+            </wp:cNvGraphicFramePr>
+            <a:graphic xmlns:a="http://schemas.openxmlformats.org/drawingml/2006/main">
+              <a:graphicData uri="http://schemas.openxmlformats.org/drawingml/2006/picture">
+                <pic:pic xmlns:pic="http://schemas.openxmlformats.org/drawingml/2006/picture">
+                  <pic:nvPicPr>
+                    <pic:cNvPr id="1" name=""/>
+                    <pic:cNvPicPr/>
+                  </pic:nvPicPr>
+                  <pic:blipFill>
+                    <a:blip r:embed="rId54"/>
+                    <a:stretch>
+                      <a:fillRect/>
+                    </a:stretch>
+                  </pic:blipFill>
+                  <pic:spPr>
+                    <a:xfrm>
+                      <a:off x="0" y="0"/>
+                      <a:ext cx="4195771" cy="7817667"/>
+                    </a:xfrm>
+                    <a:prstGeom prst="rect">
+                      <a:avLst/>
+                    </a:prstGeom>
+                    <a:ln>
+                      <a:solidFill>
+                        <a:schemeClr val="tx1"/>
+                      </a:solidFill>
+                    </a:ln>
+                  </pic:spPr>
+                </pic:pic>
+              </a:graphicData>
+            </a:graphic>
+          </wp:inline>
+        </w:drawing>
+      </w:r>
+    </w:p>
+    <w:p>
+      <w:pPr>
+        <w:jc w:val="left"/>
+      </w:pPr>
+      <w:r>
+        <w:br w:type="page"/>
+      </w:r>
+    </w:p>
+    <w:p>
+      <w:r>
+        <w:lastRenderedPageBreak/>
+        <w:t>Entonces al ejecutar los servicios se verán los siguientes eventos en consola</w:t>
+      </w:r>
+    </w:p>
+    <w:p>
+      <w:r>
+        <w:rPr>
+          <w:noProof/>
+        </w:rPr>
+        <w:drawing>
+          <wp:inline distT="0" distB="0" distL="0" distR="0" wp14:anchorId="7E40DD57" wp14:editId="71DC7A7B">
+            <wp:extent cx="2391109" cy="428685"/>
+            <wp:effectExtent l="19050" t="19050" r="9525" b="28575"/>
+            <wp:docPr id="36" name="Imagen 36"/>
+            <wp:cNvGraphicFramePr>
+              <a:graphicFrameLocks xmlns:a="http://schemas.openxmlformats.org/drawingml/2006/main" noChangeAspect="1"/>
+            </wp:cNvGraphicFramePr>
+            <a:graphic xmlns:a="http://schemas.openxmlformats.org/drawingml/2006/main">
+              <a:graphicData uri="http://schemas.openxmlformats.org/drawingml/2006/picture">
+                <pic:pic xmlns:pic="http://schemas.openxmlformats.org/drawingml/2006/picture">
+                  <pic:nvPicPr>
+                    <pic:cNvPr id="1" name=""/>
+                    <pic:cNvPicPr/>
+                  </pic:nvPicPr>
+                  <pic:blipFill>
+                    <a:blip r:embed="rId55"/>
+                    <a:stretch>
+                      <a:fillRect/>
+                    </a:stretch>
+                  </pic:blipFill>
+                  <pic:spPr>
+                    <a:xfrm>
+                      <a:off x="0" y="0"/>
+                      <a:ext cx="2391109" cy="428685"/>
+                    </a:xfrm>
+                    <a:prstGeom prst="rect">
+                      <a:avLst/>
+                    </a:prstGeom>
+                    <a:ln>
+                      <a:solidFill>
+                        <a:schemeClr val="tx1"/>
+                      </a:solidFill>
+                    </a:ln>
+                  </pic:spPr>
+                </pic:pic>
+              </a:graphicData>
+            </a:graphic>
+          </wp:inline>
+        </w:drawing>
+      </w:r>
+    </w:p>
+    <w:p>
+      <w:r>
+        <w:rPr>
+          <w:noProof/>
+        </w:rPr>
+        <w:drawing>
+          <wp:inline distT="0" distB="0" distL="0" distR="0" wp14:anchorId="7C2DCC35" wp14:editId="20969D1A">
+            <wp:extent cx="5400040" cy="2473960"/>
+            <wp:effectExtent l="19050" t="19050" r="10160" b="21590"/>
+            <wp:docPr id="33" name="Imagen 33"/>
+            <wp:cNvGraphicFramePr>
+              <a:graphicFrameLocks xmlns:a="http://schemas.openxmlformats.org/drawingml/2006/main" noChangeAspect="1"/>
+            </wp:cNvGraphicFramePr>
+            <a:graphic xmlns:a="http://schemas.openxmlformats.org/drawingml/2006/main">
+              <a:graphicData uri="http://schemas.openxmlformats.org/drawingml/2006/picture">
+                <pic:pic xmlns:pic="http://schemas.openxmlformats.org/drawingml/2006/picture">
+                  <pic:nvPicPr>
+                    <pic:cNvPr id="1" name=""/>
+                    <pic:cNvPicPr/>
+                  </pic:nvPicPr>
+                  <pic:blipFill>
+                    <a:blip r:embed="rId56"/>
+                    <a:stretch>
+                      <a:fillRect/>
+                    </a:stretch>
+                  </pic:blipFill>
+                  <pic:spPr>
+                    <a:xfrm>
+                      <a:off x="0" y="0"/>
+                      <a:ext cx="5400040" cy="2473960"/>
+                    </a:xfrm>
+                    <a:prstGeom prst="rect">
+                      <a:avLst/>
+                    </a:prstGeom>
+                    <a:ln>
+                      <a:solidFill>
+                        <a:schemeClr val="tx1"/>
+                      </a:solidFill>
+                    </a:ln>
+                  </pic:spPr>
+                </pic:pic>
+              </a:graphicData>
+            </a:graphic>
+          </wp:inline>
+        </w:drawing>
+      </w:r>
+    </w:p>
+    <w:p>
+      <w:r>
+        <w:rPr>
+          <w:noProof/>
+        </w:rPr>
+        <w:drawing>
+          <wp:inline distT="0" distB="0" distL="0" distR="0" wp14:anchorId="585E54F5" wp14:editId="375489E6">
+            <wp:extent cx="5400040" cy="1217930"/>
+            <wp:effectExtent l="19050" t="19050" r="10160" b="20320"/>
+            <wp:docPr id="35" name="Imagen 35"/>
+            <wp:cNvGraphicFramePr>
+              <a:graphicFrameLocks xmlns:a="http://schemas.openxmlformats.org/drawingml/2006/main" noChangeAspect="1"/>
+            </wp:cNvGraphicFramePr>
+            <a:graphic xmlns:a="http://schemas.openxmlformats.org/drawingml/2006/main">
+              <a:graphicData uri="http://schemas.openxmlformats.org/drawingml/2006/picture">
+                <pic:pic xmlns:pic="http://schemas.openxmlformats.org/drawingml/2006/picture">
+                  <pic:nvPicPr>
+                    <pic:cNvPr id="1" name=""/>
+                    <pic:cNvPicPr/>
+                  </pic:nvPicPr>
+                  <pic:blipFill>
+                    <a:blip r:embed="rId57"/>
+                    <a:stretch>
+                      <a:fillRect/>
+                    </a:stretch>
+                  </pic:blipFill>
+                  <pic:spPr>
+                    <a:xfrm>
+                      <a:off x="0" y="0"/>
+                      <a:ext cx="5400040" cy="1217930"/>
+                    </a:xfrm>
+                    <a:prstGeom prst="rect">
+                      <a:avLst/>
+                    </a:prstGeom>
+                    <a:ln>
+                      <a:solidFill>
+                        <a:schemeClr val="tx1"/>
+                      </a:solidFill>
+                    </a:ln>
+                  </pic:spPr>
+                </pic:pic>
+              </a:graphicData>
+            </a:graphic>
+          </wp:inline>
+        </w:drawing>
+      </w:r>
+    </w:p>
+    <w:p>
+      <w:r>
+        <w:t>Para registrar una venta, deberá mostrarse descontarStock</w:t>
+      </w:r>
+    </w:p>
+    <w:p>
+      <w:r>
+        <w:rPr>
+          <w:noProof/>
+        </w:rPr>
+        <w:drawing>
+          <wp:inline distT="0" distB="0" distL="0" distR="0" wp14:anchorId="11A59F3E" wp14:editId="6A44AC99">
+            <wp:extent cx="5400040" cy="2645410"/>
+            <wp:effectExtent l="19050" t="19050" r="10160" b="21590"/>
+            <wp:docPr id="37" name="Imagen 37"/>
+            <wp:cNvGraphicFramePr>
+              <a:graphicFrameLocks xmlns:a="http://schemas.openxmlformats.org/drawingml/2006/main" noChangeAspect="1"/>
+            </wp:cNvGraphicFramePr>
+            <a:graphic xmlns:a="http://schemas.openxmlformats.org/drawingml/2006/main">
+              <a:graphicData uri="http://schemas.openxmlformats.org/drawingml/2006/picture">
+                <pic:pic xmlns:pic="http://schemas.openxmlformats.org/drawingml/2006/picture">
+                  <pic:nvPicPr>
+                    <pic:cNvPr id="1" name=""/>
+                    <pic:cNvPicPr/>
+                  </pic:nvPicPr>
+                  <pic:blipFill>
+                    <a:blip r:embed="rId58"/>
+                    <a:stretch>
+                      <a:fillRect/>
+                    </a:stretch>
+                  </pic:blipFill>
+                  <pic:spPr>
+                    <a:xfrm>
+                      <a:off x="0" y="0"/>
+                      <a:ext cx="5400040" cy="2645410"/>
+                    </a:xfrm>
+                    <a:prstGeom prst="rect">
+                      <a:avLst/>
+                    </a:prstGeom>
+                    <a:ln>
+                      <a:solidFill>
+                        <a:schemeClr val="tx1"/>
+                      </a:solidFill>
+                    </a:ln>
+                  </pic:spPr>
+                </pic:pic>
+              </a:graphicData>
+            </a:graphic>
+          </wp:inline>
+        </w:drawing>
+      </w:r>
+    </w:p>
+    <w:p>
+      <w:pPr>
+        <w:jc w:val="left"/>
+      </w:pPr>
+      <w:r>
+        <w:br w:type="page"/>
+      </w:r>
+    </w:p>
+    <w:p>
+      <w:r>
+        <w:rPr>
+          <w:noProof/>
+        </w:rPr>
+        <w:lastRenderedPageBreak/>
+        <w:drawing>
+          <wp:inline distT="0" distB="0" distL="0" distR="0" wp14:anchorId="2752B697" wp14:editId="4A657C98">
+            <wp:extent cx="5400040" cy="1850390"/>
+            <wp:effectExtent l="19050" t="19050" r="10160" b="16510"/>
+            <wp:docPr id="38" name="Imagen 38"/>
+            <wp:cNvGraphicFramePr>
+              <a:graphicFrameLocks xmlns:a="http://schemas.openxmlformats.org/drawingml/2006/main" noChangeAspect="1"/>
+            </wp:cNvGraphicFramePr>
+            <a:graphic xmlns:a="http://schemas.openxmlformats.org/drawingml/2006/main">
+              <a:graphicData uri="http://schemas.openxmlformats.org/drawingml/2006/picture">
+                <pic:pic xmlns:pic="http://schemas.openxmlformats.org/drawingml/2006/picture">
+                  <pic:nvPicPr>
+                    <pic:cNvPr id="1" name=""/>
+                    <pic:cNvPicPr/>
+                  </pic:nvPicPr>
+                  <pic:blipFill>
+                    <a:blip r:embed="rId59"/>
+                    <a:stretch>
+                      <a:fillRect/>
+                    </a:stretch>
+                  </pic:blipFill>
+                  <pic:spPr>
+                    <a:xfrm>
+                      <a:off x="0" y="0"/>
+                      <a:ext cx="5400040" cy="1850390"/>
+                    </a:xfrm>
+                    <a:prstGeom prst="rect">
+                      <a:avLst/>
+                    </a:prstGeom>
+                    <a:ln>
+                      <a:solidFill>
+                        <a:schemeClr val="tx1"/>
+                      </a:solidFill>
+                    </a:ln>
+                  </pic:spPr>
+                </pic:pic>
+              </a:graphicData>
+            </a:graphic>
+          </wp:inline>
+        </w:drawing>
+      </w:r>
+    </w:p>
+    <w:p>
+      <w:pPr>
+        <w:rPr>
+          <w:b/>
+          <w:bCs/>
+        </w:rPr>
+      </w:pPr>
+      <w:r>
+        <w:rPr>
+          <w:b/>
+          <w:bCs/>
+        </w:rPr>
+        <w:t>Resumen</w:t>
+      </w:r>
+    </w:p>
+    <w:p>
+      <w:pPr>
+        <w:rPr>
+          <w:b/>
+          <w:bCs/>
+        </w:rPr>
+      </w:pPr>
+      <w:r>
+        <w:rPr>
+          <w:b/>
+          <w:bCs/>
+        </w:rPr>
+        <w:drawing>
+          <wp:inline distT="0" distB="0" distL="0" distR="0" wp14:anchorId="504B9536" wp14:editId="36667277">
+            <wp:extent cx="5400040" cy="2336165"/>
+            <wp:effectExtent l="19050" t="19050" r="10160" b="26035"/>
+            <wp:docPr id="31" name="Imagen 31"/>
+            <wp:cNvGraphicFramePr>
+              <a:graphicFrameLocks xmlns:a="http://schemas.openxmlformats.org/drawingml/2006/main" noChangeAspect="1"/>
+            </wp:cNvGraphicFramePr>
+            <a:graphic xmlns:a="http://schemas.openxmlformats.org/drawingml/2006/main">
+              <a:graphicData uri="http://schemas.openxmlformats.org/drawingml/2006/picture">
+                <pic:pic xmlns:pic="http://schemas.openxmlformats.org/drawingml/2006/picture">
+                  <pic:nvPicPr>
+                    <pic:cNvPr id="0" name="Picture 6"/>
+                    <pic:cNvPicPr>
+                      <a:picLocks noChangeAspect="1" noChangeArrowheads="1"/>
+                    </pic:cNvPicPr>
+                  </pic:nvPicPr>
+                  <pic:blipFill>
+                    <a:blip r:embed="rId60">
+                      <a:extLst>
+                        <a:ext uri="{28A0092B-C50C-407E-A947-70E740481C1C}">
+                          <a14:useLocalDpi xmlns:a14="http://schemas.microsoft.com/office/drawing/2010/main" val="0"/>
+                        </a:ext>
+                      </a:extLst>
+                    </a:blip>
+                    <a:srcRect/>
+                    <a:stretch>
+                      <a:fillRect/>
+                    </a:stretch>
+                  </pic:blipFill>
+                  <pic:spPr bwMode="auto">
+                    <a:xfrm>
+                      <a:off x="0" y="0"/>
+                      <a:ext cx="5400040" cy="2336165"/>
+                    </a:xfrm>
+                    <a:prstGeom prst="rect">
+                      <a:avLst/>
+                    </a:prstGeom>
+                    <a:noFill/>
+                    <a:ln>
+                      <a:solidFill>
+                        <a:schemeClr val="tx1"/>
+                      </a:solidFill>
+                    </a:ln>
+                  </pic:spPr>
+                </pic:pic>
+              </a:graphicData>
+            </a:graphic>
+          </wp:inline>
+        </w:drawing>
+      </w:r>
+    </w:p>
+    <w:p>
+      <w:pPr>
+        <w:rPr>
+          <w:b/>
+          <w:bCs/>
+        </w:rPr>
+      </w:pPr>
+    </w:p>
     <w:sectPr>
       <w:pgSz w:w="11906" w:h="16838"/>
       <w:pgMar w:top="1417" w:right="1701" w:bottom="1417" w:left="1701" w:header="708" w:footer="708" w:gutter="0"/>
@@ -3503,7 +4045,7 @@
 </file>
 
 <file path=word/numbering.xml><?xml version="1.0" encoding="utf-8"?>
-<w:numbering xmlns:wpc="http://schemas.microsoft.com/office/word/2010/wordprocessingCanvas" xmlns:cx="http://schemas.microsoft.com/office/drawing/2014/chartex" xmlns:cx1="http://schemas.microsoft.com/office/drawing/2015/9/8/chartex" xmlns:cx2="http://schemas.microsoft.com/office/drawing/2015/10/21/chartex" xmlns:cx3="http://schemas.microsoft.com/office/drawing/2016/5/9/chartex" xmlns:cx4="http://schemas.microsoft.com/office/drawing/2016/5/10/chartex" xmlns:cx5="http://schemas.microsoft.com/office/drawing/2016/5/11/chartex" xmlns:cx6="http://schemas.microsoft.com/office/drawing/2016/5/12/chartex" xmlns:cx7="http://schemas.microsoft.com/office/drawing/2016/5/13/chartex" xmlns:cx8="http://schemas.microsoft.com/office/drawing/2016/5/14/chartex" xmlns:mc="http://schemas.openxmlformats.org/markup-compatibility/2006" xmlns:aink="http://schemas.microsoft.com/office/drawing/2016/ink" xmlns:am3d="http://schemas.microsoft.com/office/drawing/2017/model3d" xmlns:o="urn:schemas-microsoft-com:office:office" xmlns:oel="http://schemas.microsoft.com/office/2019/extlst" xmlns:r="http://schemas.openxmlformats.org/officeDocument/2006/relationships" xmlns:m="http://schemas.openxmlformats.org/officeDocument/2006/math" xmlns:v="urn:schemas-microsoft-com:vml" xmlns:wp14="http://schemas.microsoft.com/office/word/2010/wordprocessingDrawing" xmlns:wp="http://schemas.openxmlformats.org/drawingml/2006/wordprocessingDrawing" xmlns:w10="urn:schemas-microsoft-com:office:word" xmlns:w="http://schemas.openxmlformats.org/wordprocessingml/2006/main" xmlns:w14="http://schemas.microsoft.com/office/word/2010/wordml" xmlns:w15="http://schemas.microsoft.com/office/word/2012/wordml" xmlns:w16cex="http://schemas.microsoft.com/office/word/2018/wordml/cex" xmlns:w16cid="http://schemas.microsoft.com/office/word/2016/wordml/cid" xmlns:w16="http://schemas.microsoft.com/office/word/2018/wordml" xmlns:w16du="http://schemas.microsoft.com/office/word/2023/wordml/word16du" xmlns:w16sdtdh="http://schemas.microsoft.com/office/word/2020/wordml/sdtdatahash" xmlns:w16sdtfl="http://schemas.microsoft.com/office/word/2024/wordml/sdtformatlock" xmlns:w16se="http://schemas.microsoft.com/office/word/2015/wordml/symex" xmlns:wpg="http://schemas.microsoft.com/office/word/2010/wordprocessingGroup" xmlns:wpi="http://schemas.microsoft.com/office/word/2010/wordprocessingInk" xmlns:wne="http://schemas.microsoft.com/office/word/2006/wordml" xmlns:wps="http://schemas.microsoft.com/office/word/2010/wordprocessingShape" mc:Ignorable="w14 w15 w16se w16cid w16 w16cex w16sdtdh w16sdtfl w16du wp14">
+<w:numbering xmlns:wpc="http://schemas.microsoft.com/office/word/2010/wordprocessingCanvas" xmlns:cx="http://schemas.microsoft.com/office/drawing/2014/chartex" xmlns:cx1="http://schemas.microsoft.com/office/drawing/2015/9/8/chartex" xmlns:cx2="http://schemas.microsoft.com/office/drawing/2015/10/21/chartex" xmlns:cx3="http://schemas.microsoft.com/office/drawing/2016/5/9/chartex" xmlns:cx4="http://schemas.microsoft.com/office/drawing/2016/5/10/chartex" xmlns:cx5="http://schemas.microsoft.com/office/drawing/2016/5/11/chartex" xmlns:cx6="http://schemas.microsoft.com/office/drawing/2016/5/12/chartex" xmlns:cx7="http://schemas.microsoft.com/office/drawing/2016/5/13/chartex" xmlns:cx8="http://schemas.microsoft.com/office/drawing/2016/5/14/chartex" xmlns:mc="http://schemas.openxmlformats.org/markup-compatibility/2006" xmlns:aink="http://schemas.microsoft.com/office/drawing/2016/ink" xmlns:am3d="http://schemas.microsoft.com/office/drawing/2017/model3d" xmlns:o="urn:schemas-microsoft-com:office:office" xmlns:oel="http://schemas.microsoft.com/office/2019/extlst" xmlns:r="http://schemas.openxmlformats.org/officeDocument/2006/relationships" xmlns:m="http://schemas.openxmlformats.org/officeDocument/2006/math" xmlns:v="urn:schemas-microsoft-com:vml" xmlns:wp14="http://schemas.microsoft.com/office/word/2010/wordprocessingDrawing" xmlns:wp="http://schemas.openxmlformats.org/drawingml/2006/wordprocessingDrawing" xmlns:w10="urn:schemas-microsoft-com:office:word" xmlns:w="http://schemas.openxmlformats.org/wordprocessingml/2006/main" xmlns:w14="http://schemas.microsoft.com/office/word/2010/wordml" xmlns:w15="http://schemas.microsoft.com/office/word/2012/wordml" xmlns:w16cex="http://schemas.microsoft.com/office/word/2018/wordml/cex" xmlns:w16cid="http://schemas.microsoft.com/office/word/2016/wordml/cid" xmlns:w16="http://schemas.microsoft.com/office/word/2018/wordml" xmlns:w16sdtdh="http://schemas.microsoft.com/office/word/2020/wordml/sdtdatahash" xmlns:w16se="http://schemas.microsoft.com/office/word/2015/wordml/symex" xmlns:wpg="http://schemas.microsoft.com/office/word/2010/wordprocessingGroup" xmlns:wpi="http://schemas.microsoft.com/office/word/2010/wordprocessingInk" xmlns:wne="http://schemas.microsoft.com/office/word/2006/wordml" xmlns:wps="http://schemas.microsoft.com/office/word/2010/wordprocessingShape" mc:Ignorable="w14 w15 w16se w16cid w16 w16cex w16sdtdh wp14">
   <w:abstractNum w:abstractNumId="0" w15:restartNumberingAfterBreak="0">
     <w:nsid w:val="4FF23CF2"/>
     <w:multiLevelType w:val="hybridMultilevel"/>
@@ -3740,7 +4282,7 @@
 </file>
 
 <file path=word/styles.xml><?xml version="1.0" encoding="utf-8"?>
-<w:styles xmlns:mc="http://schemas.openxmlformats.org/markup-compatibility/2006" xmlns:r="http://schemas.openxmlformats.org/officeDocument/2006/relationships" xmlns:w="http://schemas.openxmlformats.org/wordprocessingml/2006/main" xmlns:w14="http://schemas.microsoft.com/office/word/2010/wordml" xmlns:w15="http://schemas.microsoft.com/office/word/2012/wordml" xmlns:w16cex="http://schemas.microsoft.com/office/word/2018/wordml/cex" xmlns:w16cid="http://schemas.microsoft.com/office/word/2016/wordml/cid" xmlns:w16="http://schemas.microsoft.com/office/word/2018/wordml" xmlns:w16du="http://schemas.microsoft.com/office/word/2023/wordml/word16du" xmlns:w16sdtdh="http://schemas.microsoft.com/office/word/2020/wordml/sdtdatahash" xmlns:w16sdtfl="http://schemas.microsoft.com/office/word/2024/wordml/sdtformatlock" xmlns:w16se="http://schemas.microsoft.com/office/word/2015/wordml/symex" mc:Ignorable="w14 w15 w16se w16cid w16 w16cex w16sdtdh w16sdtfl w16du">
+<w:styles xmlns:mc="http://schemas.openxmlformats.org/markup-compatibility/2006" xmlns:r="http://schemas.openxmlformats.org/officeDocument/2006/relationships" xmlns:w="http://schemas.openxmlformats.org/wordprocessingml/2006/main" xmlns:w14="http://schemas.microsoft.com/office/word/2010/wordml" xmlns:w15="http://schemas.microsoft.com/office/word/2012/wordml" xmlns:w16cex="http://schemas.microsoft.com/office/word/2018/wordml/cex" xmlns:w16cid="http://schemas.microsoft.com/office/word/2016/wordml/cid" xmlns:w16="http://schemas.microsoft.com/office/word/2018/wordml" xmlns:w16sdtdh="http://schemas.microsoft.com/office/word/2020/wordml/sdtdatahash" xmlns:w16se="http://schemas.microsoft.com/office/word/2015/wordml/symex" mc:Ignorable="w14 w15 w16se w16cid w16 w16cex w16sdtdh">
   <w:docDefaults>
     <w:rPrDefault>
       <w:rPr>
@@ -4171,7 +4713,6 @@
     <w:next w:val="Normal"/>
     <w:link w:val="Ttulo2Car"/>
     <w:uiPriority w:val="9"/>
-    <w:semiHidden/>
     <w:unhideWhenUsed/>
     <w:qFormat/>
     <w:rsid w:val="000063A9"/>
@@ -4387,7 +4928,6 @@
     <w:basedOn w:val="Fuentedeprrafopredeter"/>
     <w:link w:val="Ttulo2"/>
     <w:uiPriority w:val="9"/>
-    <w:semiHidden/>
     <w:rsid w:val="000063A9"/>
     <w:rPr>
       <w:rFonts w:asciiTheme="majorHAnsi" w:eastAsiaTheme="majorEastAsia" w:hAnsiTheme="majorHAnsi" w:cstheme="majorBidi"/>

</xml_diff>